<commit_message>
vault backup: 2025-11-19 23:40:24
</commit_message>
<xml_diff>
--- a/Курс 3/Математические основы ИИ/Лабораторные/01. Модели и моделирование/Задание 1.docx
+++ b/Курс 3/Математические основы ИИ/Лабораторные/01. Модели и моделирование/Задание 1.docx
@@ -1,6 +1,6 @@
 
 <file path=word/document.xml><?xml version="1.0" encoding="utf-8"?>
-<w:document xmlns:wpc="http://schemas.microsoft.com/office/word/2010/wordprocessingCanvas" xmlns:cx="http://schemas.microsoft.com/office/drawing/2014/chartex" xmlns:cx1="http://schemas.microsoft.com/office/drawing/2015/9/8/chartex" xmlns:cx2="http://schemas.microsoft.com/office/drawing/2015/10/21/chartex" xmlns:cx3="http://schemas.microsoft.com/office/drawing/2016/5/9/chartex" xmlns:cx4="http://schemas.microsoft.com/office/drawing/2016/5/10/chartex" xmlns:cx5="http://schemas.microsoft.com/office/drawing/2016/5/11/chartex" xmlns:cx6="http://schemas.microsoft.com/office/drawing/2016/5/12/chartex" xmlns:cx7="http://schemas.microsoft.com/office/drawing/2016/5/13/chartex" xmlns:cx8="http://schemas.microsoft.com/office/drawing/2016/5/14/chartex" xmlns:mc="http://schemas.openxmlformats.org/markup-compatibility/2006" xmlns:aink="http://schemas.microsoft.com/office/drawing/2016/ink" xmlns:am3d="http://schemas.microsoft.com/office/drawing/2017/model3d" xmlns:o="urn:schemas-microsoft-com:office:office" xmlns:oel="http://schemas.microsoft.com/office/2019/extlst" xmlns:r="http://schemas.openxmlformats.org/officeDocument/2006/relationships" xmlns:m="http://schemas.openxmlformats.org/officeDocument/2006/math" xmlns:v="urn:schemas-microsoft-com:vml" xmlns:wp14="http://schemas.microsoft.com/office/word/2010/wordprocessingDrawing" xmlns:wp="http://schemas.openxmlformats.org/drawingml/2006/wordprocessingDrawing" xmlns:w10="urn:schemas-microsoft-com:office:word" xmlns:w="http://schemas.openxmlformats.org/wordprocessingml/2006/main" xmlns:w14="http://schemas.microsoft.com/office/word/2010/wordml" xmlns:w15="http://schemas.microsoft.com/office/word/2012/wordml" xmlns:w16cex="http://schemas.microsoft.com/office/word/2018/wordml/cex" xmlns:w16cid="http://schemas.microsoft.com/office/word/2016/wordml/cid" xmlns:w16="http://schemas.microsoft.com/office/word/2018/wordml" xmlns:w16du="http://schemas.microsoft.com/office/word/2023/wordml/word16du" xmlns:w16sdtdh="http://schemas.microsoft.com/office/word/2020/wordml/sdtdatahash" xmlns:w16sdtfl="http://schemas.microsoft.com/office/word/2024/wordml/sdtformatlock" xmlns:w16se="http://schemas.microsoft.com/office/word/2015/wordml/symex" xmlns:wpg="http://schemas.microsoft.com/office/word/2010/wordprocessingGroup" xmlns:wpi="http://schemas.microsoft.com/office/word/2010/wordprocessingInk" xmlns:wne="http://schemas.microsoft.com/office/word/2006/wordml" xmlns:wps="http://schemas.microsoft.com/office/word/2010/wordprocessingShape" mc:Ignorable="w14 w15 w16se w16cid w16 w16cex w16sdtdh w16sdtfl w16du wp14">
+<w:document xmlns:wpc="http://schemas.microsoft.com/office/word/2010/wordprocessingCanvas" xmlns:cx="http://schemas.microsoft.com/office/drawing/2014/chartex" xmlns:mc="http://schemas.openxmlformats.org/markup-compatibility/2006" xmlns:o="urn:schemas-microsoft-com:office:office" xmlns:r="http://schemas.openxmlformats.org/officeDocument/2006/relationships" xmlns:m="http://schemas.openxmlformats.org/officeDocument/2006/math" xmlns:v="urn:schemas-microsoft-com:vml" xmlns:wp14="http://schemas.microsoft.com/office/word/2010/wordprocessingDrawing" xmlns:wp="http://schemas.openxmlformats.org/drawingml/2006/wordprocessingDrawing" xmlns:w10="urn:schemas-microsoft-com:office:word" xmlns:w="http://schemas.openxmlformats.org/wordprocessingml/2006/main" xmlns:w14="http://schemas.microsoft.com/office/word/2010/wordml" xmlns:w15="http://schemas.microsoft.com/office/word/2012/wordml" xmlns:w16se="http://schemas.microsoft.com/office/word/2015/wordml/symex" xmlns:wpg="http://schemas.microsoft.com/office/word/2010/wordprocessingGroup" xmlns:wpi="http://schemas.microsoft.com/office/word/2010/wordprocessingInk" xmlns:wne="http://schemas.microsoft.com/office/word/2006/wordml" xmlns:wps="http://schemas.microsoft.com/office/word/2010/wordprocessingShape" mc:Ignorable="w14 w15 w16se wp14">
   <w:body>
     <w:p>
       <w:pPr>
@@ -338,6 +338,1263 @@
       </w:pPr>
       <w:r>
         <w:rPr>
+          <w:b/>
+          <w:bCs/>
+          <w:szCs w:val="28"/>
+        </w:rPr>
+        <w:t>Содержательная модель</w:t>
+      </w:r>
+      <w:r>
+        <w:rPr>
+          <w:szCs w:val="28"/>
+        </w:rPr>
+        <w:t xml:space="preserve"> </w:t>
+      </w:r>
+      <w:r>
+        <w:rPr>
+          <w:szCs w:val="28"/>
+        </w:rPr>
+        <w:t>представляет</w:t>
+      </w:r>
+      <w:r>
+        <w:rPr>
+          <w:szCs w:val="28"/>
+        </w:rPr>
+        <w:t xml:space="preserve"> факторы, влияющие </w:t>
+      </w:r>
+      <w:r>
+        <w:rPr>
+          <w:szCs w:val="28"/>
+        </w:rPr>
+        <w:t>стресс подростков в виде формальной модели</w:t>
+      </w:r>
+      <w:r>
+        <w:rPr>
+          <w:szCs w:val="28"/>
+        </w:rPr>
+        <w:t xml:space="preserve">. Эта модель учитывает влияние конкретных параметров </w:t>
+      </w:r>
+      <w:r>
+        <w:rPr>
+          <w:szCs w:val="28"/>
+        </w:rPr>
+        <w:t>–</w:t>
+      </w:r>
+      <w:r>
+        <w:rPr>
+          <w:szCs w:val="28"/>
+        </w:rPr>
+        <w:t xml:space="preserve"> учебных, социальных, семейных факторов </w:t>
+      </w:r>
+      <w:r>
+        <w:rPr>
+          <w:szCs w:val="28"/>
+        </w:rPr>
+        <w:t>–</w:t>
+      </w:r>
+      <w:r>
+        <w:rPr>
+          <w:szCs w:val="28"/>
+        </w:rPr>
+        <w:t xml:space="preserve"> и связывает их с </w:t>
+      </w:r>
+      <w:r>
+        <w:rPr>
+          <w:szCs w:val="28"/>
+        </w:rPr>
+        <w:t>уровнем стресса</w:t>
+      </w:r>
+      <w:r>
+        <w:rPr>
+          <w:szCs w:val="28"/>
+        </w:rPr>
+        <w:t xml:space="preserve">. </w:t>
+      </w:r>
+      <w:r>
+        <w:rPr>
+          <w:szCs w:val="28"/>
+        </w:rPr>
+        <w:t xml:space="preserve">Для содержательного моделирования структура и влияние каждого фактора </w:t>
+      </w:r>
+      <w:r>
+        <w:rPr>
+          <w:szCs w:val="28"/>
+        </w:rPr>
+        <w:t>рассматриваются</w:t>
+      </w:r>
+      <w:r>
+        <w:rPr>
+          <w:szCs w:val="28"/>
+        </w:rPr>
+        <w:t xml:space="preserve"> в деталях, а каждый параметр будет иметь конкретное определение</w:t>
+      </w:r>
+      <w:r>
+        <w:rPr>
+          <w:szCs w:val="28"/>
+        </w:rPr>
+        <w:t>:</w:t>
+      </w:r>
+    </w:p>
+    <w:p>
+      <w:pPr>
+        <w:pStyle w:val="a3"/>
+        <w:numPr>
+          <w:ilvl w:val="0"/>
+          <w:numId w:val="15"/>
+        </w:numPr>
+        <w:spacing w:after="0"/>
+        <w:rPr>
+          <w:szCs w:val="28"/>
+        </w:rPr>
+      </w:pPr>
+      <w:r>
+        <w:rPr>
+          <w:szCs w:val="28"/>
+        </w:rPr>
+        <w:t>Учебные достижения:</w:t>
+      </w:r>
+    </w:p>
+    <w:p>
+      <w:pPr>
+        <w:pStyle w:val="a3"/>
+        <w:numPr>
+          <w:ilvl w:val="1"/>
+          <w:numId w:val="16"/>
+        </w:numPr>
+        <w:spacing w:after="0"/>
+        <w:rPr>
+          <w:szCs w:val="28"/>
+        </w:rPr>
+      </w:pPr>
+      <w:r>
+        <w:rPr>
+          <w:szCs w:val="28"/>
+        </w:rPr>
+        <w:t>Параметр: Средний балл оценок или другой показатель успеваемости.</w:t>
+      </w:r>
+    </w:p>
+    <w:p>
+      <w:pPr>
+        <w:pStyle w:val="a3"/>
+        <w:numPr>
+          <w:ilvl w:val="1"/>
+          <w:numId w:val="16"/>
+        </w:numPr>
+        <w:spacing w:after="0"/>
+        <w:rPr>
+          <w:szCs w:val="28"/>
+        </w:rPr>
+      </w:pPr>
+      <w:r>
+        <w:rPr>
+          <w:szCs w:val="28"/>
+        </w:rPr>
+        <w:t xml:space="preserve">Вес в модели: </w:t>
+      </w:r>
+      <w:r>
+        <w:rPr>
+          <w:szCs w:val="28"/>
+        </w:rPr>
+        <w:t>в</w:t>
+      </w:r>
+      <w:r>
+        <w:rPr>
+          <w:szCs w:val="28"/>
+        </w:rPr>
+        <w:t xml:space="preserve">ысокий, так как успеваемость – один из главных </w:t>
+      </w:r>
+      <w:r>
+        <w:rPr>
+          <w:szCs w:val="28"/>
+        </w:rPr>
+        <w:t>факторов</w:t>
+      </w:r>
+      <w:r>
+        <w:rPr>
+          <w:szCs w:val="28"/>
+        </w:rPr>
+        <w:t xml:space="preserve"> дальнейшего успеха</w:t>
+      </w:r>
+      <w:r>
+        <w:rPr>
+          <w:szCs w:val="28"/>
+        </w:rPr>
+        <w:t xml:space="preserve"> если подросток планирует успешно завершить обучение в выпускном кла</w:t>
+      </w:r>
+      <w:r>
+        <w:rPr>
+          <w:szCs w:val="28"/>
+        </w:rPr>
+        <w:t>ссе</w:t>
+      </w:r>
+      <w:r>
+        <w:rPr>
+          <w:szCs w:val="28"/>
+        </w:rPr>
+        <w:t>.</w:t>
+      </w:r>
+    </w:p>
+    <w:p>
+      <w:pPr>
+        <w:pStyle w:val="a3"/>
+        <w:numPr>
+          <w:ilvl w:val="1"/>
+          <w:numId w:val="16"/>
+        </w:numPr>
+        <w:spacing w:after="0"/>
+        <w:rPr>
+          <w:szCs w:val="28"/>
+        </w:rPr>
+      </w:pPr>
+      <w:r>
+        <w:rPr>
+          <w:szCs w:val="28"/>
+        </w:rPr>
+        <w:t xml:space="preserve">Влияние: </w:t>
+      </w:r>
+      <w:r>
+        <w:rPr>
+          <w:szCs w:val="28"/>
+        </w:rPr>
+        <w:t xml:space="preserve">Высокий уровень успеваемости снижает уровень стресса, придавая уверенности в себе и повышая самооценку, низкий же </w:t>
+      </w:r>
+      <w:r>
+        <w:rPr>
+          <w:szCs w:val="28"/>
+        </w:rPr>
+        <w:t xml:space="preserve">имеет </w:t>
+      </w:r>
+      <w:r>
+        <w:rPr>
+          <w:szCs w:val="28"/>
+        </w:rPr>
+        <w:t>влия</w:t>
+      </w:r>
+      <w:r>
+        <w:rPr>
+          <w:szCs w:val="28"/>
+        </w:rPr>
+        <w:t>ние</w:t>
+      </w:r>
+      <w:r>
+        <w:rPr>
+          <w:szCs w:val="28"/>
+        </w:rPr>
+        <w:t xml:space="preserve"> в обратную сторону</w:t>
+      </w:r>
+      <w:r>
+        <w:rPr>
+          <w:szCs w:val="28"/>
+        </w:rPr>
+        <w:t>.</w:t>
+      </w:r>
+    </w:p>
+    <w:p>
+      <w:pPr>
+        <w:pStyle w:val="a3"/>
+        <w:numPr>
+          <w:ilvl w:val="0"/>
+          <w:numId w:val="15"/>
+        </w:numPr>
+        <w:spacing w:after="0"/>
+        <w:rPr>
+          <w:szCs w:val="28"/>
+        </w:rPr>
+      </w:pPr>
+      <w:r>
+        <w:rPr>
+          <w:szCs w:val="28"/>
+        </w:rPr>
+        <w:t>Социальная активность:</w:t>
+      </w:r>
+    </w:p>
+    <w:p>
+      <w:pPr>
+        <w:pStyle w:val="a3"/>
+        <w:numPr>
+          <w:ilvl w:val="1"/>
+          <w:numId w:val="17"/>
+        </w:numPr>
+        <w:spacing w:after="0"/>
+        <w:rPr>
+          <w:szCs w:val="28"/>
+        </w:rPr>
+      </w:pPr>
+      <w:r>
+        <w:rPr>
+          <w:szCs w:val="28"/>
+        </w:rPr>
+        <w:t xml:space="preserve">Параметр: </w:t>
+      </w:r>
+      <w:r>
+        <w:rPr>
+          <w:szCs w:val="28"/>
+        </w:rPr>
+        <w:t>у</w:t>
+      </w:r>
+      <w:r>
+        <w:rPr>
+          <w:szCs w:val="28"/>
+        </w:rPr>
+        <w:t>частие в школьных мероприятиях.</w:t>
+      </w:r>
+    </w:p>
+    <w:p>
+      <w:pPr>
+        <w:pStyle w:val="a3"/>
+        <w:numPr>
+          <w:ilvl w:val="1"/>
+          <w:numId w:val="17"/>
+        </w:numPr>
+        <w:spacing w:after="0"/>
+        <w:rPr>
+          <w:szCs w:val="28"/>
+        </w:rPr>
+      </w:pPr>
+      <w:r>
+        <w:rPr>
+          <w:szCs w:val="28"/>
+        </w:rPr>
+        <w:t xml:space="preserve">Вес в модели: </w:t>
+      </w:r>
+      <w:r>
+        <w:rPr>
+          <w:szCs w:val="28"/>
+        </w:rPr>
+        <w:t xml:space="preserve">высокий – социальная </w:t>
+      </w:r>
+      <w:r>
+        <w:rPr>
+          <w:szCs w:val="28"/>
+        </w:rPr>
+        <w:t>активность способствует адаптации</w:t>
+      </w:r>
+      <w:r>
+        <w:rPr>
+          <w:szCs w:val="28"/>
+        </w:rPr>
+        <w:t xml:space="preserve"> и отвлечению от стрессовых ситуаций</w:t>
+      </w:r>
+      <w:r>
+        <w:rPr>
+          <w:szCs w:val="28"/>
+        </w:rPr>
+        <w:t>.</w:t>
+      </w:r>
+    </w:p>
+    <w:p>
+      <w:pPr>
+        <w:pStyle w:val="a3"/>
+        <w:numPr>
+          <w:ilvl w:val="1"/>
+          <w:numId w:val="17"/>
+        </w:numPr>
+        <w:spacing w:after="0"/>
+        <w:rPr>
+          <w:szCs w:val="28"/>
+        </w:rPr>
+      </w:pPr>
+      <w:r>
+        <w:rPr>
+          <w:szCs w:val="28"/>
+        </w:rPr>
+        <w:t xml:space="preserve">Влияние: </w:t>
+      </w:r>
+      <w:r>
+        <w:rPr>
+          <w:szCs w:val="28"/>
+        </w:rPr>
+        <w:t>у</w:t>
+      </w:r>
+      <w:r>
+        <w:rPr>
+          <w:szCs w:val="28"/>
+        </w:rPr>
+        <w:t>частие в общественной жизни повышает навыки общения и снижает уровень стресса.</w:t>
+      </w:r>
+    </w:p>
+    <w:p>
+      <w:pPr>
+        <w:pStyle w:val="a3"/>
+        <w:numPr>
+          <w:ilvl w:val="0"/>
+          <w:numId w:val="15"/>
+        </w:numPr>
+        <w:spacing w:after="0"/>
+        <w:rPr>
+          <w:szCs w:val="28"/>
+        </w:rPr>
+      </w:pPr>
+      <w:r>
+        <w:rPr>
+          <w:szCs w:val="28"/>
+        </w:rPr>
+        <w:t>Дополнительные учебные занятия</w:t>
+      </w:r>
+    </w:p>
+    <w:p>
+      <w:pPr>
+        <w:pStyle w:val="a3"/>
+        <w:numPr>
+          <w:ilvl w:val="1"/>
+          <w:numId w:val="18"/>
+        </w:numPr>
+        <w:spacing w:after="0"/>
+        <w:rPr>
+          <w:szCs w:val="28"/>
+        </w:rPr>
+      </w:pPr>
+      <w:r>
+        <w:rPr>
+          <w:szCs w:val="28"/>
+        </w:rPr>
+        <w:t>Параметр: количество и интенсивность дополнительных занятий (кружков, секций, курсов и т. д.)</w:t>
+      </w:r>
+    </w:p>
+    <w:p>
+      <w:pPr>
+        <w:pStyle w:val="a3"/>
+        <w:numPr>
+          <w:ilvl w:val="1"/>
+          <w:numId w:val="18"/>
+        </w:numPr>
+        <w:spacing w:after="0"/>
+        <w:rPr>
+          <w:szCs w:val="28"/>
+        </w:rPr>
+      </w:pPr>
+      <w:r>
+        <w:rPr>
+          <w:szCs w:val="28"/>
+        </w:rPr>
+        <w:t>Вес в модели: средний</w:t>
+      </w:r>
+      <w:r>
+        <w:rPr>
+          <w:szCs w:val="28"/>
+        </w:rPr>
+        <w:t xml:space="preserve"> – дополнительные</w:t>
+      </w:r>
+      <w:r>
+        <w:rPr>
+          <w:szCs w:val="28"/>
+        </w:rPr>
+        <w:t xml:space="preserve"> занятия</w:t>
+      </w:r>
+      <w:r>
+        <w:rPr>
+          <w:szCs w:val="28"/>
+        </w:rPr>
+        <w:t xml:space="preserve"> могут помочь подростку подкрепить свои успехи в основной учёбе</w:t>
+      </w:r>
+      <w:r>
+        <w:rPr>
+          <w:szCs w:val="28"/>
+        </w:rPr>
+        <w:t>,</w:t>
+      </w:r>
+      <w:r>
+        <w:rPr>
+          <w:szCs w:val="28"/>
+        </w:rPr>
+        <w:t xml:space="preserve"> </w:t>
+      </w:r>
+      <w:r>
+        <w:rPr>
+          <w:szCs w:val="28"/>
+        </w:rPr>
+        <w:t>а также может повысить самооценку и задать вектор увлечений подростка</w:t>
+      </w:r>
+      <w:r>
+        <w:rPr>
+          <w:szCs w:val="28"/>
+        </w:rPr>
+        <w:t xml:space="preserve">, однако </w:t>
+      </w:r>
+      <w:r>
+        <w:rPr>
+          <w:szCs w:val="28"/>
+        </w:rPr>
+        <w:lastRenderedPageBreak/>
+        <w:t>дополнительные занятия могут создавать большую учебную нагрузк</w:t>
+      </w:r>
+      <w:r>
+        <w:rPr>
+          <w:szCs w:val="28"/>
+        </w:rPr>
+        <w:t>у</w:t>
+      </w:r>
+      <w:r>
+        <w:rPr>
+          <w:szCs w:val="28"/>
+        </w:rPr>
+        <w:t>.</w:t>
+      </w:r>
+    </w:p>
+    <w:p>
+      <w:pPr>
+        <w:pStyle w:val="a3"/>
+        <w:numPr>
+          <w:ilvl w:val="1"/>
+          <w:numId w:val="18"/>
+        </w:numPr>
+        <w:spacing w:after="0"/>
+        <w:rPr>
+          <w:szCs w:val="28"/>
+        </w:rPr>
+      </w:pPr>
+      <w:r>
+        <w:rPr>
+          <w:szCs w:val="28"/>
+        </w:rPr>
+        <w:t>Влияние: подростки, посещающие дополнительные занятия</w:t>
+      </w:r>
+      <w:r>
+        <w:rPr>
+          <w:szCs w:val="28"/>
+        </w:rPr>
+        <w:t xml:space="preserve"> часто более уверены в себе</w:t>
+      </w:r>
+      <w:r>
+        <w:rPr>
+          <w:szCs w:val="28"/>
+        </w:rPr>
+        <w:t xml:space="preserve"> и имеют планы на будущее</w:t>
+      </w:r>
+      <w:r>
+        <w:rPr>
+          <w:szCs w:val="28"/>
+        </w:rPr>
+        <w:t xml:space="preserve">, однако также могут быть и более </w:t>
+      </w:r>
+      <w:r>
+        <w:rPr>
+          <w:szCs w:val="28"/>
+        </w:rPr>
+        <w:t>загруженными</w:t>
+      </w:r>
+      <w:r>
+        <w:rPr>
+          <w:szCs w:val="28"/>
+        </w:rPr>
+        <w:t xml:space="preserve"> в отличие от других сверстников.</w:t>
+      </w:r>
+    </w:p>
+    <w:p>
+      <w:pPr>
+        <w:pStyle w:val="a3"/>
+        <w:numPr>
+          <w:ilvl w:val="0"/>
+          <w:numId w:val="15"/>
+        </w:numPr>
+        <w:spacing w:after="0"/>
+        <w:rPr>
+          <w:szCs w:val="28"/>
+        </w:rPr>
+      </w:pPr>
+      <w:r>
+        <w:rPr>
+          <w:szCs w:val="28"/>
+        </w:rPr>
+        <w:t>Наличие друзей и межличностные отношения</w:t>
+      </w:r>
+    </w:p>
+    <w:p>
+      <w:pPr>
+        <w:pStyle w:val="a3"/>
+        <w:numPr>
+          <w:ilvl w:val="1"/>
+          <w:numId w:val="19"/>
+        </w:numPr>
+        <w:spacing w:after="0"/>
+        <w:rPr>
+          <w:szCs w:val="28"/>
+        </w:rPr>
+      </w:pPr>
+      <w:r>
+        <w:rPr>
+          <w:szCs w:val="28"/>
+        </w:rPr>
+        <w:t>Количество близких друзей в школе и качество межличностных отношений</w:t>
+      </w:r>
+    </w:p>
+    <w:p>
+      <w:pPr>
+        <w:pStyle w:val="a3"/>
+        <w:numPr>
+          <w:ilvl w:val="1"/>
+          <w:numId w:val="19"/>
+        </w:numPr>
+        <w:spacing w:after="0"/>
+        <w:rPr>
+          <w:szCs w:val="28"/>
+        </w:rPr>
+      </w:pPr>
+      <w:r>
+        <w:rPr>
+          <w:szCs w:val="28"/>
+        </w:rPr>
+        <w:t xml:space="preserve">Вес в модели: </w:t>
+      </w:r>
+      <w:r>
+        <w:rPr>
+          <w:szCs w:val="28"/>
+        </w:rPr>
+        <w:t>высокий</w:t>
+      </w:r>
+      <w:r>
+        <w:rPr>
+          <w:szCs w:val="28"/>
+        </w:rPr>
+        <w:t>, так как поддержка друзей и хорошие отношения способствуют психологическому комфорту. Но этот фактор может нанести и вред, если подросток свяжется с «плохой» компание</w:t>
+      </w:r>
+      <w:r>
+        <w:rPr>
+          <w:szCs w:val="28"/>
+        </w:rPr>
+        <w:t>й, которая будет дестабилизировать его психологическое состояние .</w:t>
+      </w:r>
+    </w:p>
+    <w:p>
+      <w:pPr>
+        <w:pStyle w:val="a3"/>
+        <w:numPr>
+          <w:ilvl w:val="1"/>
+          <w:numId w:val="19"/>
+        </w:numPr>
+        <w:spacing w:after="0"/>
+        <w:rPr>
+          <w:szCs w:val="28"/>
+        </w:rPr>
+      </w:pPr>
+      <w:r>
+        <w:rPr>
+          <w:szCs w:val="28"/>
+        </w:rPr>
+        <w:t xml:space="preserve">Влияние: наличие </w:t>
+      </w:r>
+      <w:r>
+        <w:rPr>
+          <w:szCs w:val="28"/>
+        </w:rPr>
+        <w:t xml:space="preserve">хороших </w:t>
+      </w:r>
+      <w:r>
+        <w:rPr>
+          <w:szCs w:val="28"/>
+        </w:rPr>
+        <w:t xml:space="preserve">друзей </w:t>
+      </w:r>
+      <w:r>
+        <w:rPr>
+          <w:szCs w:val="28"/>
+        </w:rPr>
+        <w:t xml:space="preserve">эффективно </w:t>
+      </w:r>
+      <w:r>
+        <w:rPr>
+          <w:szCs w:val="28"/>
+        </w:rPr>
+        <w:t>помогает справляться со стрессовыми ситуациями</w:t>
+      </w:r>
+      <w:r>
+        <w:rPr>
+          <w:szCs w:val="28"/>
+        </w:rPr>
+        <w:t>.</w:t>
+      </w:r>
+    </w:p>
+    <w:p>
+      <w:pPr>
+        <w:pStyle w:val="a3"/>
+        <w:numPr>
+          <w:ilvl w:val="0"/>
+          <w:numId w:val="15"/>
+        </w:numPr>
+        <w:spacing w:after="0"/>
+        <w:rPr>
+          <w:szCs w:val="28"/>
+        </w:rPr>
+      </w:pPr>
+      <w:r>
+        <w:rPr>
+          <w:szCs w:val="28"/>
+        </w:rPr>
+        <w:t>Семейная поддержка</w:t>
+      </w:r>
+    </w:p>
+    <w:p>
+      <w:pPr>
+        <w:pStyle w:val="a3"/>
+        <w:numPr>
+          <w:ilvl w:val="1"/>
+          <w:numId w:val="20"/>
+        </w:numPr>
+        <w:spacing w:after="0"/>
+        <w:rPr>
+          <w:szCs w:val="28"/>
+        </w:rPr>
+      </w:pPr>
+      <w:r>
+        <w:rPr>
+          <w:szCs w:val="28"/>
+        </w:rPr>
+        <w:t>Параметр: наличие обоих родителей, уровень их образования, характер занятости</w:t>
+      </w:r>
+    </w:p>
+    <w:p>
+      <w:pPr>
+        <w:pStyle w:val="a3"/>
+        <w:numPr>
+          <w:ilvl w:val="1"/>
+          <w:numId w:val="20"/>
+        </w:numPr>
+        <w:spacing w:after="0"/>
+        <w:rPr>
+          <w:szCs w:val="28"/>
+        </w:rPr>
+      </w:pPr>
+      <w:r>
+        <w:rPr>
+          <w:szCs w:val="28"/>
+        </w:rPr>
+        <w:t xml:space="preserve">Вес в модели: высокий, так как поддержка семьи </w:t>
+      </w:r>
+      <w:r>
+        <w:rPr>
+          <w:szCs w:val="28"/>
+        </w:rPr>
+        <w:t>в стрессовых ситуациях даёт наиболее прочную опору для подростка, чем какой-либо другой фактор. При отсутствии поддержки стрессовая ситуация может казаться подростку ещё более сложной к разрешению.</w:t>
+      </w:r>
+    </w:p>
+    <w:p>
+      <w:pPr>
+        <w:pStyle w:val="a3"/>
+        <w:numPr>
+          <w:ilvl w:val="1"/>
+          <w:numId w:val="20"/>
+        </w:numPr>
+        <w:spacing w:after="0"/>
+        <w:rPr>
+          <w:szCs w:val="28"/>
+        </w:rPr>
+      </w:pPr>
+      <w:r>
+        <w:rPr>
+          <w:szCs w:val="28"/>
+        </w:rPr>
+        <w:t xml:space="preserve">Влияние: </w:t>
+      </w:r>
+      <w:r>
+        <w:rPr>
+          <w:szCs w:val="28"/>
+        </w:rPr>
+        <w:t xml:space="preserve">поддержка семьи предоставляет прочнейшую опору подростку при </w:t>
+      </w:r>
+      <w:r>
+        <w:rPr>
+          <w:szCs w:val="28"/>
+        </w:rPr>
+        <w:t>нахождении в</w:t>
+      </w:r>
+      <w:r>
+        <w:rPr>
+          <w:szCs w:val="28"/>
+        </w:rPr>
+        <w:t xml:space="preserve"> </w:t>
+      </w:r>
+      <w:r>
+        <w:rPr>
+          <w:szCs w:val="28"/>
+        </w:rPr>
+        <w:t>стрессовых ситуациях.</w:t>
+      </w:r>
+    </w:p>
+    <w:p>
+      <w:pPr>
+        <w:pStyle w:val="a3"/>
+        <w:numPr>
+          <w:ilvl w:val="0"/>
+          <w:numId w:val="15"/>
+        </w:numPr>
+        <w:spacing w:after="0"/>
+        <w:rPr>
+          <w:szCs w:val="28"/>
+        </w:rPr>
+      </w:pPr>
+      <w:r>
+        <w:rPr>
+          <w:szCs w:val="28"/>
+        </w:rPr>
+        <w:t>Планы на будущее</w:t>
+      </w:r>
+    </w:p>
+    <w:p>
+      <w:pPr>
+        <w:pStyle w:val="a3"/>
+        <w:numPr>
+          <w:ilvl w:val="1"/>
+          <w:numId w:val="21"/>
+        </w:numPr>
+        <w:spacing w:after="0"/>
+        <w:rPr>
+          <w:szCs w:val="28"/>
+        </w:rPr>
+      </w:pPr>
+      <w:r>
+        <w:rPr>
+          <w:szCs w:val="28"/>
+        </w:rPr>
+        <w:t>Параметр: наличие четкого плана на будущее (выбор профессии и учебного заведения)</w:t>
+      </w:r>
+    </w:p>
+    <w:p>
+      <w:pPr>
+        <w:pStyle w:val="a3"/>
+        <w:numPr>
+          <w:ilvl w:val="1"/>
+          <w:numId w:val="21"/>
+        </w:numPr>
+        <w:spacing w:after="0"/>
+        <w:rPr>
+          <w:szCs w:val="28"/>
+        </w:rPr>
+      </w:pPr>
+      <w:r>
+        <w:rPr>
+          <w:szCs w:val="28"/>
+        </w:rPr>
+        <w:t>Вес в модели: высокий, так как наличие целей положительно влияет на мотивацию</w:t>
+      </w:r>
+      <w:r>
+        <w:rPr>
+          <w:szCs w:val="28"/>
+        </w:rPr>
+        <w:t xml:space="preserve">, а также устраняет неопределённости, которые бы </w:t>
+      </w:r>
+      <w:r>
+        <w:rPr>
+          <w:szCs w:val="28"/>
+        </w:rPr>
+        <w:lastRenderedPageBreak/>
+        <w:t>могли вызвать стресс. Однако несоответствие этих планов с действительностью может сильно ударить по психике.</w:t>
+      </w:r>
+    </w:p>
+    <w:p>
+      <w:pPr>
+        <w:pStyle w:val="a3"/>
+        <w:numPr>
+          <w:ilvl w:val="1"/>
+          <w:numId w:val="21"/>
+        </w:numPr>
+        <w:spacing w:after="0"/>
+        <w:rPr>
+          <w:szCs w:val="28"/>
+        </w:rPr>
+      </w:pPr>
+      <w:r>
+        <w:rPr>
+          <w:szCs w:val="28"/>
+        </w:rPr>
+        <w:t xml:space="preserve">Влияние: </w:t>
+      </w:r>
+      <w:r>
+        <w:rPr>
+          <w:szCs w:val="28"/>
+        </w:rPr>
+        <w:t>наличие реалистичных планов на будущее устраняет неопределённости и придаёт уверенности.</w:t>
+      </w:r>
+    </w:p>
+    <w:p>
+      <w:pPr>
+        <w:rPr>
+          <w:szCs w:val="28"/>
+        </w:rPr>
+      </w:pPr>
+      <w:r>
+        <w:rPr>
+          <w:szCs w:val="28"/>
+        </w:rPr>
+        <w:t>Сложность модели связана с необходимостью интерпретировать качественные и количественные данные, а также с необходимостью учета множества весов и вероятностей.</w:t>
+      </w:r>
+    </w:p>
+    <w:p>
+      <w:pPr>
+        <w:rPr>
+          <w:szCs w:val="28"/>
+        </w:rPr>
+      </w:pPr>
+      <w:r>
+        <w:rPr>
+          <w:szCs w:val="28"/>
+        </w:rPr>
+        <w:t>Операторы модели:</w:t>
+      </w:r>
+    </w:p>
+    <w:p>
+      <w:pPr>
+        <w:pStyle w:val="a3"/>
+        <w:numPr>
+          <w:ilvl w:val="0"/>
+          <w:numId w:val="22"/>
+        </w:numPr>
+        <w:spacing w:after="0"/>
+        <w:rPr>
+          <w:szCs w:val="28"/>
+        </w:rPr>
+      </w:pPr>
+      <w:r>
+        <w:rPr>
+          <w:szCs w:val="28"/>
+        </w:rPr>
+        <w:t>Содержательная модель использует взвешенные коэффициенты, которые придаются каждому параметру в зависимости от его значимости.</w:t>
+      </w:r>
+    </w:p>
+    <w:p>
+      <w:pPr>
+        <w:pStyle w:val="a3"/>
+        <w:numPr>
+          <w:ilvl w:val="0"/>
+          <w:numId w:val="22"/>
+        </w:numPr>
+        <w:spacing w:after="0"/>
+        <w:rPr>
+          <w:szCs w:val="28"/>
+        </w:rPr>
+      </w:pPr>
+      <w:r>
+        <w:rPr>
+          <w:szCs w:val="28"/>
+        </w:rPr>
+        <w:t xml:space="preserve">Для оценки </w:t>
+      </w:r>
+      <w:r>
+        <w:rPr>
+          <w:szCs w:val="28"/>
+        </w:rPr>
+        <w:t>психологического давления</w:t>
+      </w:r>
+      <w:r>
+        <w:rPr>
+          <w:szCs w:val="28"/>
+        </w:rPr>
+        <w:t xml:space="preserve"> применяются логические операторы, позволяющие учитывать сочетание факторов (например, </w:t>
+      </w:r>
+      <w:r>
+        <w:rPr>
+          <w:szCs w:val="28"/>
+        </w:rPr>
+        <w:t>«</w:t>
+      </w:r>
+      <w:r>
+        <w:rPr>
+          <w:szCs w:val="28"/>
+        </w:rPr>
+        <w:t>хорошая успеваемость</w:t>
+      </w:r>
+      <w:r>
+        <w:rPr>
+          <w:szCs w:val="28"/>
+        </w:rPr>
+        <w:t>»</w:t>
+      </w:r>
+      <w:r>
+        <w:rPr>
+          <w:szCs w:val="28"/>
+        </w:rPr>
+        <w:t xml:space="preserve"> </w:t>
+      </w:r>
+      <w:r>
+        <w:rPr>
+          <w:szCs w:val="28"/>
+        </w:rPr>
+        <w:t>И</w:t>
+      </w:r>
+      <w:r>
+        <w:rPr>
+          <w:szCs w:val="28"/>
+        </w:rPr>
+        <w:t xml:space="preserve"> </w:t>
+      </w:r>
+      <w:r>
+        <w:rPr>
+          <w:szCs w:val="28"/>
+        </w:rPr>
+        <w:t>«</w:t>
+      </w:r>
+      <w:r>
+        <w:rPr>
+          <w:szCs w:val="28"/>
+        </w:rPr>
+        <w:t>поддержка друзей</w:t>
+      </w:r>
+      <w:r>
+        <w:rPr>
+          <w:szCs w:val="28"/>
+        </w:rPr>
+        <w:t>»</w:t>
+      </w:r>
+      <w:r>
+        <w:rPr>
+          <w:szCs w:val="28"/>
+        </w:rPr>
+        <w:t>).</w:t>
+      </w:r>
+    </w:p>
+    <w:p>
+      <w:pPr>
+        <w:rPr>
+          <w:szCs w:val="28"/>
+        </w:rPr>
+      </w:pPr>
+      <w:r>
+        <w:rPr>
+          <w:szCs w:val="28"/>
+        </w:rPr>
+        <w:t>Типы входных данных:</w:t>
+      </w:r>
+    </w:p>
+    <w:p>
+      <w:pPr>
+        <w:pStyle w:val="a3"/>
+        <w:numPr>
+          <w:ilvl w:val="0"/>
+          <w:numId w:val="23"/>
+        </w:numPr>
+        <w:spacing w:after="0"/>
+        <w:rPr>
+          <w:szCs w:val="28"/>
+        </w:rPr>
+      </w:pPr>
+      <w:r>
+        <w:rPr>
+          <w:szCs w:val="28"/>
+        </w:rPr>
+        <w:t xml:space="preserve">Количественные данные: Средние оценки, количество занятий, </w:t>
+      </w:r>
+      <w:r>
+        <w:rPr>
+          <w:szCs w:val="28"/>
+        </w:rPr>
+        <w:t>количество друзей</w:t>
+      </w:r>
+    </w:p>
+    <w:p>
+      <w:pPr>
+        <w:pStyle w:val="a3"/>
+        <w:numPr>
+          <w:ilvl w:val="0"/>
+          <w:numId w:val="23"/>
+        </w:numPr>
+        <w:spacing w:after="0"/>
+        <w:rPr>
+          <w:szCs w:val="28"/>
+        </w:rPr>
+      </w:pPr>
+      <w:r>
+        <w:rPr>
+          <w:szCs w:val="28"/>
+        </w:rPr>
+        <w:t xml:space="preserve">Качественные данные: Уровень интереса к занятиям, </w:t>
+      </w:r>
+      <w:r>
+        <w:rPr>
+          <w:szCs w:val="28"/>
+        </w:rPr>
+        <w:t>участие в мероприятиях, н</w:t>
+      </w:r>
+      <w:r>
+        <w:rPr>
+          <w:szCs w:val="28"/>
+        </w:rPr>
+        <w:t>аличие обоих родителей, уровень образования родителей</w:t>
+      </w:r>
+      <w:r>
+        <w:rPr>
+          <w:szCs w:val="28"/>
+        </w:rPr>
+        <w:t>.</w:t>
+      </w:r>
+    </w:p>
+    <w:p>
+      <w:pPr>
+        <w:rPr>
+          <w:szCs w:val="28"/>
+        </w:rPr>
+      </w:pPr>
+      <w:r>
+        <w:rPr>
+          <w:szCs w:val="28"/>
+        </w:rPr>
+        <w:t>Выходные параметры:</w:t>
+      </w:r>
+    </w:p>
+    <w:p>
+      <w:pPr>
+        <w:pStyle w:val="a3"/>
+        <w:numPr>
+          <w:ilvl w:val="0"/>
+          <w:numId w:val="13"/>
+        </w:numPr>
+        <w:spacing w:after="0"/>
+        <w:rPr>
+          <w:szCs w:val="28"/>
+        </w:rPr>
+      </w:pPr>
+      <w:r>
+        <w:rPr>
+          <w:szCs w:val="28"/>
+        </w:rPr>
+        <w:t>Оцениваемый</w:t>
+      </w:r>
+      <w:r>
+        <w:rPr>
+          <w:szCs w:val="28"/>
+        </w:rPr>
+        <w:t xml:space="preserve"> уровень </w:t>
+      </w:r>
+      <w:r>
+        <w:rPr>
+          <w:szCs w:val="28"/>
+        </w:rPr>
+        <w:t>психологического давления</w:t>
+      </w:r>
+      <w:r>
+        <w:rPr>
+          <w:szCs w:val="28"/>
+        </w:rPr>
+        <w:t xml:space="preserve"> (</w:t>
+      </w:r>
+      <w:r>
+        <w:rPr>
+          <w:szCs w:val="28"/>
+        </w:rPr>
+        <w:t>отсутствующий</w:t>
+      </w:r>
+      <w:r>
+        <w:rPr>
+          <w:szCs w:val="28"/>
+        </w:rPr>
+        <w:t xml:space="preserve">, </w:t>
+      </w:r>
+      <w:r>
+        <w:rPr>
+          <w:szCs w:val="28"/>
+        </w:rPr>
+        <w:t>низкий, умеренный или высокий</w:t>
+      </w:r>
+      <w:r>
+        <w:rPr>
+          <w:szCs w:val="28"/>
+        </w:rPr>
+        <w:t>).</w:t>
+      </w:r>
+    </w:p>
+    <w:p>
+      <w:pPr>
+        <w:pStyle w:val="a3"/>
+        <w:numPr>
+          <w:ilvl w:val="0"/>
+          <w:numId w:val="13"/>
+        </w:numPr>
+        <w:spacing w:after="0"/>
+        <w:rPr>
+          <w:szCs w:val="28"/>
+        </w:rPr>
+      </w:pPr>
+      <w:r>
+        <w:rPr>
+          <w:szCs w:val="28"/>
+        </w:rPr>
+        <w:t xml:space="preserve">Вероятностная оценка </w:t>
+      </w:r>
+      <w:r>
+        <w:rPr>
+          <w:szCs w:val="28"/>
+        </w:rPr>
+        <w:t>необходимости оказания психологической поддержки</w:t>
+      </w:r>
+      <w:r>
+        <w:rPr>
+          <w:szCs w:val="28"/>
+        </w:rPr>
+        <w:t xml:space="preserve"> на основе анализа факторов.</w:t>
+      </w:r>
+    </w:p>
+    <w:p>
+      <w:pPr>
+        <w:spacing w:after="0"/>
+        <w:rPr>
+          <w:b/>
+          <w:bCs/>
+          <w:szCs w:val="28"/>
+        </w:rPr>
+      </w:pPr>
+    </w:p>
+    <w:p>
+      <w:pPr>
+        <w:spacing w:after="0"/>
+        <w:rPr>
+          <w:szCs w:val="28"/>
+        </w:rPr>
+      </w:pPr>
+      <w:r>
+        <w:rPr>
+          <w:b/>
+          <w:bCs/>
+          <w:szCs w:val="28"/>
+        </w:rPr>
+        <w:t>Концептуальная модель</w:t>
+      </w:r>
+      <w:r>
+        <w:rPr>
+          <w:szCs w:val="28"/>
+        </w:rPr>
+        <w:t xml:space="preserve"> включает структурно-функциональную и причинно-следственную модели, связывая когнитивную и содержательную модели в единую систему.</w:t>
+      </w:r>
+    </w:p>
+    <w:p>
+      <w:pPr>
+        <w:rPr>
+          <w:szCs w:val="28"/>
+        </w:rPr>
+      </w:pPr>
+      <w:r>
+        <w:rPr>
+          <w:b/>
+          <w:bCs/>
+          <w:szCs w:val="28"/>
+        </w:rPr>
+        <w:lastRenderedPageBreak/>
+        <w:t>Структурно-функциональная модель</w:t>
+      </w:r>
+      <w:r>
+        <w:rPr>
+          <w:szCs w:val="28"/>
+        </w:rPr>
+        <w:t xml:space="preserve"> описывает основные блоки и взаимодействия между ними. В данной модели блоки включают учебные и социальные факторы, семейные условия, личные качества подростка и мотивационные аспекты. Эти блоки должны быть функционально связаны, чтобы дать целостную картину </w:t>
+      </w:r>
+      <w:r>
+        <w:rPr>
+          <w:szCs w:val="28"/>
+        </w:rPr>
+        <w:t>оценки психологического давления</w:t>
+      </w:r>
+      <w:r>
+        <w:rPr>
+          <w:szCs w:val="28"/>
+        </w:rPr>
+        <w:t>.</w:t>
+      </w:r>
+    </w:p>
+    <w:p>
+      <w:pPr>
+        <w:rPr>
+          <w:szCs w:val="28"/>
+        </w:rPr>
+      </w:pPr>
+      <w:r>
+        <w:rPr>
           <w:szCs w:val="28"/>
         </w:rPr>
         <w:t>Операторы модели:</w:t>
@@ -494,1251 +1751,6 @@
       </w:pPr>
       <w:r>
         <w:rPr>
-          <w:b/>
-          <w:bCs/>
-          <w:szCs w:val="28"/>
-        </w:rPr>
-        <w:t>Содержательная модель</w:t>
-      </w:r>
-      <w:r>
-        <w:rPr>
-          <w:szCs w:val="28"/>
-        </w:rPr>
-        <w:t xml:space="preserve"> </w:t>
-      </w:r>
-      <w:r>
-        <w:rPr>
-          <w:szCs w:val="28"/>
-        </w:rPr>
-        <w:t>представляет</w:t>
-      </w:r>
-      <w:r>
-        <w:rPr>
-          <w:szCs w:val="28"/>
-        </w:rPr>
-        <w:t xml:space="preserve"> факторы, влияющие </w:t>
-      </w:r>
-      <w:r>
-        <w:rPr>
-          <w:szCs w:val="28"/>
-        </w:rPr>
-        <w:t>стресс подростков в виде формальной модели</w:t>
-      </w:r>
-      <w:r>
-        <w:rPr>
-          <w:szCs w:val="28"/>
-        </w:rPr>
-        <w:t xml:space="preserve">. Эта модель учитывает влияние конкретных параметров </w:t>
-      </w:r>
-      <w:r>
-        <w:rPr>
-          <w:szCs w:val="28"/>
-        </w:rPr>
-        <w:t>–</w:t>
-      </w:r>
-      <w:r>
-        <w:rPr>
-          <w:szCs w:val="28"/>
-        </w:rPr>
-        <w:t xml:space="preserve"> учебных, социальных, семейных факторов </w:t>
-      </w:r>
-      <w:r>
-        <w:rPr>
-          <w:szCs w:val="28"/>
-        </w:rPr>
-        <w:t>–</w:t>
-      </w:r>
-      <w:r>
-        <w:rPr>
-          <w:szCs w:val="28"/>
-        </w:rPr>
-        <w:t xml:space="preserve"> и связывает их с </w:t>
-      </w:r>
-      <w:r>
-        <w:rPr>
-          <w:szCs w:val="28"/>
-        </w:rPr>
-        <w:t>уровнем стресса</w:t>
-      </w:r>
-      <w:r>
-        <w:rPr>
-          <w:szCs w:val="28"/>
-        </w:rPr>
-        <w:t xml:space="preserve">. </w:t>
-      </w:r>
-      <w:r>
-        <w:rPr>
-          <w:szCs w:val="28"/>
-        </w:rPr>
-        <w:t xml:space="preserve">Для содержательного моделирования структура и влияние каждого фактора </w:t>
-      </w:r>
-      <w:r>
-        <w:rPr>
-          <w:szCs w:val="28"/>
-        </w:rPr>
-        <w:t>рассматриваются</w:t>
-      </w:r>
-      <w:r>
-        <w:rPr>
-          <w:szCs w:val="28"/>
-        </w:rPr>
-        <w:t xml:space="preserve"> в деталях, а каждый параметр будет иметь конкретное определение</w:t>
-      </w:r>
-      <w:r>
-        <w:rPr>
-          <w:szCs w:val="28"/>
-        </w:rPr>
-        <w:t>:</w:t>
-      </w:r>
-    </w:p>
-    <w:p>
-      <w:pPr>
-        <w:pStyle w:val="a3"/>
-        <w:numPr>
-          <w:ilvl w:val="0"/>
-          <w:numId w:val="15"/>
-        </w:numPr>
-        <w:spacing w:after="0"/>
-        <w:rPr>
-          <w:szCs w:val="28"/>
-        </w:rPr>
-      </w:pPr>
-      <w:r>
-        <w:rPr>
-          <w:szCs w:val="28"/>
-        </w:rPr>
-        <w:t>Учебные достижения:</w:t>
-      </w:r>
-    </w:p>
-    <w:p>
-      <w:pPr>
-        <w:pStyle w:val="a3"/>
-        <w:numPr>
-          <w:ilvl w:val="1"/>
-          <w:numId w:val="16"/>
-        </w:numPr>
-        <w:spacing w:after="0"/>
-        <w:rPr>
-          <w:szCs w:val="28"/>
-        </w:rPr>
-      </w:pPr>
-      <w:r>
-        <w:rPr>
-          <w:szCs w:val="28"/>
-        </w:rPr>
-        <w:t>Параметр: Средний балл оценок или другой показатель успеваемости.</w:t>
-      </w:r>
-    </w:p>
-    <w:p>
-      <w:pPr>
-        <w:pStyle w:val="a3"/>
-        <w:numPr>
-          <w:ilvl w:val="1"/>
-          <w:numId w:val="16"/>
-        </w:numPr>
-        <w:spacing w:after="0"/>
-        <w:rPr>
-          <w:szCs w:val="28"/>
-        </w:rPr>
-      </w:pPr>
-      <w:r>
-        <w:rPr>
-          <w:szCs w:val="28"/>
-        </w:rPr>
-        <w:t xml:space="preserve">Вес в модели: </w:t>
-      </w:r>
-      <w:r>
-        <w:rPr>
-          <w:szCs w:val="28"/>
-        </w:rPr>
-        <w:t>в</w:t>
-      </w:r>
-      <w:r>
-        <w:rPr>
-          <w:szCs w:val="28"/>
-        </w:rPr>
-        <w:t xml:space="preserve">ысокий, так как успеваемость – один из главных </w:t>
-      </w:r>
-      <w:r>
-        <w:rPr>
-          <w:szCs w:val="28"/>
-        </w:rPr>
-        <w:t>факторов</w:t>
-      </w:r>
-      <w:r>
-        <w:rPr>
-          <w:szCs w:val="28"/>
-        </w:rPr>
-        <w:t xml:space="preserve"> дальнейшего успеха</w:t>
-      </w:r>
-      <w:r>
-        <w:rPr>
-          <w:szCs w:val="28"/>
-        </w:rPr>
-        <w:t xml:space="preserve"> если подросток планирует успешно завершить обучение в выпускном кла</w:t>
-      </w:r>
-      <w:r>
-        <w:rPr>
-          <w:szCs w:val="28"/>
-        </w:rPr>
-        <w:t>ссе</w:t>
-      </w:r>
-      <w:r>
-        <w:rPr>
-          <w:szCs w:val="28"/>
-        </w:rPr>
-        <w:t>.</w:t>
-      </w:r>
-    </w:p>
-    <w:p>
-      <w:pPr>
-        <w:pStyle w:val="a3"/>
-        <w:numPr>
-          <w:ilvl w:val="1"/>
-          <w:numId w:val="16"/>
-        </w:numPr>
-        <w:spacing w:after="0"/>
-        <w:rPr>
-          <w:szCs w:val="28"/>
-        </w:rPr>
-      </w:pPr>
-      <w:r>
-        <w:rPr>
-          <w:szCs w:val="28"/>
-        </w:rPr>
-        <w:t xml:space="preserve">Влияние: </w:t>
-      </w:r>
-      <w:r>
-        <w:rPr>
-          <w:szCs w:val="28"/>
-        </w:rPr>
-        <w:t xml:space="preserve">Высокий уровень успеваемости снижает уровень стресса, придавая уверенности в себе и повышая самооценку, низкий же </w:t>
-      </w:r>
-      <w:r>
-        <w:rPr>
-          <w:szCs w:val="28"/>
-        </w:rPr>
-        <w:t xml:space="preserve">имеет </w:t>
-      </w:r>
-      <w:r>
-        <w:rPr>
-          <w:szCs w:val="28"/>
-        </w:rPr>
-        <w:t>влия</w:t>
-      </w:r>
-      <w:r>
-        <w:rPr>
-          <w:szCs w:val="28"/>
-        </w:rPr>
-        <w:t>ние</w:t>
-      </w:r>
-      <w:r>
-        <w:rPr>
-          <w:szCs w:val="28"/>
-        </w:rPr>
-        <w:t xml:space="preserve"> в обратную сторону</w:t>
-      </w:r>
-      <w:r>
-        <w:rPr>
-          <w:szCs w:val="28"/>
-        </w:rPr>
-        <w:t>.</w:t>
-      </w:r>
-    </w:p>
-    <w:p>
-      <w:pPr>
-        <w:pStyle w:val="a3"/>
-        <w:numPr>
-          <w:ilvl w:val="0"/>
-          <w:numId w:val="15"/>
-        </w:numPr>
-        <w:spacing w:after="0"/>
-        <w:rPr>
-          <w:szCs w:val="28"/>
-        </w:rPr>
-      </w:pPr>
-      <w:r>
-        <w:rPr>
-          <w:szCs w:val="28"/>
-        </w:rPr>
-        <w:t>Социальная активность:</w:t>
-      </w:r>
-    </w:p>
-    <w:p>
-      <w:pPr>
-        <w:pStyle w:val="a3"/>
-        <w:numPr>
-          <w:ilvl w:val="1"/>
-          <w:numId w:val="17"/>
-        </w:numPr>
-        <w:spacing w:after="0"/>
-        <w:rPr>
-          <w:szCs w:val="28"/>
-        </w:rPr>
-      </w:pPr>
-      <w:r>
-        <w:rPr>
-          <w:szCs w:val="28"/>
-        </w:rPr>
-        <w:lastRenderedPageBreak/>
-        <w:t xml:space="preserve">Параметр: </w:t>
-      </w:r>
-      <w:r>
-        <w:rPr>
-          <w:szCs w:val="28"/>
-        </w:rPr>
-        <w:t>у</w:t>
-      </w:r>
-      <w:r>
-        <w:rPr>
-          <w:szCs w:val="28"/>
-        </w:rPr>
-        <w:t>частие в школьных мероприятиях.</w:t>
-      </w:r>
-    </w:p>
-    <w:p>
-      <w:pPr>
-        <w:pStyle w:val="a3"/>
-        <w:numPr>
-          <w:ilvl w:val="1"/>
-          <w:numId w:val="17"/>
-        </w:numPr>
-        <w:spacing w:after="0"/>
-        <w:rPr>
-          <w:szCs w:val="28"/>
-        </w:rPr>
-      </w:pPr>
-      <w:r>
-        <w:rPr>
-          <w:szCs w:val="28"/>
-        </w:rPr>
-        <w:t xml:space="preserve">Вес в модели: </w:t>
-      </w:r>
-      <w:r>
-        <w:rPr>
-          <w:szCs w:val="28"/>
-        </w:rPr>
-        <w:t xml:space="preserve">высокий – социальная </w:t>
-      </w:r>
-      <w:r>
-        <w:rPr>
-          <w:szCs w:val="28"/>
-        </w:rPr>
-        <w:t>активность способствует адаптации</w:t>
-      </w:r>
-      <w:r>
-        <w:rPr>
-          <w:szCs w:val="28"/>
-        </w:rPr>
-        <w:t xml:space="preserve"> и отвлечению от стрессовых ситуаций</w:t>
-      </w:r>
-      <w:r>
-        <w:rPr>
-          <w:szCs w:val="28"/>
-        </w:rPr>
-        <w:t>.</w:t>
-      </w:r>
-    </w:p>
-    <w:p>
-      <w:pPr>
-        <w:pStyle w:val="a3"/>
-        <w:numPr>
-          <w:ilvl w:val="1"/>
-          <w:numId w:val="17"/>
-        </w:numPr>
-        <w:spacing w:after="0"/>
-        <w:rPr>
-          <w:szCs w:val="28"/>
-        </w:rPr>
-      </w:pPr>
-      <w:r>
-        <w:rPr>
-          <w:szCs w:val="28"/>
-        </w:rPr>
-        <w:t xml:space="preserve">Влияние: </w:t>
-      </w:r>
-      <w:r>
-        <w:rPr>
-          <w:szCs w:val="28"/>
-        </w:rPr>
-        <w:t>у</w:t>
-      </w:r>
-      <w:r>
-        <w:rPr>
-          <w:szCs w:val="28"/>
-        </w:rPr>
-        <w:t>частие в общественной жизни повышает навыки общения и снижает уровень стресса.</w:t>
-      </w:r>
-    </w:p>
-    <w:p>
-      <w:pPr>
-        <w:pStyle w:val="a3"/>
-        <w:numPr>
-          <w:ilvl w:val="0"/>
-          <w:numId w:val="15"/>
-        </w:numPr>
-        <w:spacing w:after="0"/>
-        <w:rPr>
-          <w:szCs w:val="28"/>
-        </w:rPr>
-      </w:pPr>
-      <w:r>
-        <w:rPr>
-          <w:szCs w:val="28"/>
-        </w:rPr>
-        <w:t>Дополнительные учебные занятия</w:t>
-      </w:r>
-    </w:p>
-    <w:p>
-      <w:pPr>
-        <w:pStyle w:val="a3"/>
-        <w:numPr>
-          <w:ilvl w:val="1"/>
-          <w:numId w:val="18"/>
-        </w:numPr>
-        <w:spacing w:after="0"/>
-        <w:rPr>
-          <w:szCs w:val="28"/>
-        </w:rPr>
-      </w:pPr>
-      <w:r>
-        <w:rPr>
-          <w:szCs w:val="28"/>
-        </w:rPr>
-        <w:t>Параметр: количество и интенсивность дополнительных занятий (кружков, секций, курсов и т. д.)</w:t>
-      </w:r>
-    </w:p>
-    <w:p>
-      <w:pPr>
-        <w:pStyle w:val="a3"/>
-        <w:numPr>
-          <w:ilvl w:val="1"/>
-          <w:numId w:val="18"/>
-        </w:numPr>
-        <w:spacing w:after="0"/>
-        <w:rPr>
-          <w:szCs w:val="28"/>
-        </w:rPr>
-      </w:pPr>
-      <w:r>
-        <w:rPr>
-          <w:szCs w:val="28"/>
-        </w:rPr>
-        <w:t>Вес в модели: средний</w:t>
-      </w:r>
-      <w:r>
-        <w:rPr>
-          <w:szCs w:val="28"/>
-        </w:rPr>
-        <w:t xml:space="preserve"> – дополнительные</w:t>
-      </w:r>
-      <w:r>
-        <w:rPr>
-          <w:szCs w:val="28"/>
-        </w:rPr>
-        <w:t xml:space="preserve"> занятия</w:t>
-      </w:r>
-      <w:r>
-        <w:rPr>
-          <w:szCs w:val="28"/>
-        </w:rPr>
-        <w:t xml:space="preserve"> могут помочь подростку подкрепить свои успехи в основной учёбе</w:t>
-      </w:r>
-      <w:r>
-        <w:rPr>
-          <w:szCs w:val="28"/>
-        </w:rPr>
-        <w:t>,</w:t>
-      </w:r>
-      <w:r>
-        <w:rPr>
-          <w:szCs w:val="28"/>
-        </w:rPr>
-        <w:t xml:space="preserve"> </w:t>
-      </w:r>
-      <w:r>
-        <w:rPr>
-          <w:szCs w:val="28"/>
-        </w:rPr>
-        <w:t>а также может повысить самооценку и задать вектор увлечений подростка</w:t>
-      </w:r>
-      <w:r>
-        <w:rPr>
-          <w:szCs w:val="28"/>
-        </w:rPr>
-        <w:t>, однако дополнительные занятия могут создавать большую учебную нагрузк</w:t>
-      </w:r>
-      <w:r>
-        <w:rPr>
-          <w:szCs w:val="28"/>
-        </w:rPr>
-        <w:t>у</w:t>
-      </w:r>
-      <w:r>
-        <w:rPr>
-          <w:szCs w:val="28"/>
-        </w:rPr>
-        <w:t>.</w:t>
-      </w:r>
-    </w:p>
-    <w:p>
-      <w:pPr>
-        <w:pStyle w:val="a3"/>
-        <w:numPr>
-          <w:ilvl w:val="1"/>
-          <w:numId w:val="18"/>
-        </w:numPr>
-        <w:spacing w:after="0"/>
-        <w:rPr>
-          <w:szCs w:val="28"/>
-        </w:rPr>
-      </w:pPr>
-      <w:r>
-        <w:rPr>
-          <w:szCs w:val="28"/>
-        </w:rPr>
-        <w:t>Влияние: подростки, посещающие дополнительные занятия</w:t>
-      </w:r>
-      <w:r>
-        <w:rPr>
-          <w:szCs w:val="28"/>
-        </w:rPr>
-        <w:t xml:space="preserve"> часто более уверены в себе</w:t>
-      </w:r>
-      <w:r>
-        <w:rPr>
-          <w:szCs w:val="28"/>
-        </w:rPr>
-        <w:t xml:space="preserve"> и имеют планы на будущее</w:t>
-      </w:r>
-      <w:r>
-        <w:rPr>
-          <w:szCs w:val="28"/>
-        </w:rPr>
-        <w:t xml:space="preserve">, однако также могут быть и более </w:t>
-      </w:r>
-      <w:r>
-        <w:rPr>
-          <w:szCs w:val="28"/>
-        </w:rPr>
-        <w:t>загруженными</w:t>
-      </w:r>
-      <w:r>
-        <w:rPr>
-          <w:szCs w:val="28"/>
-        </w:rPr>
-        <w:t xml:space="preserve"> в отличие от других сверстников.</w:t>
-      </w:r>
-    </w:p>
-    <w:p>
-      <w:pPr>
-        <w:pStyle w:val="a3"/>
-        <w:numPr>
-          <w:ilvl w:val="0"/>
-          <w:numId w:val="15"/>
-        </w:numPr>
-        <w:spacing w:after="0"/>
-        <w:rPr>
-          <w:szCs w:val="28"/>
-        </w:rPr>
-      </w:pPr>
-      <w:r>
-        <w:rPr>
-          <w:szCs w:val="28"/>
-        </w:rPr>
-        <w:t>Наличие друзей и межличностные отношения</w:t>
-      </w:r>
-    </w:p>
-    <w:p>
-      <w:pPr>
-        <w:pStyle w:val="a3"/>
-        <w:numPr>
-          <w:ilvl w:val="1"/>
-          <w:numId w:val="19"/>
-        </w:numPr>
-        <w:spacing w:after="0"/>
-        <w:rPr>
-          <w:szCs w:val="28"/>
-        </w:rPr>
-      </w:pPr>
-      <w:r>
-        <w:rPr>
-          <w:szCs w:val="28"/>
-        </w:rPr>
-        <w:t>Количество близких друзей в школе и качество межличностных отношений</w:t>
-      </w:r>
-    </w:p>
-    <w:p>
-      <w:pPr>
-        <w:pStyle w:val="a3"/>
-        <w:numPr>
-          <w:ilvl w:val="1"/>
-          <w:numId w:val="19"/>
-        </w:numPr>
-        <w:spacing w:after="0"/>
-        <w:rPr>
-          <w:szCs w:val="28"/>
-        </w:rPr>
-      </w:pPr>
-      <w:r>
-        <w:rPr>
-          <w:szCs w:val="28"/>
-        </w:rPr>
-        <w:t xml:space="preserve">Вес в модели: </w:t>
-      </w:r>
-      <w:r>
-        <w:rPr>
-          <w:szCs w:val="28"/>
-        </w:rPr>
-        <w:t>высокий</w:t>
-      </w:r>
-      <w:r>
-        <w:rPr>
-          <w:szCs w:val="28"/>
-        </w:rPr>
-        <w:t>, так как поддержка друзей и хорошие отношения способствуют психологическому комфорту. Но этот фактор может нанести и вред, если подросток свяжется с «плохой» компание</w:t>
-      </w:r>
-      <w:r>
-        <w:rPr>
-          <w:szCs w:val="28"/>
-        </w:rPr>
-        <w:t>й, которая будет дестабилизировать его психологическое состояние .</w:t>
-      </w:r>
-    </w:p>
-    <w:p>
-      <w:pPr>
-        <w:pStyle w:val="a3"/>
-        <w:numPr>
-          <w:ilvl w:val="1"/>
-          <w:numId w:val="19"/>
-        </w:numPr>
-        <w:spacing w:after="0"/>
-        <w:rPr>
-          <w:szCs w:val="28"/>
-        </w:rPr>
-      </w:pPr>
-      <w:r>
-        <w:rPr>
-          <w:szCs w:val="28"/>
-        </w:rPr>
-        <w:t xml:space="preserve">Влияние: наличие </w:t>
-      </w:r>
-      <w:r>
-        <w:rPr>
-          <w:szCs w:val="28"/>
-        </w:rPr>
-        <w:t xml:space="preserve">хороших </w:t>
-      </w:r>
-      <w:r>
-        <w:rPr>
-          <w:szCs w:val="28"/>
-        </w:rPr>
-        <w:t xml:space="preserve">друзей </w:t>
-      </w:r>
-      <w:r>
-        <w:rPr>
-          <w:szCs w:val="28"/>
-        </w:rPr>
-        <w:t xml:space="preserve">эффективно </w:t>
-      </w:r>
-      <w:r>
-        <w:rPr>
-          <w:szCs w:val="28"/>
-        </w:rPr>
-        <w:t>помогает справляться со стрессовыми ситуациями</w:t>
-      </w:r>
-      <w:r>
-        <w:rPr>
-          <w:szCs w:val="28"/>
-        </w:rPr>
-        <w:t>.</w:t>
-      </w:r>
-    </w:p>
-    <w:p>
-      <w:pPr>
-        <w:pStyle w:val="a3"/>
-        <w:numPr>
-          <w:ilvl w:val="0"/>
-          <w:numId w:val="15"/>
-        </w:numPr>
-        <w:spacing w:after="0"/>
-        <w:rPr>
-          <w:szCs w:val="28"/>
-        </w:rPr>
-      </w:pPr>
-      <w:r>
-        <w:rPr>
-          <w:szCs w:val="28"/>
-        </w:rPr>
-        <w:t>Семейная поддержка</w:t>
-      </w:r>
-    </w:p>
-    <w:p>
-      <w:pPr>
-        <w:pStyle w:val="a3"/>
-        <w:numPr>
-          <w:ilvl w:val="1"/>
-          <w:numId w:val="20"/>
-        </w:numPr>
-        <w:spacing w:after="0"/>
-        <w:rPr>
-          <w:szCs w:val="28"/>
-        </w:rPr>
-      </w:pPr>
-      <w:r>
-        <w:rPr>
-          <w:szCs w:val="28"/>
-        </w:rPr>
-        <w:t>Параметр: наличие обоих родителей, уровень их образования, характер занятости</w:t>
-      </w:r>
-    </w:p>
-    <w:p>
-      <w:pPr>
-        <w:pStyle w:val="a3"/>
-        <w:numPr>
-          <w:ilvl w:val="1"/>
-          <w:numId w:val="20"/>
-        </w:numPr>
-        <w:spacing w:after="0"/>
-        <w:rPr>
-          <w:szCs w:val="28"/>
-        </w:rPr>
-      </w:pPr>
-      <w:r>
-        <w:rPr>
-          <w:szCs w:val="28"/>
-        </w:rPr>
-        <w:lastRenderedPageBreak/>
-        <w:t xml:space="preserve">Вес в модели: высокий, так как поддержка семьи </w:t>
-      </w:r>
-      <w:r>
-        <w:rPr>
-          <w:szCs w:val="28"/>
-        </w:rPr>
-        <w:t>в стрессовых ситуациях даёт наиболее прочную опору для подростка, чем какой-либо другой фактор. При отсутствии поддержки стрессовая ситуация может казаться подростку ещё более сложной к разрешению.</w:t>
-      </w:r>
-    </w:p>
-    <w:p>
-      <w:pPr>
-        <w:pStyle w:val="a3"/>
-        <w:numPr>
-          <w:ilvl w:val="1"/>
-          <w:numId w:val="20"/>
-        </w:numPr>
-        <w:spacing w:after="0"/>
-        <w:rPr>
-          <w:szCs w:val="28"/>
-        </w:rPr>
-      </w:pPr>
-      <w:r>
-        <w:rPr>
-          <w:szCs w:val="28"/>
-        </w:rPr>
-        <w:t xml:space="preserve">Влияние: </w:t>
-      </w:r>
-      <w:r>
-        <w:rPr>
-          <w:szCs w:val="28"/>
-        </w:rPr>
-        <w:t xml:space="preserve">поддержка семьи предоставляет прочнейшую опору подростку при </w:t>
-      </w:r>
-      <w:r>
-        <w:rPr>
-          <w:szCs w:val="28"/>
-        </w:rPr>
-        <w:t>нахождении в</w:t>
-      </w:r>
-      <w:r>
-        <w:rPr>
-          <w:szCs w:val="28"/>
-        </w:rPr>
-        <w:t xml:space="preserve"> </w:t>
-      </w:r>
-      <w:r>
-        <w:rPr>
-          <w:szCs w:val="28"/>
-        </w:rPr>
-        <w:t>стрессовых ситуациях.</w:t>
-      </w:r>
-    </w:p>
-    <w:p>
-      <w:pPr>
-        <w:pStyle w:val="a3"/>
-        <w:numPr>
-          <w:ilvl w:val="0"/>
-          <w:numId w:val="15"/>
-        </w:numPr>
-        <w:spacing w:after="0"/>
-        <w:rPr>
-          <w:szCs w:val="28"/>
-        </w:rPr>
-      </w:pPr>
-      <w:r>
-        <w:rPr>
-          <w:szCs w:val="28"/>
-        </w:rPr>
-        <w:t>Планы на будущее</w:t>
-      </w:r>
-    </w:p>
-    <w:p>
-      <w:pPr>
-        <w:pStyle w:val="a3"/>
-        <w:numPr>
-          <w:ilvl w:val="1"/>
-          <w:numId w:val="21"/>
-        </w:numPr>
-        <w:spacing w:after="0"/>
-        <w:rPr>
-          <w:szCs w:val="28"/>
-        </w:rPr>
-      </w:pPr>
-      <w:r>
-        <w:rPr>
-          <w:szCs w:val="28"/>
-        </w:rPr>
-        <w:t>Параметр: наличие четкого плана на будущее (выбор профессии и учебного заведения)</w:t>
-      </w:r>
-    </w:p>
-    <w:p>
-      <w:pPr>
-        <w:pStyle w:val="a3"/>
-        <w:numPr>
-          <w:ilvl w:val="1"/>
-          <w:numId w:val="21"/>
-        </w:numPr>
-        <w:spacing w:after="0"/>
-        <w:rPr>
-          <w:szCs w:val="28"/>
-        </w:rPr>
-      </w:pPr>
-      <w:r>
-        <w:rPr>
-          <w:szCs w:val="28"/>
-        </w:rPr>
-        <w:t>Вес в модели: высокий, так как наличие целей положительно влияет на мотивацию</w:t>
-      </w:r>
-      <w:r>
-        <w:rPr>
-          <w:szCs w:val="28"/>
-        </w:rPr>
-        <w:t>, а также устраняет неопределённости, которые бы могли вызвать стресс. Однако несоответствие этих планов с действительностью может сильно ударить по психике.</w:t>
-      </w:r>
-    </w:p>
-    <w:p>
-      <w:pPr>
-        <w:pStyle w:val="a3"/>
-        <w:numPr>
-          <w:ilvl w:val="1"/>
-          <w:numId w:val="21"/>
-        </w:numPr>
-        <w:spacing w:after="0"/>
-        <w:rPr>
-          <w:szCs w:val="28"/>
-        </w:rPr>
-      </w:pPr>
-      <w:r>
-        <w:rPr>
-          <w:szCs w:val="28"/>
-        </w:rPr>
-        <w:t xml:space="preserve">Влияние: </w:t>
-      </w:r>
-      <w:r>
-        <w:rPr>
-          <w:szCs w:val="28"/>
-        </w:rPr>
-        <w:t>наличие реалистичных планов на будущее устраняет неопределённости и придаёт уверенности.</w:t>
-      </w:r>
-    </w:p>
-    <w:p>
-      <w:pPr>
-        <w:rPr>
-          <w:szCs w:val="28"/>
-        </w:rPr>
-      </w:pPr>
-      <w:r>
-        <w:rPr>
-          <w:szCs w:val="28"/>
-        </w:rPr>
-        <w:t>Сложность модели связана с необходимостью интерпретировать качественные и количественные данные, а также с необходимостью учета множества весов и вероятностей.</w:t>
-      </w:r>
-    </w:p>
-    <w:p>
-      <w:pPr>
-        <w:rPr>
-          <w:szCs w:val="28"/>
-        </w:rPr>
-      </w:pPr>
-      <w:r>
-        <w:rPr>
-          <w:szCs w:val="28"/>
-        </w:rPr>
-        <w:t>Операторы модели:</w:t>
-      </w:r>
-    </w:p>
-    <w:p>
-      <w:pPr>
-        <w:pStyle w:val="a3"/>
-        <w:numPr>
-          <w:ilvl w:val="0"/>
-          <w:numId w:val="22"/>
-        </w:numPr>
-        <w:spacing w:after="0"/>
-        <w:rPr>
-          <w:szCs w:val="28"/>
-        </w:rPr>
-      </w:pPr>
-      <w:r>
-        <w:rPr>
-          <w:szCs w:val="28"/>
-        </w:rPr>
-        <w:t>Содержательная модель использует взвешенные коэффициенты, которые придаются каждому параметру в зависимости от его значимости.</w:t>
-      </w:r>
-    </w:p>
-    <w:p>
-      <w:pPr>
-        <w:pStyle w:val="a3"/>
-        <w:numPr>
-          <w:ilvl w:val="0"/>
-          <w:numId w:val="22"/>
-        </w:numPr>
-        <w:spacing w:after="0"/>
-        <w:rPr>
-          <w:szCs w:val="28"/>
-        </w:rPr>
-      </w:pPr>
-      <w:r>
-        <w:rPr>
-          <w:szCs w:val="28"/>
-        </w:rPr>
-        <w:t xml:space="preserve">Для оценки </w:t>
-      </w:r>
-      <w:r>
-        <w:rPr>
-          <w:szCs w:val="28"/>
-        </w:rPr>
-        <w:t>психологического давления</w:t>
-      </w:r>
-      <w:r>
-        <w:rPr>
-          <w:szCs w:val="28"/>
-        </w:rPr>
-        <w:t xml:space="preserve"> применяются логические операторы, позволяющие учитывать сочетание факторов (например, </w:t>
-      </w:r>
-      <w:r>
-        <w:rPr>
-          <w:szCs w:val="28"/>
-        </w:rPr>
-        <w:t>«</w:t>
-      </w:r>
-      <w:r>
-        <w:rPr>
-          <w:szCs w:val="28"/>
-        </w:rPr>
-        <w:t>хорошая успеваемость</w:t>
-      </w:r>
-      <w:r>
-        <w:rPr>
-          <w:szCs w:val="28"/>
-        </w:rPr>
-        <w:t>»</w:t>
-      </w:r>
-      <w:r>
-        <w:rPr>
-          <w:szCs w:val="28"/>
-        </w:rPr>
-        <w:t xml:space="preserve"> </w:t>
-      </w:r>
-      <w:r>
-        <w:rPr>
-          <w:szCs w:val="28"/>
-        </w:rPr>
-        <w:t>И</w:t>
-      </w:r>
-      <w:r>
-        <w:rPr>
-          <w:szCs w:val="28"/>
-        </w:rPr>
-        <w:t xml:space="preserve"> </w:t>
-      </w:r>
-      <w:r>
-        <w:rPr>
-          <w:szCs w:val="28"/>
-        </w:rPr>
-        <w:t>«</w:t>
-      </w:r>
-      <w:r>
-        <w:rPr>
-          <w:szCs w:val="28"/>
-        </w:rPr>
-        <w:t>поддержка друзей</w:t>
-      </w:r>
-      <w:r>
-        <w:rPr>
-          <w:szCs w:val="28"/>
-        </w:rPr>
-        <w:t>»</w:t>
-      </w:r>
-      <w:r>
-        <w:rPr>
-          <w:szCs w:val="28"/>
-        </w:rPr>
-        <w:t>).</w:t>
-      </w:r>
-    </w:p>
-    <w:p>
-      <w:pPr>
-        <w:rPr>
-          <w:szCs w:val="28"/>
-        </w:rPr>
-      </w:pPr>
-      <w:r>
-        <w:rPr>
-          <w:szCs w:val="28"/>
-        </w:rPr>
-        <w:t>Типы входных данных:</w:t>
-      </w:r>
-    </w:p>
-    <w:p>
-      <w:pPr>
-        <w:pStyle w:val="a3"/>
-        <w:numPr>
-          <w:ilvl w:val="0"/>
-          <w:numId w:val="23"/>
-        </w:numPr>
-        <w:spacing w:after="0"/>
-        <w:rPr>
-          <w:szCs w:val="28"/>
-        </w:rPr>
-      </w:pPr>
-      <w:r>
-        <w:rPr>
-          <w:szCs w:val="28"/>
-        </w:rPr>
-        <w:t xml:space="preserve">Количественные данные: Средние оценки, количество занятий, </w:t>
-      </w:r>
-      <w:r>
-        <w:rPr>
-          <w:szCs w:val="28"/>
-        </w:rPr>
-        <w:t>количество друзей</w:t>
-      </w:r>
-    </w:p>
-    <w:p>
-      <w:pPr>
-        <w:pStyle w:val="a3"/>
-        <w:numPr>
-          <w:ilvl w:val="0"/>
-          <w:numId w:val="23"/>
-        </w:numPr>
-        <w:spacing w:after="0"/>
-        <w:rPr>
-          <w:szCs w:val="28"/>
-        </w:rPr>
-      </w:pPr>
-      <w:r>
-        <w:rPr>
-          <w:szCs w:val="28"/>
-        </w:rPr>
-        <w:t xml:space="preserve">Качественные данные: Уровень интереса к занятиям, </w:t>
-      </w:r>
-      <w:r>
-        <w:rPr>
-          <w:szCs w:val="28"/>
-        </w:rPr>
-        <w:t>участие в мероприятиях, н</w:t>
-      </w:r>
-      <w:r>
-        <w:rPr>
-          <w:szCs w:val="28"/>
-        </w:rPr>
-        <w:t>аличие обоих родителей, уровень образования родителей</w:t>
-      </w:r>
-      <w:r>
-        <w:rPr>
-          <w:szCs w:val="28"/>
-        </w:rPr>
-        <w:t>.</w:t>
-      </w:r>
-    </w:p>
-    <w:p>
-      <w:pPr>
-        <w:rPr>
-          <w:szCs w:val="28"/>
-        </w:rPr>
-      </w:pPr>
-      <w:r>
-        <w:rPr>
-          <w:szCs w:val="28"/>
-        </w:rPr>
-        <w:lastRenderedPageBreak/>
-        <w:t>Выходные параметры:</w:t>
-      </w:r>
-    </w:p>
-    <w:p>
-      <w:pPr>
-        <w:pStyle w:val="a3"/>
-        <w:numPr>
-          <w:ilvl w:val="0"/>
-          <w:numId w:val="13"/>
-        </w:numPr>
-        <w:spacing w:after="0"/>
-        <w:rPr>
-          <w:szCs w:val="28"/>
-        </w:rPr>
-      </w:pPr>
-      <w:r>
-        <w:rPr>
-          <w:szCs w:val="28"/>
-        </w:rPr>
-        <w:t>Оцениваемый</w:t>
-      </w:r>
-      <w:r>
-        <w:rPr>
-          <w:szCs w:val="28"/>
-        </w:rPr>
-        <w:t xml:space="preserve"> уровень </w:t>
-      </w:r>
-      <w:r>
-        <w:rPr>
-          <w:szCs w:val="28"/>
-        </w:rPr>
-        <w:t>психологического давления</w:t>
-      </w:r>
-      <w:r>
-        <w:rPr>
-          <w:szCs w:val="28"/>
-        </w:rPr>
-        <w:t xml:space="preserve"> (</w:t>
-      </w:r>
-      <w:r>
-        <w:rPr>
-          <w:szCs w:val="28"/>
-        </w:rPr>
-        <w:t>отсутствующий</w:t>
-      </w:r>
-      <w:r>
-        <w:rPr>
-          <w:szCs w:val="28"/>
-        </w:rPr>
-        <w:t xml:space="preserve">, </w:t>
-      </w:r>
-      <w:r>
-        <w:rPr>
-          <w:szCs w:val="28"/>
-        </w:rPr>
-        <w:t>низкий, умеренный или высокий</w:t>
-      </w:r>
-      <w:r>
-        <w:rPr>
-          <w:szCs w:val="28"/>
-        </w:rPr>
-        <w:t>).</w:t>
-      </w:r>
-    </w:p>
-    <w:p>
-      <w:pPr>
-        <w:pStyle w:val="a3"/>
-        <w:numPr>
-          <w:ilvl w:val="0"/>
-          <w:numId w:val="13"/>
-        </w:numPr>
-        <w:spacing w:after="0"/>
-        <w:rPr>
-          <w:szCs w:val="28"/>
-        </w:rPr>
-      </w:pPr>
-      <w:r>
-        <w:rPr>
-          <w:szCs w:val="28"/>
-        </w:rPr>
-        <w:t xml:space="preserve">Вероятностная оценка </w:t>
-      </w:r>
-      <w:r>
-        <w:rPr>
-          <w:szCs w:val="28"/>
-        </w:rPr>
-        <w:t>необходимости оказания психологической поддержки</w:t>
-      </w:r>
-      <w:r>
-        <w:rPr>
-          <w:szCs w:val="28"/>
-        </w:rPr>
-        <w:t xml:space="preserve"> на основе анализа факторов.</w:t>
-      </w:r>
-    </w:p>
-    <w:p>
-      <w:pPr>
-        <w:spacing w:after="0"/>
-        <w:rPr>
-          <w:b/>
-          <w:bCs/>
-          <w:szCs w:val="28"/>
-        </w:rPr>
-      </w:pPr>
-    </w:p>
-    <w:p>
-      <w:pPr>
-        <w:spacing w:after="0"/>
-        <w:rPr>
-          <w:szCs w:val="28"/>
-        </w:rPr>
-      </w:pPr>
-      <w:r>
-        <w:rPr>
-          <w:b/>
-          <w:bCs/>
-          <w:szCs w:val="28"/>
-        </w:rPr>
-        <w:t>Концептуальная модель</w:t>
-      </w:r>
-      <w:r>
-        <w:rPr>
-          <w:szCs w:val="28"/>
-        </w:rPr>
-        <w:t xml:space="preserve"> включает структурно-функциональную и причинно-следственную модели, связывая когнитивную и содержательную модели в единую систему.</w:t>
-      </w:r>
-    </w:p>
-    <w:p>
-      <w:pPr>
-        <w:rPr>
-          <w:szCs w:val="28"/>
-        </w:rPr>
-      </w:pPr>
-      <w:r>
-        <w:rPr>
-          <w:b/>
-          <w:bCs/>
-          <w:szCs w:val="28"/>
-        </w:rPr>
-        <w:t>Структурно-функциональная модель</w:t>
-      </w:r>
-      <w:r>
-        <w:rPr>
-          <w:szCs w:val="28"/>
-        </w:rPr>
-        <w:t xml:space="preserve"> описывает основные блоки и взаимодействия между ними. В данной модели блоки включают учебные и социальные факторы, семейные условия, личные качества подростка и мотивационные аспекты. Эти блоки должны быть функционально связаны, чтобы дать целостную картину </w:t>
-      </w:r>
-      <w:r>
-        <w:rPr>
-          <w:szCs w:val="28"/>
-        </w:rPr>
-        <w:t>оценки психологического давления</w:t>
-      </w:r>
-      <w:r>
-        <w:rPr>
-          <w:szCs w:val="28"/>
-        </w:rPr>
-        <w:t>.</w:t>
-      </w:r>
-    </w:p>
-    <w:p>
-      <w:pPr>
-        <w:rPr>
-          <w:szCs w:val="28"/>
-        </w:rPr>
-      </w:pPr>
-      <w:r>
-        <w:rPr>
           <w:szCs w:val="28"/>
         </w:rPr>
         <w:t>Основные блоки:</w:t>
@@ -1786,7 +1798,145 @@
         <w:rPr>
           <w:szCs w:val="28"/>
         </w:rPr>
-        <w:t>Вход: уровень образования родителей, их поддержка, финансовое положение, участие в жизни ребёнка.</w:t>
+        <w:t>Вход: уровень образования родителей</w:t>
+      </w:r>
+      <w:r>
+        <w:rPr>
+          <w:szCs w:val="28"/>
+        </w:rPr>
+        <w:t xml:space="preserve"> </w:t>
+      </w:r>
+      <w:r>
+        <w:rPr>
+          <w:szCs w:val="28"/>
+        </w:rPr>
+        <w:t>(</w:t>
+      </w:r>
+      <w:r>
+        <w:rPr>
+          <w:szCs w:val="28"/>
+          <w:lang w:val="en-US"/>
+        </w:rPr>
+        <w:t>PE</w:t>
+      </w:r>
+      <w:r>
+        <w:rPr>
+          <w:szCs w:val="28"/>
+        </w:rPr>
+        <w:t xml:space="preserve">) </w:t>
+      </w:r>
+      <w:r>
+        <w:rPr>
+          <w:szCs w:val="28"/>
+        </w:rPr>
+        <w:t>(1-5)</w:t>
+      </w:r>
+      <w:r>
+        <w:rPr>
+          <w:szCs w:val="28"/>
+        </w:rPr>
+        <w:t>, их поддержка</w:t>
+      </w:r>
+      <w:r>
+        <w:rPr>
+          <w:szCs w:val="28"/>
+        </w:rPr>
+        <w:t xml:space="preserve"> (</w:t>
+      </w:r>
+      <w:r>
+        <w:rPr>
+          <w:szCs w:val="28"/>
+          <w:lang w:val="en-US"/>
+        </w:rPr>
+        <w:t>PS</w:t>
+      </w:r>
+      <w:r>
+        <w:rPr>
+          <w:szCs w:val="28"/>
+        </w:rPr>
+        <w:t>)</w:t>
+      </w:r>
+      <w:r>
+        <w:rPr>
+          <w:szCs w:val="28"/>
+        </w:rPr>
+        <w:t xml:space="preserve"> (0-1)</w:t>
+      </w:r>
+      <w:r>
+        <w:rPr>
+          <w:szCs w:val="28"/>
+        </w:rPr>
+        <w:t>, финансовое положение</w:t>
+      </w:r>
+      <w:r>
+        <w:rPr>
+          <w:szCs w:val="28"/>
+        </w:rPr>
+        <w:t xml:space="preserve"> </w:t>
+      </w:r>
+      <w:r>
+        <w:rPr>
+          <w:szCs w:val="28"/>
+        </w:rPr>
+        <w:t>(</w:t>
+      </w:r>
+      <w:r>
+        <w:rPr>
+          <w:szCs w:val="28"/>
+          <w:lang w:val="en-US"/>
+        </w:rPr>
+        <w:t>PR</w:t>
+      </w:r>
+      <w:r>
+        <w:rPr>
+          <w:szCs w:val="28"/>
+        </w:rPr>
+        <w:t xml:space="preserve">) </w:t>
+      </w:r>
+      <w:r>
+        <w:rPr>
+          <w:szCs w:val="28"/>
+        </w:rPr>
+        <w:t>(1-5)</w:t>
+      </w:r>
+      <w:r>
+        <w:rPr>
+          <w:szCs w:val="28"/>
+        </w:rPr>
+        <w:t>, участие в жизни ребёнка</w:t>
+      </w:r>
+      <w:r>
+        <w:rPr>
+          <w:szCs w:val="28"/>
+        </w:rPr>
+        <w:t xml:space="preserve"> (</w:t>
+      </w:r>
+      <w:r>
+        <w:rPr>
+          <w:szCs w:val="28"/>
+          <w:lang w:val="en-US"/>
+        </w:rPr>
+        <w:t>PC</w:t>
+      </w:r>
+      <w:bookmarkStart w:id="0" w:name="_GoBack"/>
+      <w:bookmarkEnd w:id="0"/>
+      <w:r>
+        <w:rPr>
+          <w:szCs w:val="28"/>
+        </w:rPr>
+        <w:t>)</w:t>
+      </w:r>
+      <w:r>
+        <w:rPr>
+          <w:szCs w:val="28"/>
+        </w:rPr>
+        <w:t xml:space="preserve"> (0-1)</w:t>
+      </w:r>
+      <w:r>
+        <w:rPr>
+          <w:szCs w:val="28"/>
+        </w:rPr>
+        <w:t>.</w:t>
       </w:r>
     </w:p>
     <w:p>
@@ -1857,6 +2007,7 @@
         <w:rPr>
           <w:szCs w:val="28"/>
         </w:rPr>
+        <w:lastRenderedPageBreak/>
         <w:t xml:space="preserve">Выход: </w:t>
       </w:r>
       <w:r>
@@ -1888,7 +2039,6 @@
         <w:rPr>
           <w:szCs w:val="28"/>
         </w:rPr>
-        <w:lastRenderedPageBreak/>
         <w:t>Социальная среда</w:t>
       </w:r>
     </w:p>
@@ -2111,7 +2261,7 @@
         <w:rPr>
           <w:noProof/>
           <w:szCs w:val="28"/>
-          <w:lang w:val="en-US"/>
+          <w:lang w:eastAsia="ru-RU"/>
         </w:rPr>
         <w:lastRenderedPageBreak/>
         <w:drawing>
@@ -5570,6 +5720,7 @@
         <w:rPr>
           <w:noProof/>
           <w:szCs w:val="28"/>
+          <w:lang w:eastAsia="ru-RU"/>
         </w:rPr>
         <w:drawing>
           <wp:inline distT="0" distB="0" distL="0" distR="0" wp14:anchorId="59B5601D" wp14:editId="1E353033">
@@ -6507,23 +6658,7 @@
           <w:lang w:val="ru-RU"/>
         </w:rPr>
         <w:lastRenderedPageBreak/>
-        <w:t xml:space="preserve">Модель </w:t>
-      </w:r>
-      <w:r>
-        <w:rPr>
-          <w:sz w:val="28"/>
-          <w:szCs w:val="28"/>
-          <w:lang w:val="ru-RU"/>
-        </w:rPr>
-        <w:t>— это</w:t>
-      </w:r>
-      <w:r>
-        <w:rPr>
-          <w:sz w:val="28"/>
-          <w:szCs w:val="28"/>
-          <w:lang w:val="ru-RU"/>
-        </w:rPr>
-        <w:t xml:space="preserve"> объект-заместитель объекта-оригинала, обеспечивающий изучение некоторых свойств оригинала.  </w:t>
+        <w:t xml:space="preserve">Модель — это объект-заместитель объекта-оригинала, обеспечивающий изучение некоторых свойств оригинала.  </w:t>
       </w:r>
     </w:p>
     <w:p>
@@ -7049,7 +7184,7 @@
       <w:pPr>
         <w:ind w:firstLine="0"/>
         <w:rPr>
-          <w:lang w:val="ru-US"/>
+          <w:lang/>
         </w:rPr>
       </w:pPr>
     </w:p>
@@ -7067,7 +7202,7 @@
 </file>
 
 <file path=word/endnotes.xml><?xml version="1.0" encoding="utf-8"?>
-<w:endnotes xmlns:wpc="http://schemas.microsoft.com/office/word/2010/wordprocessingCanvas" xmlns:cx="http://schemas.microsoft.com/office/drawing/2014/chartex" xmlns:cx1="http://schemas.microsoft.com/office/drawing/2015/9/8/chartex" xmlns:cx2="http://schemas.microsoft.com/office/drawing/2015/10/21/chartex" xmlns:cx3="http://schemas.microsoft.com/office/drawing/2016/5/9/chartex" xmlns:cx4="http://schemas.microsoft.com/office/drawing/2016/5/10/chartex" xmlns:cx5="http://schemas.microsoft.com/office/drawing/2016/5/11/chartex" xmlns:cx6="http://schemas.microsoft.com/office/drawing/2016/5/12/chartex" xmlns:cx7="http://schemas.microsoft.com/office/drawing/2016/5/13/chartex" xmlns:cx8="http://schemas.microsoft.com/office/drawing/2016/5/14/chartex" xmlns:mc="http://schemas.openxmlformats.org/markup-compatibility/2006" xmlns:aink="http://schemas.microsoft.com/office/drawing/2016/ink" xmlns:am3d="http://schemas.microsoft.com/office/drawing/2017/model3d" xmlns:o="urn:schemas-microsoft-com:office:office" xmlns:oel="http://schemas.microsoft.com/office/2019/extlst" xmlns:r="http://schemas.openxmlformats.org/officeDocument/2006/relationships" xmlns:m="http://schemas.openxmlformats.org/officeDocument/2006/math" xmlns:v="urn:schemas-microsoft-com:vml" xmlns:wp14="http://schemas.microsoft.com/office/word/2010/wordprocessingDrawing" xmlns:wp="http://schemas.openxmlformats.org/drawingml/2006/wordprocessingDrawing" xmlns:w10="urn:schemas-microsoft-com:office:word" xmlns:w="http://schemas.openxmlformats.org/wordprocessingml/2006/main" xmlns:w14="http://schemas.microsoft.com/office/word/2010/wordml" xmlns:w15="http://schemas.microsoft.com/office/word/2012/wordml" xmlns:w16cex="http://schemas.microsoft.com/office/word/2018/wordml/cex" xmlns:w16cid="http://schemas.microsoft.com/office/word/2016/wordml/cid" xmlns:w16="http://schemas.microsoft.com/office/word/2018/wordml" xmlns:w16du="http://schemas.microsoft.com/office/word/2023/wordml/word16du" xmlns:w16sdtdh="http://schemas.microsoft.com/office/word/2020/wordml/sdtdatahash" xmlns:w16sdtfl="http://schemas.microsoft.com/office/word/2024/wordml/sdtformatlock" xmlns:w16se="http://schemas.microsoft.com/office/word/2015/wordml/symex" xmlns:wpg="http://schemas.microsoft.com/office/word/2010/wordprocessingGroup" xmlns:wpi="http://schemas.microsoft.com/office/word/2010/wordprocessingInk" xmlns:wne="http://schemas.microsoft.com/office/word/2006/wordml" xmlns:wps="http://schemas.microsoft.com/office/word/2010/wordprocessingShape" mc:Ignorable="w14 w15 w16se w16cid w16 w16cex w16sdtdh w16sdtfl w16du wp14">
+<w:endnotes xmlns:wpc="http://schemas.microsoft.com/office/word/2010/wordprocessingCanvas" xmlns:cx="http://schemas.microsoft.com/office/drawing/2014/chartex" xmlns:mc="http://schemas.openxmlformats.org/markup-compatibility/2006" xmlns:o="urn:schemas-microsoft-com:office:office" xmlns:r="http://schemas.openxmlformats.org/officeDocument/2006/relationships" xmlns:m="http://schemas.openxmlformats.org/officeDocument/2006/math" xmlns:v="urn:schemas-microsoft-com:vml" xmlns:wp14="http://schemas.microsoft.com/office/word/2010/wordprocessingDrawing" xmlns:wp="http://schemas.openxmlformats.org/drawingml/2006/wordprocessingDrawing" xmlns:w10="urn:schemas-microsoft-com:office:word" xmlns:w="http://schemas.openxmlformats.org/wordprocessingml/2006/main" xmlns:w14="http://schemas.microsoft.com/office/word/2010/wordml" xmlns:w15="http://schemas.microsoft.com/office/word/2012/wordml" xmlns:w16se="http://schemas.microsoft.com/office/word/2015/wordml/symex" xmlns:wpg="http://schemas.microsoft.com/office/word/2010/wordprocessingGroup" xmlns:wpi="http://schemas.microsoft.com/office/word/2010/wordprocessingInk" xmlns:wne="http://schemas.microsoft.com/office/word/2006/wordml" xmlns:wps="http://schemas.microsoft.com/office/word/2010/wordprocessingShape" mc:Ignorable="w14 w15 w16se wp14">
   <w:endnote w:type="separator" w:id="-1">
     <w:p>
       <w:pPr>
@@ -7092,7 +7227,7 @@
 </file>
 
 <file path=word/footnotes.xml><?xml version="1.0" encoding="utf-8"?>
-<w:footnotes xmlns:wpc="http://schemas.microsoft.com/office/word/2010/wordprocessingCanvas" xmlns:cx="http://schemas.microsoft.com/office/drawing/2014/chartex" xmlns:cx1="http://schemas.microsoft.com/office/drawing/2015/9/8/chartex" xmlns:cx2="http://schemas.microsoft.com/office/drawing/2015/10/21/chartex" xmlns:cx3="http://schemas.microsoft.com/office/drawing/2016/5/9/chartex" xmlns:cx4="http://schemas.microsoft.com/office/drawing/2016/5/10/chartex" xmlns:cx5="http://schemas.microsoft.com/office/drawing/2016/5/11/chartex" xmlns:cx6="http://schemas.microsoft.com/office/drawing/2016/5/12/chartex" xmlns:cx7="http://schemas.microsoft.com/office/drawing/2016/5/13/chartex" xmlns:cx8="http://schemas.microsoft.com/office/drawing/2016/5/14/chartex" xmlns:mc="http://schemas.openxmlformats.org/markup-compatibility/2006" xmlns:aink="http://schemas.microsoft.com/office/drawing/2016/ink" xmlns:am3d="http://schemas.microsoft.com/office/drawing/2017/model3d" xmlns:o="urn:schemas-microsoft-com:office:office" xmlns:oel="http://schemas.microsoft.com/office/2019/extlst" xmlns:r="http://schemas.openxmlformats.org/officeDocument/2006/relationships" xmlns:m="http://schemas.openxmlformats.org/officeDocument/2006/math" xmlns:v="urn:schemas-microsoft-com:vml" xmlns:wp14="http://schemas.microsoft.com/office/word/2010/wordprocessingDrawing" xmlns:wp="http://schemas.openxmlformats.org/drawingml/2006/wordprocessingDrawing" xmlns:w10="urn:schemas-microsoft-com:office:word" xmlns:w="http://schemas.openxmlformats.org/wordprocessingml/2006/main" xmlns:w14="http://schemas.microsoft.com/office/word/2010/wordml" xmlns:w15="http://schemas.microsoft.com/office/word/2012/wordml" xmlns:w16cex="http://schemas.microsoft.com/office/word/2018/wordml/cex" xmlns:w16cid="http://schemas.microsoft.com/office/word/2016/wordml/cid" xmlns:w16="http://schemas.microsoft.com/office/word/2018/wordml" xmlns:w16du="http://schemas.microsoft.com/office/word/2023/wordml/word16du" xmlns:w16sdtdh="http://schemas.microsoft.com/office/word/2020/wordml/sdtdatahash" xmlns:w16sdtfl="http://schemas.microsoft.com/office/word/2024/wordml/sdtformatlock" xmlns:w16se="http://schemas.microsoft.com/office/word/2015/wordml/symex" xmlns:wpg="http://schemas.microsoft.com/office/word/2010/wordprocessingGroup" xmlns:wpi="http://schemas.microsoft.com/office/word/2010/wordprocessingInk" xmlns:wne="http://schemas.microsoft.com/office/word/2006/wordml" xmlns:wps="http://schemas.microsoft.com/office/word/2010/wordprocessingShape" mc:Ignorable="w14 w15 w16se w16cid w16 w16cex w16sdtdh w16sdtfl w16du wp14">
+<w:footnotes xmlns:wpc="http://schemas.microsoft.com/office/word/2010/wordprocessingCanvas" xmlns:cx="http://schemas.microsoft.com/office/drawing/2014/chartex" xmlns:mc="http://schemas.openxmlformats.org/markup-compatibility/2006" xmlns:o="urn:schemas-microsoft-com:office:office" xmlns:r="http://schemas.openxmlformats.org/officeDocument/2006/relationships" xmlns:m="http://schemas.openxmlformats.org/officeDocument/2006/math" xmlns:v="urn:schemas-microsoft-com:vml" xmlns:wp14="http://schemas.microsoft.com/office/word/2010/wordprocessingDrawing" xmlns:wp="http://schemas.openxmlformats.org/drawingml/2006/wordprocessingDrawing" xmlns:w10="urn:schemas-microsoft-com:office:word" xmlns:w="http://schemas.openxmlformats.org/wordprocessingml/2006/main" xmlns:w14="http://schemas.microsoft.com/office/word/2010/wordml" xmlns:w15="http://schemas.microsoft.com/office/word/2012/wordml" xmlns:w16se="http://schemas.microsoft.com/office/word/2015/wordml/symex" xmlns:wpg="http://schemas.microsoft.com/office/word/2010/wordprocessingGroup" xmlns:wpi="http://schemas.microsoft.com/office/word/2010/wordprocessingInk" xmlns:wne="http://schemas.microsoft.com/office/word/2006/wordml" xmlns:wps="http://schemas.microsoft.com/office/word/2010/wordprocessingShape" mc:Ignorable="w14 w15 w16se wp14">
   <w:footnote w:type="separator" w:id="-1">
     <w:p>
       <w:pPr>
@@ -7117,7 +7252,7 @@
 </file>
 
 <file path=word/header1.xml><?xml version="1.0" encoding="utf-8"?>
-<w:hdr xmlns:wpc="http://schemas.microsoft.com/office/word/2010/wordprocessingCanvas" xmlns:cx="http://schemas.microsoft.com/office/drawing/2014/chartex" xmlns:cx1="http://schemas.microsoft.com/office/drawing/2015/9/8/chartex" xmlns:cx2="http://schemas.microsoft.com/office/drawing/2015/10/21/chartex" xmlns:cx3="http://schemas.microsoft.com/office/drawing/2016/5/9/chartex" xmlns:cx4="http://schemas.microsoft.com/office/drawing/2016/5/10/chartex" xmlns:cx5="http://schemas.microsoft.com/office/drawing/2016/5/11/chartex" xmlns:cx6="http://schemas.microsoft.com/office/drawing/2016/5/12/chartex" xmlns:cx7="http://schemas.microsoft.com/office/drawing/2016/5/13/chartex" xmlns:cx8="http://schemas.microsoft.com/office/drawing/2016/5/14/chartex" xmlns:mc="http://schemas.openxmlformats.org/markup-compatibility/2006" xmlns:aink="http://schemas.microsoft.com/office/drawing/2016/ink" xmlns:am3d="http://schemas.microsoft.com/office/drawing/2017/model3d" xmlns:o="urn:schemas-microsoft-com:office:office" xmlns:oel="http://schemas.microsoft.com/office/2019/extlst" xmlns:r="http://schemas.openxmlformats.org/officeDocument/2006/relationships" xmlns:m="http://schemas.openxmlformats.org/officeDocument/2006/math" xmlns:v="urn:schemas-microsoft-com:vml" xmlns:wp14="http://schemas.microsoft.com/office/word/2010/wordprocessingDrawing" xmlns:wp="http://schemas.openxmlformats.org/drawingml/2006/wordprocessingDrawing" xmlns:w10="urn:schemas-microsoft-com:office:word" xmlns:w="http://schemas.openxmlformats.org/wordprocessingml/2006/main" xmlns:w14="http://schemas.microsoft.com/office/word/2010/wordml" xmlns:w15="http://schemas.microsoft.com/office/word/2012/wordml" xmlns:w16cex="http://schemas.microsoft.com/office/word/2018/wordml/cex" xmlns:w16cid="http://schemas.microsoft.com/office/word/2016/wordml/cid" xmlns:w16="http://schemas.microsoft.com/office/word/2018/wordml" xmlns:w16du="http://schemas.microsoft.com/office/word/2023/wordml/word16du" xmlns:w16sdtdh="http://schemas.microsoft.com/office/word/2020/wordml/sdtdatahash" xmlns:w16sdtfl="http://schemas.microsoft.com/office/word/2024/wordml/sdtformatlock" xmlns:w16se="http://schemas.microsoft.com/office/word/2015/wordml/symex" xmlns:wpg="http://schemas.microsoft.com/office/word/2010/wordprocessingGroup" xmlns:wpi="http://schemas.microsoft.com/office/word/2010/wordprocessingInk" xmlns:wne="http://schemas.microsoft.com/office/word/2006/wordml" xmlns:wps="http://schemas.microsoft.com/office/word/2010/wordprocessingShape" mc:Ignorable="w14 w15 w16se w16cid w16 w16cex w16sdtdh w16sdtfl w16du wp14">
+<w:hdr xmlns:wpc="http://schemas.microsoft.com/office/word/2010/wordprocessingCanvas" xmlns:cx="http://schemas.microsoft.com/office/drawing/2014/chartex" xmlns:mc="http://schemas.openxmlformats.org/markup-compatibility/2006" xmlns:o="urn:schemas-microsoft-com:office:office" xmlns:r="http://schemas.openxmlformats.org/officeDocument/2006/relationships" xmlns:m="http://schemas.openxmlformats.org/officeDocument/2006/math" xmlns:v="urn:schemas-microsoft-com:vml" xmlns:wp14="http://schemas.microsoft.com/office/word/2010/wordprocessingDrawing" xmlns:wp="http://schemas.openxmlformats.org/drawingml/2006/wordprocessingDrawing" xmlns:w10="urn:schemas-microsoft-com:office:word" xmlns:w="http://schemas.openxmlformats.org/wordprocessingml/2006/main" xmlns:w14="http://schemas.microsoft.com/office/word/2010/wordml" xmlns:w15="http://schemas.microsoft.com/office/word/2012/wordml" xmlns:w16se="http://schemas.microsoft.com/office/word/2015/wordml/symex" xmlns:wpg="http://schemas.microsoft.com/office/word/2010/wordprocessingGroup" xmlns:wpi="http://schemas.microsoft.com/office/word/2010/wordprocessingInk" xmlns:wne="http://schemas.microsoft.com/office/word/2006/wordml" xmlns:wps="http://schemas.microsoft.com/office/word/2010/wordprocessingShape" mc:Ignorable="w14 w15 w16se wp14">
   <w:sdt>
     <w:sdtPr>
       <w:rPr>
@@ -7129,6 +7264,11 @@
         <w:docPartUnique/>
       </w:docPartObj>
     </w:sdtPr>
+    <w:sdtEndPr>
+      <w:rPr>
+        <w:rStyle w:val="a8"/>
+      </w:rPr>
+    </w:sdtEndPr>
     <w:sdtContent>
       <w:p>
         <w:pPr>
@@ -7154,12 +7294,6 @@
           <w:rPr>
             <w:rStyle w:val="a8"/>
           </w:rPr>
-          <w:fldChar w:fldCharType="separate"/>
-        </w:r>
-        <w:r>
-          <w:rPr>
-            <w:rStyle w:val="a8"/>
-          </w:rPr>
           <w:fldChar w:fldCharType="end"/>
         </w:r>
       </w:p>
@@ -7174,7 +7308,7 @@
 </file>
 
 <file path=word/header2.xml><?xml version="1.0" encoding="utf-8"?>
-<w:hdr xmlns:wpc="http://schemas.microsoft.com/office/word/2010/wordprocessingCanvas" xmlns:cx="http://schemas.microsoft.com/office/drawing/2014/chartex" xmlns:cx1="http://schemas.microsoft.com/office/drawing/2015/9/8/chartex" xmlns:cx2="http://schemas.microsoft.com/office/drawing/2015/10/21/chartex" xmlns:cx3="http://schemas.microsoft.com/office/drawing/2016/5/9/chartex" xmlns:cx4="http://schemas.microsoft.com/office/drawing/2016/5/10/chartex" xmlns:cx5="http://schemas.microsoft.com/office/drawing/2016/5/11/chartex" xmlns:cx6="http://schemas.microsoft.com/office/drawing/2016/5/12/chartex" xmlns:cx7="http://schemas.microsoft.com/office/drawing/2016/5/13/chartex" xmlns:cx8="http://schemas.microsoft.com/office/drawing/2016/5/14/chartex" xmlns:mc="http://schemas.openxmlformats.org/markup-compatibility/2006" xmlns:aink="http://schemas.microsoft.com/office/drawing/2016/ink" xmlns:am3d="http://schemas.microsoft.com/office/drawing/2017/model3d" xmlns:o="urn:schemas-microsoft-com:office:office" xmlns:oel="http://schemas.microsoft.com/office/2019/extlst" xmlns:r="http://schemas.openxmlformats.org/officeDocument/2006/relationships" xmlns:m="http://schemas.openxmlformats.org/officeDocument/2006/math" xmlns:v="urn:schemas-microsoft-com:vml" xmlns:wp14="http://schemas.microsoft.com/office/word/2010/wordprocessingDrawing" xmlns:wp="http://schemas.openxmlformats.org/drawingml/2006/wordprocessingDrawing" xmlns:w10="urn:schemas-microsoft-com:office:word" xmlns:w="http://schemas.openxmlformats.org/wordprocessingml/2006/main" xmlns:w14="http://schemas.microsoft.com/office/word/2010/wordml" xmlns:w15="http://schemas.microsoft.com/office/word/2012/wordml" xmlns:w16cex="http://schemas.microsoft.com/office/word/2018/wordml/cex" xmlns:w16cid="http://schemas.microsoft.com/office/word/2016/wordml/cid" xmlns:w16="http://schemas.microsoft.com/office/word/2018/wordml" xmlns:w16du="http://schemas.microsoft.com/office/word/2023/wordml/word16du" xmlns:w16sdtdh="http://schemas.microsoft.com/office/word/2020/wordml/sdtdatahash" xmlns:w16sdtfl="http://schemas.microsoft.com/office/word/2024/wordml/sdtformatlock" xmlns:w16se="http://schemas.microsoft.com/office/word/2015/wordml/symex" xmlns:wpg="http://schemas.microsoft.com/office/word/2010/wordprocessingGroup" xmlns:wpi="http://schemas.microsoft.com/office/word/2010/wordprocessingInk" xmlns:wne="http://schemas.microsoft.com/office/word/2006/wordml" xmlns:wps="http://schemas.microsoft.com/office/word/2010/wordprocessingShape" mc:Ignorable="w14 w15 w16se w16cid w16 w16cex w16sdtdh w16sdtfl w16du wp14">
+<w:hdr xmlns:wpc="http://schemas.microsoft.com/office/word/2010/wordprocessingCanvas" xmlns:cx="http://schemas.microsoft.com/office/drawing/2014/chartex" xmlns:mc="http://schemas.openxmlformats.org/markup-compatibility/2006" xmlns:o="urn:schemas-microsoft-com:office:office" xmlns:r="http://schemas.openxmlformats.org/officeDocument/2006/relationships" xmlns:m="http://schemas.openxmlformats.org/officeDocument/2006/math" xmlns:v="urn:schemas-microsoft-com:vml" xmlns:wp14="http://schemas.microsoft.com/office/word/2010/wordprocessingDrawing" xmlns:wp="http://schemas.openxmlformats.org/drawingml/2006/wordprocessingDrawing" xmlns:w10="urn:schemas-microsoft-com:office:word" xmlns:w="http://schemas.openxmlformats.org/wordprocessingml/2006/main" xmlns:w14="http://schemas.microsoft.com/office/word/2010/wordml" xmlns:w15="http://schemas.microsoft.com/office/word/2012/wordml" xmlns:w16se="http://schemas.microsoft.com/office/word/2015/wordml/symex" xmlns:wpg="http://schemas.microsoft.com/office/word/2010/wordprocessingGroup" xmlns:wpi="http://schemas.microsoft.com/office/word/2010/wordprocessingInk" xmlns:wne="http://schemas.microsoft.com/office/word/2006/wordml" xmlns:wps="http://schemas.microsoft.com/office/word/2010/wordprocessingShape" mc:Ignorable="w14 w15 w16se wp14">
   <w:sdt>
     <w:sdtPr>
       <w:rPr>
@@ -7186,6 +7320,11 @@
         <w:docPartUnique/>
       </w:docPartObj>
     </w:sdtPr>
+    <w:sdtEndPr>
+      <w:rPr>
+        <w:rStyle w:val="a8"/>
+      </w:rPr>
+    </w:sdtEndPr>
     <w:sdtContent>
       <w:p>
         <w:pPr>
@@ -7218,7 +7357,7 @@
             <w:rStyle w:val="a8"/>
             <w:noProof/>
           </w:rPr>
-          <w:t>12</w:t>
+          <w:t>6</w:t>
         </w:r>
         <w:r>
           <w:rPr>
@@ -7238,7 +7377,7 @@
 </file>
 
 <file path=word/numbering.xml><?xml version="1.0" encoding="utf-8"?>
-<w:numbering xmlns:wpc="http://schemas.microsoft.com/office/word/2010/wordprocessingCanvas" xmlns:cx="http://schemas.microsoft.com/office/drawing/2014/chartex" xmlns:cx1="http://schemas.microsoft.com/office/drawing/2015/9/8/chartex" xmlns:cx2="http://schemas.microsoft.com/office/drawing/2015/10/21/chartex" xmlns:cx3="http://schemas.microsoft.com/office/drawing/2016/5/9/chartex" xmlns:cx4="http://schemas.microsoft.com/office/drawing/2016/5/10/chartex" xmlns:cx5="http://schemas.microsoft.com/office/drawing/2016/5/11/chartex" xmlns:cx6="http://schemas.microsoft.com/office/drawing/2016/5/12/chartex" xmlns:cx7="http://schemas.microsoft.com/office/drawing/2016/5/13/chartex" xmlns:cx8="http://schemas.microsoft.com/office/drawing/2016/5/14/chartex" xmlns:mc="http://schemas.openxmlformats.org/markup-compatibility/2006" xmlns:aink="http://schemas.microsoft.com/office/drawing/2016/ink" xmlns:am3d="http://schemas.microsoft.com/office/drawing/2017/model3d" xmlns:o="urn:schemas-microsoft-com:office:office" xmlns:oel="http://schemas.microsoft.com/office/2019/extlst" xmlns:r="http://schemas.openxmlformats.org/officeDocument/2006/relationships" xmlns:m="http://schemas.openxmlformats.org/officeDocument/2006/math" xmlns:v="urn:schemas-microsoft-com:vml" xmlns:wp14="http://schemas.microsoft.com/office/word/2010/wordprocessingDrawing" xmlns:wp="http://schemas.openxmlformats.org/drawingml/2006/wordprocessingDrawing" xmlns:w10="urn:schemas-microsoft-com:office:word" xmlns:w="http://schemas.openxmlformats.org/wordprocessingml/2006/main" xmlns:w14="http://schemas.microsoft.com/office/word/2010/wordml" xmlns:w15="http://schemas.microsoft.com/office/word/2012/wordml" xmlns:w16cex="http://schemas.microsoft.com/office/word/2018/wordml/cex" xmlns:w16cid="http://schemas.microsoft.com/office/word/2016/wordml/cid" xmlns:w16="http://schemas.microsoft.com/office/word/2018/wordml" xmlns:w16du="http://schemas.microsoft.com/office/word/2023/wordml/word16du" xmlns:w16sdtdh="http://schemas.microsoft.com/office/word/2020/wordml/sdtdatahash" xmlns:w16sdtfl="http://schemas.microsoft.com/office/word/2024/wordml/sdtformatlock" xmlns:w16se="http://schemas.microsoft.com/office/word/2015/wordml/symex" xmlns:wpg="http://schemas.microsoft.com/office/word/2010/wordprocessingGroup" xmlns:wpi="http://schemas.microsoft.com/office/word/2010/wordprocessingInk" xmlns:wne="http://schemas.microsoft.com/office/word/2006/wordml" xmlns:wps="http://schemas.microsoft.com/office/word/2010/wordprocessingShape" mc:Ignorable="w14 w15 w16se w16cid w16 w16cex w16sdtdh w16sdtfl w16du wp14">
+<w:numbering xmlns:wpc="http://schemas.microsoft.com/office/word/2010/wordprocessingCanvas" xmlns:cx="http://schemas.microsoft.com/office/drawing/2014/chartex" xmlns:mc="http://schemas.openxmlformats.org/markup-compatibility/2006" xmlns:o="urn:schemas-microsoft-com:office:office" xmlns:r="http://schemas.openxmlformats.org/officeDocument/2006/relationships" xmlns:m="http://schemas.openxmlformats.org/officeDocument/2006/math" xmlns:v="urn:schemas-microsoft-com:vml" xmlns:wp14="http://schemas.microsoft.com/office/word/2010/wordprocessingDrawing" xmlns:wp="http://schemas.openxmlformats.org/drawingml/2006/wordprocessingDrawing" xmlns:w10="urn:schemas-microsoft-com:office:word" xmlns:w="http://schemas.openxmlformats.org/wordprocessingml/2006/main" xmlns:w14="http://schemas.microsoft.com/office/word/2010/wordml" xmlns:w15="http://schemas.microsoft.com/office/word/2012/wordml" xmlns:w16se="http://schemas.microsoft.com/office/word/2015/wordml/symex" xmlns:wpg="http://schemas.microsoft.com/office/word/2010/wordprocessingGroup" xmlns:wpi="http://schemas.microsoft.com/office/word/2010/wordprocessingInk" xmlns:wne="http://schemas.microsoft.com/office/word/2006/wordml" xmlns:wps="http://schemas.microsoft.com/office/word/2010/wordprocessingShape" mc:Ignorable="w14 w15 w16se wp14">
   <w:abstractNum w:abstractNumId="0" w15:restartNumberingAfterBreak="0">
     <w:nsid w:val="03DB1D60"/>
     <w:multiLevelType w:val="hybridMultilevel"/>
@@ -12535,161 +12674,161 @@
       </w:pPr>
     </w:lvl>
   </w:abstractNum>
-  <w:num w:numId="1" w16cid:durableId="572856688">
+  <w:num w:numId="1">
     <w:abstractNumId w:val="2"/>
   </w:num>
-  <w:num w:numId="2" w16cid:durableId="1109159394">
+  <w:num w:numId="2">
     <w:abstractNumId w:val="39"/>
   </w:num>
-  <w:num w:numId="3" w16cid:durableId="879362865">
+  <w:num w:numId="3">
     <w:abstractNumId w:val="10"/>
   </w:num>
-  <w:num w:numId="4" w16cid:durableId="332731172">
+  <w:num w:numId="4">
     <w:abstractNumId w:val="44"/>
   </w:num>
-  <w:num w:numId="5" w16cid:durableId="912544034">
+  <w:num w:numId="5">
     <w:abstractNumId w:val="27"/>
   </w:num>
-  <w:num w:numId="6" w16cid:durableId="1687097188">
+  <w:num w:numId="6">
     <w:abstractNumId w:val="34"/>
   </w:num>
-  <w:num w:numId="7" w16cid:durableId="1276400943">
+  <w:num w:numId="7">
     <w:abstractNumId w:val="18"/>
   </w:num>
-  <w:num w:numId="8" w16cid:durableId="1997801249">
+  <w:num w:numId="8">
     <w:abstractNumId w:val="33"/>
   </w:num>
-  <w:num w:numId="9" w16cid:durableId="854536996">
+  <w:num w:numId="9">
     <w:abstractNumId w:val="20"/>
   </w:num>
-  <w:num w:numId="10" w16cid:durableId="605429074">
+  <w:num w:numId="10">
     <w:abstractNumId w:val="32"/>
   </w:num>
-  <w:num w:numId="11" w16cid:durableId="790172539">
+  <w:num w:numId="11">
     <w:abstractNumId w:val="3"/>
   </w:num>
-  <w:num w:numId="12" w16cid:durableId="1954820551">
+  <w:num w:numId="12">
     <w:abstractNumId w:val="46"/>
   </w:num>
-  <w:num w:numId="13" w16cid:durableId="778068695">
+  <w:num w:numId="13">
     <w:abstractNumId w:val="0"/>
   </w:num>
-  <w:num w:numId="14" w16cid:durableId="529222724">
+  <w:num w:numId="14">
     <w:abstractNumId w:val="14"/>
   </w:num>
-  <w:num w:numId="15" w16cid:durableId="1706565734">
+  <w:num w:numId="15">
     <w:abstractNumId w:val="7"/>
   </w:num>
-  <w:num w:numId="16" w16cid:durableId="450982128">
+  <w:num w:numId="16">
     <w:abstractNumId w:val="25"/>
   </w:num>
-  <w:num w:numId="17" w16cid:durableId="1609117927">
+  <w:num w:numId="17">
     <w:abstractNumId w:val="1"/>
   </w:num>
-  <w:num w:numId="18" w16cid:durableId="1942762195">
+  <w:num w:numId="18">
     <w:abstractNumId w:val="43"/>
   </w:num>
-  <w:num w:numId="19" w16cid:durableId="1055006374">
+  <w:num w:numId="19">
     <w:abstractNumId w:val="30"/>
   </w:num>
-  <w:num w:numId="20" w16cid:durableId="821042775">
+  <w:num w:numId="20">
     <w:abstractNumId w:val="37"/>
   </w:num>
-  <w:num w:numId="21" w16cid:durableId="12340826">
+  <w:num w:numId="21">
     <w:abstractNumId w:val="35"/>
   </w:num>
-  <w:num w:numId="22" w16cid:durableId="263658826">
+  <w:num w:numId="22">
     <w:abstractNumId w:val="29"/>
   </w:num>
-  <w:num w:numId="23" w16cid:durableId="1407148301">
+  <w:num w:numId="23">
     <w:abstractNumId w:val="23"/>
   </w:num>
-  <w:num w:numId="24" w16cid:durableId="1892811276">
+  <w:num w:numId="24">
     <w:abstractNumId w:val="4"/>
   </w:num>
-  <w:num w:numId="25" w16cid:durableId="827401176">
+  <w:num w:numId="25">
     <w:abstractNumId w:val="15"/>
   </w:num>
-  <w:num w:numId="26" w16cid:durableId="1688025477">
+  <w:num w:numId="26">
     <w:abstractNumId w:val="26"/>
   </w:num>
-  <w:num w:numId="27" w16cid:durableId="718356960">
+  <w:num w:numId="27">
     <w:abstractNumId w:val="22"/>
   </w:num>
-  <w:num w:numId="28" w16cid:durableId="1970042047">
+  <w:num w:numId="28">
     <w:abstractNumId w:val="6"/>
   </w:num>
-  <w:num w:numId="29" w16cid:durableId="1809322131">
+  <w:num w:numId="29">
     <w:abstractNumId w:val="47"/>
   </w:num>
-  <w:num w:numId="30" w16cid:durableId="1702634595">
+  <w:num w:numId="30">
     <w:abstractNumId w:val="48"/>
   </w:num>
-  <w:num w:numId="31" w16cid:durableId="979848886">
+  <w:num w:numId="31">
     <w:abstractNumId w:val="17"/>
   </w:num>
-  <w:num w:numId="32" w16cid:durableId="601185251">
+  <w:num w:numId="32">
     <w:abstractNumId w:val="31"/>
   </w:num>
-  <w:num w:numId="33" w16cid:durableId="986669067">
+  <w:num w:numId="33">
     <w:abstractNumId w:val="49"/>
   </w:num>
-  <w:num w:numId="34" w16cid:durableId="950015508">
+  <w:num w:numId="34">
     <w:abstractNumId w:val="5"/>
   </w:num>
-  <w:num w:numId="35" w16cid:durableId="1312639555">
+  <w:num w:numId="35">
     <w:abstractNumId w:val="36"/>
   </w:num>
-  <w:num w:numId="36" w16cid:durableId="180825581">
+  <w:num w:numId="36">
     <w:abstractNumId w:val="12"/>
   </w:num>
-  <w:num w:numId="37" w16cid:durableId="1185287166">
+  <w:num w:numId="37">
     <w:abstractNumId w:val="19"/>
   </w:num>
-  <w:num w:numId="38" w16cid:durableId="1399980617">
+  <w:num w:numId="38">
     <w:abstractNumId w:val="40"/>
   </w:num>
-  <w:num w:numId="39" w16cid:durableId="82530539">
+  <w:num w:numId="39">
     <w:abstractNumId w:val="45"/>
   </w:num>
-  <w:num w:numId="40" w16cid:durableId="450363950">
+  <w:num w:numId="40">
     <w:abstractNumId w:val="41"/>
   </w:num>
-  <w:num w:numId="41" w16cid:durableId="379982039">
+  <w:num w:numId="41">
     <w:abstractNumId w:val="13"/>
   </w:num>
-  <w:num w:numId="42" w16cid:durableId="662465929">
+  <w:num w:numId="42">
     <w:abstractNumId w:val="38"/>
   </w:num>
-  <w:num w:numId="43" w16cid:durableId="468864431">
+  <w:num w:numId="43">
     <w:abstractNumId w:val="21"/>
   </w:num>
-  <w:num w:numId="44" w16cid:durableId="752555148">
+  <w:num w:numId="44">
     <w:abstractNumId w:val="24"/>
   </w:num>
-  <w:num w:numId="45" w16cid:durableId="942497485">
+  <w:num w:numId="45">
     <w:abstractNumId w:val="11"/>
   </w:num>
-  <w:num w:numId="46" w16cid:durableId="1632709285">
+  <w:num w:numId="46">
     <w:abstractNumId w:val="42"/>
   </w:num>
-  <w:num w:numId="47" w16cid:durableId="952400233">
+  <w:num w:numId="47">
     <w:abstractNumId w:val="16"/>
   </w:num>
-  <w:num w:numId="48" w16cid:durableId="590702413">
+  <w:num w:numId="48">
     <w:abstractNumId w:val="28"/>
   </w:num>
-  <w:num w:numId="49" w16cid:durableId="332802267">
+  <w:num w:numId="49">
     <w:abstractNumId w:val="8"/>
   </w:num>
-  <w:num w:numId="50" w16cid:durableId="1682270254">
+  <w:num w:numId="50">
     <w:abstractNumId w:val="9"/>
   </w:num>
 </w:numbering>
 </file>
 
 <file path=word/styles.xml><?xml version="1.0" encoding="utf-8"?>
-<w:styles xmlns:mc="http://schemas.openxmlformats.org/markup-compatibility/2006" xmlns:r="http://schemas.openxmlformats.org/officeDocument/2006/relationships" xmlns:w="http://schemas.openxmlformats.org/wordprocessingml/2006/main" xmlns:w14="http://schemas.microsoft.com/office/word/2010/wordml" xmlns:w15="http://schemas.microsoft.com/office/word/2012/wordml" xmlns:w16cex="http://schemas.microsoft.com/office/word/2018/wordml/cex" xmlns:w16cid="http://schemas.microsoft.com/office/word/2016/wordml/cid" xmlns:w16="http://schemas.microsoft.com/office/word/2018/wordml" xmlns:w16du="http://schemas.microsoft.com/office/word/2023/wordml/word16du" xmlns:w16sdtdh="http://schemas.microsoft.com/office/word/2020/wordml/sdtdatahash" xmlns:w16sdtfl="http://schemas.microsoft.com/office/word/2024/wordml/sdtformatlock" xmlns:w16se="http://schemas.microsoft.com/office/word/2015/wordml/symex" mc:Ignorable="w14 w15 w16se w16cid w16 w16cex w16sdtdh w16sdtfl w16du">
+<w:styles xmlns:mc="http://schemas.openxmlformats.org/markup-compatibility/2006" xmlns:r="http://schemas.openxmlformats.org/officeDocument/2006/relationships" xmlns:w="http://schemas.openxmlformats.org/wordprocessingml/2006/main" xmlns:w14="http://schemas.microsoft.com/office/word/2010/wordml" xmlns:w15="http://schemas.microsoft.com/office/word/2012/wordml" xmlns:w16se="http://schemas.microsoft.com/office/word/2015/wordml/symex" mc:Ignorable="w14 w15 w16se">
   <w:docDefaults>
     <w:rPrDefault>
       <w:rPr>
@@ -12705,7 +12844,7 @@
       </w:pPr>
     </w:pPrDefault>
   </w:docDefaults>
-  <w:latentStyles w:defLockedState="0" w:defUIPriority="99" w:defSemiHidden="0" w:defUnhideWhenUsed="0" w:defQFormat="0" w:count="376">
+  <w:latentStyles w:defLockedState="0" w:defUIPriority="99" w:defSemiHidden="0" w:defUnhideWhenUsed="0" w:defQFormat="0" w:count="371">
     <w:lsdException w:name="Normal" w:uiPriority="0" w:qFormat="1"/>
     <w:lsdException w:name="heading 1" w:uiPriority="9" w:qFormat="1"/>
     <w:lsdException w:name="heading 2" w:semiHidden="1" w:uiPriority="9" w:unhideWhenUsed="1" w:qFormat="1"/>
@@ -13077,11 +13216,6 @@
     <w:lsdException w:name="List Table 5 Dark Accent 6" w:uiPriority="50"/>
     <w:lsdException w:name="List Table 6 Colorful Accent 6" w:uiPriority="51"/>
     <w:lsdException w:name="List Table 7 Colorful Accent 6" w:uiPriority="52"/>
-    <w:lsdException w:name="Mention" w:semiHidden="1" w:unhideWhenUsed="1"/>
-    <w:lsdException w:name="Smart Hyperlink" w:semiHidden="1" w:unhideWhenUsed="1"/>
-    <w:lsdException w:name="Hashtag" w:semiHidden="1" w:unhideWhenUsed="1"/>
-    <w:lsdException w:name="Unresolved Mention" w:semiHidden="1" w:unhideWhenUsed="1"/>
-    <w:lsdException w:name="Smart Link" w:semiHidden="1" w:unhideWhenUsed="1"/>
   </w:latentStyles>
   <w:style w:type="paragraph" w:default="1" w:styleId="a">
     <w:name w:val="Normal"/>
@@ -13220,7 +13354,7 @@
       <w:color w:val="000000"/>
       <w:sz w:val="18"/>
       <w:szCs w:val="18"/>
-      <w:lang w:val="ru-US" w:eastAsia="ru-RU"/>
+      <w:lang w:eastAsia="ru-RU"/>
     </w:rPr>
   </w:style>
   <w:style w:type="character" w:customStyle="1" w:styleId="s1">
@@ -13517,7 +13651,7 @@
 </file>
 
 <file path=customXml/itemProps1.xml><?xml version="1.0" encoding="utf-8"?>
-<ds:datastoreItem xmlns:ds="http://schemas.openxmlformats.org/officeDocument/2006/customXml" ds:itemID="{6E9AF44D-4131-4BA2-9693-4B513A3D42A1}">
+<ds:datastoreItem xmlns:ds="http://schemas.openxmlformats.org/officeDocument/2006/customXml" ds:itemID="{23E6597E-7077-488B-8D1B-1BA7D084CF67}">
   <ds:schemaRefs>
     <ds:schemaRef ds:uri="http://schemas.openxmlformats.org/officeDocument/2006/bibliography"/>
   </ds:schemaRefs>

</xml_diff>

<commit_message>
vault backup: 2025-11-25 04:11:55
</commit_message>
<xml_diff>
--- a/Курс 3/Математические основы ИИ/Лабораторные/01. Модели и моделирование/Задание 1.docx
+++ b/Курс 3/Математические основы ИИ/Лабораторные/01. Модели и моделирование/Задание 1.docx
@@ -1,6 +1,6 @@
 
 <file path=word/document.xml><?xml version="1.0" encoding="utf-8"?>
-<w:document xmlns:wpc="http://schemas.microsoft.com/office/word/2010/wordprocessingCanvas" xmlns:cx="http://schemas.microsoft.com/office/drawing/2014/chartex" xmlns:mc="http://schemas.openxmlformats.org/markup-compatibility/2006" xmlns:o="urn:schemas-microsoft-com:office:office" xmlns:r="http://schemas.openxmlformats.org/officeDocument/2006/relationships" xmlns:m="http://schemas.openxmlformats.org/officeDocument/2006/math" xmlns:v="urn:schemas-microsoft-com:vml" xmlns:wp14="http://schemas.microsoft.com/office/word/2010/wordprocessingDrawing" xmlns:wp="http://schemas.openxmlformats.org/drawingml/2006/wordprocessingDrawing" xmlns:w10="urn:schemas-microsoft-com:office:word" xmlns:w="http://schemas.openxmlformats.org/wordprocessingml/2006/main" xmlns:w14="http://schemas.microsoft.com/office/word/2010/wordml" xmlns:w15="http://schemas.microsoft.com/office/word/2012/wordml" xmlns:w16se="http://schemas.microsoft.com/office/word/2015/wordml/symex" xmlns:wpg="http://schemas.microsoft.com/office/word/2010/wordprocessingGroup" xmlns:wpi="http://schemas.microsoft.com/office/word/2010/wordprocessingInk" xmlns:wne="http://schemas.microsoft.com/office/word/2006/wordml" xmlns:wps="http://schemas.microsoft.com/office/word/2010/wordprocessingShape" mc:Ignorable="w14 w15 w16se wp14">
+<w:document xmlns:wpc="http://schemas.microsoft.com/office/word/2010/wordprocessingCanvas" xmlns:cx="http://schemas.microsoft.com/office/drawing/2014/chartex" xmlns:cx1="http://schemas.microsoft.com/office/drawing/2015/9/8/chartex" xmlns:cx2="http://schemas.microsoft.com/office/drawing/2015/10/21/chartex" xmlns:cx3="http://schemas.microsoft.com/office/drawing/2016/5/9/chartex" xmlns:cx4="http://schemas.microsoft.com/office/drawing/2016/5/10/chartex" xmlns:cx5="http://schemas.microsoft.com/office/drawing/2016/5/11/chartex" xmlns:cx6="http://schemas.microsoft.com/office/drawing/2016/5/12/chartex" xmlns:cx7="http://schemas.microsoft.com/office/drawing/2016/5/13/chartex" xmlns:cx8="http://schemas.microsoft.com/office/drawing/2016/5/14/chartex" xmlns:mc="http://schemas.openxmlformats.org/markup-compatibility/2006" xmlns:aink="http://schemas.microsoft.com/office/drawing/2016/ink" xmlns:am3d="http://schemas.microsoft.com/office/drawing/2017/model3d" xmlns:o="urn:schemas-microsoft-com:office:office" xmlns:oel="http://schemas.microsoft.com/office/2019/extlst" xmlns:r="http://schemas.openxmlformats.org/officeDocument/2006/relationships" xmlns:m="http://schemas.openxmlformats.org/officeDocument/2006/math" xmlns:v="urn:schemas-microsoft-com:vml" xmlns:wp14="http://schemas.microsoft.com/office/word/2010/wordprocessingDrawing" xmlns:wp="http://schemas.openxmlformats.org/drawingml/2006/wordprocessingDrawing" xmlns:w10="urn:schemas-microsoft-com:office:word" xmlns:w="http://schemas.openxmlformats.org/wordprocessingml/2006/main" xmlns:w14="http://schemas.microsoft.com/office/word/2010/wordml" xmlns:w15="http://schemas.microsoft.com/office/word/2012/wordml" xmlns:w16cex="http://schemas.microsoft.com/office/word/2018/wordml/cex" xmlns:w16cid="http://schemas.microsoft.com/office/word/2016/wordml/cid" xmlns:w16="http://schemas.microsoft.com/office/word/2018/wordml" xmlns:w16du="http://schemas.microsoft.com/office/word/2023/wordml/word16du" xmlns:w16sdtdh="http://schemas.microsoft.com/office/word/2020/wordml/sdtdatahash" xmlns:w16sdtfl="http://schemas.microsoft.com/office/word/2024/wordml/sdtformatlock" xmlns:w16se="http://schemas.microsoft.com/office/word/2015/wordml/symex" xmlns:wpg="http://schemas.microsoft.com/office/word/2010/wordprocessingGroup" xmlns:wpi="http://schemas.microsoft.com/office/word/2010/wordprocessingInk" xmlns:wne="http://schemas.microsoft.com/office/word/2006/wordml" xmlns:wps="http://schemas.microsoft.com/office/word/2010/wordprocessingShape" mc:Ignorable="w14 w15 w16se w16cid w16 w16cex w16sdtdh w16sdtfl w16du wp14">
   <w:body>
     <w:p>
       <w:pPr>
@@ -1918,8 +1918,6 @@
         </w:rPr>
         <w:t>PC</w:t>
       </w:r>
-      <w:bookmarkStart w:id="0" w:name="_GoBack"/>
-      <w:bookmarkEnd w:id="0"/>
       <w:r>
         <w:rPr>
           <w:szCs w:val="28"/>
@@ -1949,7 +1947,125 @@
         <w:rPr>
           <w:szCs w:val="28"/>
         </w:rPr>
-        <w:t>Выход: уверенность, мотивация, возможность сосредоточиться на обучении.</w:t>
+        <w:t xml:space="preserve">Выход: </w:t>
+      </w:r>
+      <m:oMath>
+        <m:sSub>
+          <m:sSubPr>
+            <m:ctrlPr>
+              <w:rPr>
+                <w:rFonts w:ascii="Cambria Math" w:hAnsi="Cambria Math"/>
+                <w:i/>
+                <w:color w:val="000000" w:themeColor="text1"/>
+                <w:szCs w:val="28"/>
+                <w:lang w:val="en-US"/>
+              </w:rPr>
+            </m:ctrlPr>
+          </m:sSubPr>
+          <m:e>
+            <m:r>
+              <w:rPr>
+                <w:rFonts w:ascii="Cambria Math" w:hAnsi="Cambria Math"/>
+                <w:color w:val="000000" w:themeColor="text1"/>
+                <w:szCs w:val="28"/>
+                <w:lang w:val="en-US"/>
+              </w:rPr>
+              <m:t>X</m:t>
+            </m:r>
+          </m:e>
+          <m:sub>
+            <m:r>
+              <w:rPr>
+                <w:rFonts w:ascii="Cambria Math" w:hAnsi="Cambria Math"/>
+                <w:color w:val="000000" w:themeColor="text1"/>
+                <w:szCs w:val="28"/>
+              </w:rPr>
+              <m:t>1</m:t>
+            </m:r>
+          </m:sub>
+        </m:sSub>
+        <m:r>
+          <w:rPr>
+            <w:rFonts w:ascii="Cambria Math" w:hAnsi="Cambria Math"/>
+            <w:color w:val="000000" w:themeColor="text1"/>
+            <w:szCs w:val="28"/>
+          </w:rPr>
+          <m:t>=</m:t>
+        </m:r>
+        <m:r>
+          <w:rPr>
+            <w:rFonts w:ascii="Cambria Math" w:hAnsi="Cambria Math"/>
+            <w:color w:val="000000" w:themeColor="text1"/>
+            <w:szCs w:val="28"/>
+          </w:rPr>
+          <m:t>-</m:t>
+        </m:r>
+        <m:r>
+          <w:rPr>
+            <w:rFonts w:ascii="Cambria Math" w:hAnsi="Cambria Math"/>
+            <w:color w:val="000000" w:themeColor="text1"/>
+            <w:szCs w:val="28"/>
+            <w:lang w:val="en-US"/>
+          </w:rPr>
+          <m:t>PE</m:t>
+        </m:r>
+        <m:r>
+          <w:rPr>
+            <w:rFonts w:ascii="Cambria Math" w:hAnsi="Cambria Math"/>
+            <w:color w:val="000000" w:themeColor="text1"/>
+            <w:szCs w:val="28"/>
+          </w:rPr>
+          <m:t>*</m:t>
+        </m:r>
+        <m:r>
+          <w:rPr>
+            <w:rFonts w:ascii="Cambria Math" w:hAnsi="Cambria Math"/>
+            <w:color w:val="000000" w:themeColor="text1"/>
+            <w:szCs w:val="28"/>
+            <w:lang w:val="en-US"/>
+          </w:rPr>
+          <m:t>PS</m:t>
+        </m:r>
+        <m:r>
+          <w:rPr>
+            <w:rFonts w:ascii="Cambria Math" w:hAnsi="Cambria Math"/>
+            <w:color w:val="000000" w:themeColor="text1"/>
+            <w:szCs w:val="28"/>
+          </w:rPr>
+          <m:t>-</m:t>
+        </m:r>
+        <m:r>
+          <w:rPr>
+            <w:rFonts w:ascii="Cambria Math" w:hAnsi="Cambria Math"/>
+            <w:color w:val="000000" w:themeColor="text1"/>
+            <w:szCs w:val="28"/>
+            <w:lang w:val="en-US"/>
+          </w:rPr>
+          <m:t>PR</m:t>
+        </m:r>
+        <m:r>
+          <w:rPr>
+            <w:rFonts w:ascii="Cambria Math" w:hAnsi="Cambria Math"/>
+            <w:color w:val="000000" w:themeColor="text1"/>
+            <w:szCs w:val="28"/>
+          </w:rPr>
+          <m:t>*</m:t>
+        </m:r>
+        <m:r>
+          <w:rPr>
+            <w:rFonts w:ascii="Cambria Math" w:hAnsi="Cambria Math"/>
+            <w:color w:val="000000" w:themeColor="text1"/>
+            <w:szCs w:val="28"/>
+            <w:lang w:val="en-US"/>
+          </w:rPr>
+          <m:t>PC</m:t>
+        </m:r>
+      </m:oMath>
+      <w:r>
+        <w:rPr>
+          <w:szCs w:val="28"/>
+        </w:rPr>
+        <w:t>.</w:t>
       </w:r>
     </w:p>
     <w:p>
@@ -1994,7 +2110,87 @@
         <w:rPr>
           <w:szCs w:val="28"/>
         </w:rPr>
-        <w:t>Вход: успеваемость, способность решать учебные задачи, интерес к обучению.</w:t>
+        <w:t>Вход: успеваемость</w:t>
+      </w:r>
+      <w:r>
+        <w:rPr>
+          <w:szCs w:val="28"/>
+        </w:rPr>
+        <w:t xml:space="preserve"> </w:t>
+      </w:r>
+      <w:r>
+        <w:rPr>
+          <w:szCs w:val="28"/>
+        </w:rPr>
+        <w:t>по различным предметам</w:t>
+      </w:r>
+      <w:r>
+        <w:rPr>
+          <w:szCs w:val="28"/>
+        </w:rPr>
+        <w:t xml:space="preserve"> (</w:t>
+      </w:r>
+      <w:r>
+        <w:rPr>
+          <w:szCs w:val="28"/>
+          <w:lang w:val="en-US"/>
+        </w:rPr>
+        <w:t>S</w:t>
+      </w:r>
+      <w:r>
+        <w:rPr>
+          <w:szCs w:val="28"/>
+        </w:rPr>
+        <w:t>)</w:t>
+      </w:r>
+      <w:r>
+        <w:rPr>
+          <w:szCs w:val="28"/>
+        </w:rPr>
+        <w:t xml:space="preserve"> (1-5</w:t>
+      </w:r>
+      <w:r>
+        <w:rPr>
+          <w:szCs w:val="28"/>
+        </w:rPr>
+        <w:t xml:space="preserve"> за каждый</w:t>
+      </w:r>
+      <w:r>
+        <w:rPr>
+          <w:szCs w:val="28"/>
+        </w:rPr>
+        <w:t>)</w:t>
+      </w:r>
+      <w:r>
+        <w:rPr>
+          <w:szCs w:val="28"/>
+        </w:rPr>
+        <w:t>, интерес к обучению</w:t>
+      </w:r>
+      <w:r>
+        <w:rPr>
+          <w:szCs w:val="28"/>
+        </w:rPr>
+        <w:t xml:space="preserve"> </w:t>
+      </w:r>
+      <w:r>
+        <w:rPr>
+          <w:szCs w:val="28"/>
+          <w:lang w:val="en-US"/>
+        </w:rPr>
+        <w:t xml:space="preserve">(I) </w:t>
+      </w:r>
+      <w:r>
+        <w:rPr>
+          <w:szCs w:val="28"/>
+        </w:rPr>
+        <w:t>(0-1)</w:t>
+      </w:r>
+      <w:r>
+        <w:rPr>
+          <w:szCs w:val="28"/>
+        </w:rPr>
+        <w:t>.</w:t>
       </w:r>
     </w:p>
     <w:p>
@@ -2010,17 +2206,86 @@
         <w:lastRenderedPageBreak/>
         <w:t xml:space="preserve">Выход: </w:t>
       </w:r>
-      <w:r>
-        <w:rPr>
-          <w:szCs w:val="28"/>
-        </w:rPr>
-        <w:t>самооценка</w:t>
-      </w:r>
-      <w:r>
-        <w:rPr>
-          <w:szCs w:val="28"/>
-        </w:rPr>
-        <w:t>, готовность к поступлению в вузы/колледжи.</w:t>
+      <m:oMath>
+        <m:sSub>
+          <m:sSubPr>
+            <m:ctrlPr>
+              <w:rPr>
+                <w:rFonts w:ascii="Cambria Math" w:hAnsi="Cambria Math"/>
+                <w:i/>
+                <w:color w:val="000000" w:themeColor="text1"/>
+                <w:szCs w:val="28"/>
+                <w:lang w:val="en-US"/>
+              </w:rPr>
+            </m:ctrlPr>
+          </m:sSubPr>
+          <m:e>
+            <m:r>
+              <w:rPr>
+                <w:rFonts w:ascii="Cambria Math" w:hAnsi="Cambria Math"/>
+                <w:color w:val="000000" w:themeColor="text1"/>
+                <w:szCs w:val="28"/>
+                <w:lang w:val="en-US"/>
+              </w:rPr>
+              <m:t>X</m:t>
+            </m:r>
+          </m:e>
+          <m:sub>
+            <m:r>
+              <w:rPr>
+                <w:rFonts w:ascii="Cambria Math" w:hAnsi="Cambria Math"/>
+                <w:color w:val="000000" w:themeColor="text1"/>
+                <w:szCs w:val="28"/>
+              </w:rPr>
+              <m:t>2</m:t>
+            </m:r>
+          </m:sub>
+        </m:sSub>
+        <m:r>
+          <w:rPr>
+            <w:rFonts w:ascii="Cambria Math" w:hAnsi="Cambria Math"/>
+            <w:color w:val="000000" w:themeColor="text1"/>
+            <w:szCs w:val="28"/>
+            <w:lang w:val="en-US"/>
+          </w:rPr>
+          <m:t>=I*</m:t>
+        </m:r>
+        <m:nary>
+          <m:naryPr>
+            <m:chr m:val="∑"/>
+            <m:limLoc m:val="undOvr"/>
+            <m:subHide m:val="1"/>
+            <m:supHide m:val="1"/>
+            <m:ctrlPr>
+              <w:rPr>
+                <w:rFonts w:ascii="Cambria Math" w:hAnsi="Cambria Math"/>
+                <w:i/>
+                <w:color w:val="000000" w:themeColor="text1"/>
+                <w:szCs w:val="28"/>
+                <w:lang w:val="en-US"/>
+              </w:rPr>
+            </m:ctrlPr>
+          </m:naryPr>
+          <m:sub/>
+          <m:sup/>
+          <m:e>
+            <m:r>
+              <w:rPr>
+                <w:rFonts w:ascii="Cambria Math" w:hAnsi="Cambria Math"/>
+                <w:color w:val="000000" w:themeColor="text1"/>
+                <w:szCs w:val="28"/>
+                <w:lang w:val="en-US"/>
+              </w:rPr>
+              <m:t>S</m:t>
+            </m:r>
+          </m:e>
+        </m:nary>
+      </m:oMath>
+      <w:r>
+        <w:rPr>
+          <w:szCs w:val="28"/>
+        </w:rPr>
+        <w:t>.</w:t>
       </w:r>
     </w:p>
     <w:p>
@@ -2065,20 +2330,211 @@
         <w:rPr>
           <w:szCs w:val="28"/>
         </w:rPr>
-        <w:t>Вход: наличие друзей, отношения с учителями, участие в общественной жизни.</w:t>
-      </w:r>
-    </w:p>
-    <w:p>
-      <w:pPr>
-        <w:rPr>
-          <w:szCs w:val="28"/>
-        </w:rPr>
-      </w:pPr>
-      <w:r>
-        <w:rPr>
-          <w:szCs w:val="28"/>
-        </w:rPr>
-        <w:t>Выход: навыки коммуникации, уверенность в себе, принадлежность к коллективу.</w:t>
+        <w:t>Вход: наличие друзей</w:t>
+      </w:r>
+      <w:r>
+        <w:rPr>
+          <w:szCs w:val="28"/>
+        </w:rPr>
+        <w:t xml:space="preserve"> (</w:t>
+      </w:r>
+      <w:r>
+        <w:rPr>
+          <w:szCs w:val="28"/>
+          <w:lang w:val="en-US"/>
+        </w:rPr>
+        <w:t>F</w:t>
+      </w:r>
+      <w:r>
+        <w:rPr>
+          <w:szCs w:val="28"/>
+        </w:rPr>
+        <w:t>) (0-1)</w:t>
+      </w:r>
+      <w:r>
+        <w:rPr>
+          <w:szCs w:val="28"/>
+        </w:rPr>
+        <w:t>, отношения с учителями</w:t>
+      </w:r>
+      <w:r>
+        <w:rPr>
+          <w:szCs w:val="28"/>
+        </w:rPr>
+        <w:t xml:space="preserve"> (</w:t>
+      </w:r>
+      <w:r>
+        <w:rPr>
+          <w:szCs w:val="28"/>
+          <w:lang w:val="en-US"/>
+        </w:rPr>
+        <w:t>TI</w:t>
+      </w:r>
+      <w:r>
+        <w:rPr>
+          <w:szCs w:val="28"/>
+        </w:rPr>
+        <w:t>) (0-5)</w:t>
+      </w:r>
+      <w:r>
+        <w:rPr>
+          <w:szCs w:val="28"/>
+        </w:rPr>
+        <w:t>, участие в общественной жизни</w:t>
+      </w:r>
+      <w:r>
+        <w:rPr>
+          <w:szCs w:val="28"/>
+        </w:rPr>
+        <w:t xml:space="preserve"> (</w:t>
+      </w:r>
+      <w:r>
+        <w:rPr>
+          <w:szCs w:val="28"/>
+          <w:lang w:val="en-US"/>
+        </w:rPr>
+        <w:t>SL</w:t>
+      </w:r>
+      <w:r>
+        <w:rPr>
+          <w:szCs w:val="28"/>
+        </w:rPr>
+        <w:t>) (0-1)</w:t>
+      </w:r>
+      <w:r>
+        <w:rPr>
+          <w:szCs w:val="28"/>
+        </w:rPr>
+        <w:t>.</w:t>
+      </w:r>
+    </w:p>
+    <w:p>
+      <w:pPr>
+        <w:rPr>
+          <w:szCs w:val="28"/>
+        </w:rPr>
+      </w:pPr>
+      <w:r>
+        <w:rPr>
+          <w:szCs w:val="28"/>
+        </w:rPr>
+        <w:t xml:space="preserve">Выход: </w:t>
+      </w:r>
+      <m:oMath>
+        <m:sSub>
+          <m:sSubPr>
+            <m:ctrlPr>
+              <w:rPr>
+                <w:rFonts w:ascii="Cambria Math" w:hAnsi="Cambria Math"/>
+                <w:i/>
+                <w:color w:val="000000" w:themeColor="text1"/>
+                <w:szCs w:val="28"/>
+                <w:lang w:val="en-US"/>
+              </w:rPr>
+            </m:ctrlPr>
+          </m:sSubPr>
+          <m:e>
+            <m:r>
+              <w:rPr>
+                <w:rFonts w:ascii="Cambria Math" w:hAnsi="Cambria Math"/>
+                <w:color w:val="000000" w:themeColor="text1"/>
+                <w:szCs w:val="28"/>
+                <w:lang w:val="en-US"/>
+              </w:rPr>
+              <m:t>X</m:t>
+            </m:r>
+          </m:e>
+          <m:sub>
+            <m:r>
+              <w:rPr>
+                <w:rFonts w:ascii="Cambria Math" w:hAnsi="Cambria Math"/>
+                <w:color w:val="000000" w:themeColor="text1"/>
+                <w:szCs w:val="28"/>
+              </w:rPr>
+              <m:t>3</m:t>
+            </m:r>
+          </m:sub>
+        </m:sSub>
+        <m:r>
+          <w:rPr>
+            <w:rFonts w:ascii="Cambria Math" w:hAnsi="Cambria Math"/>
+            <w:color w:val="000000" w:themeColor="text1"/>
+            <w:szCs w:val="28"/>
+          </w:rPr>
+          <m:t>=</m:t>
+        </m:r>
+        <m:r>
+          <w:rPr>
+            <w:rFonts w:ascii="Cambria Math" w:hAnsi="Cambria Math"/>
+            <w:color w:val="000000" w:themeColor="text1"/>
+            <w:szCs w:val="28"/>
+          </w:rPr>
+          <m:t>-</m:t>
+        </m:r>
+        <m:d>
+          <m:dPr>
+            <m:ctrlPr>
+              <w:rPr>
+                <w:rFonts w:ascii="Cambria Math" w:hAnsi="Cambria Math"/>
+                <w:i/>
+                <w:color w:val="000000" w:themeColor="text1"/>
+                <w:szCs w:val="28"/>
+                <w:lang w:val="en-US"/>
+              </w:rPr>
+            </m:ctrlPr>
+          </m:dPr>
+          <m:e>
+            <m:r>
+              <w:rPr>
+                <w:rFonts w:ascii="Cambria Math" w:hAnsi="Cambria Math"/>
+                <w:color w:val="000000" w:themeColor="text1"/>
+                <w:szCs w:val="28"/>
+                <w:lang w:val="en-US"/>
+              </w:rPr>
+              <m:t>TI</m:t>
+            </m:r>
+            <m:r>
+              <w:rPr>
+                <w:rFonts w:ascii="Cambria Math" w:hAnsi="Cambria Math"/>
+                <w:color w:val="000000" w:themeColor="text1"/>
+                <w:szCs w:val="28"/>
+              </w:rPr>
+              <m:t>+</m:t>
+            </m:r>
+            <m:r>
+              <w:rPr>
+                <w:rFonts w:ascii="Cambria Math" w:hAnsi="Cambria Math"/>
+                <w:color w:val="000000" w:themeColor="text1"/>
+                <w:szCs w:val="28"/>
+                <w:lang w:val="en-US"/>
+              </w:rPr>
+              <m:t>SL</m:t>
+            </m:r>
+          </m:e>
+        </m:d>
+        <m:r>
+          <w:rPr>
+            <w:rFonts w:ascii="Cambria Math" w:hAnsi="Cambria Math"/>
+            <w:color w:val="000000" w:themeColor="text1"/>
+            <w:szCs w:val="28"/>
+          </w:rPr>
+          <m:t>*</m:t>
+        </m:r>
+        <m:r>
+          <w:rPr>
+            <w:rFonts w:ascii="Cambria Math" w:hAnsi="Cambria Math"/>
+            <w:color w:val="000000" w:themeColor="text1"/>
+            <w:szCs w:val="28"/>
+            <w:lang w:val="en-US"/>
+          </w:rPr>
+          <m:t>F</m:t>
+        </m:r>
+      </m:oMath>
+      <w:r>
+        <w:rPr>
+          <w:szCs w:val="28"/>
+        </w:rPr>
+        <w:t>.</w:t>
       </w:r>
     </w:p>
     <w:p>
@@ -2123,20 +2579,103 @@
         <w:rPr>
           <w:szCs w:val="28"/>
         </w:rPr>
-        <w:t>Вход: участие в кружках, секциях, курсах.</w:t>
-      </w:r>
-    </w:p>
-    <w:p>
-      <w:pPr>
-        <w:rPr>
-          <w:szCs w:val="28"/>
-        </w:rPr>
-      </w:pPr>
-      <w:r>
-        <w:rPr>
-          <w:szCs w:val="28"/>
-        </w:rPr>
-        <w:t>Выход: развитие новых компетенций, повышение интереса к учебе, карьерная ориентация.</w:t>
+        <w:t>Вход: участие в кружках, секциях, курсах</w:t>
+      </w:r>
+      <w:r>
+        <w:rPr>
+          <w:szCs w:val="28"/>
+        </w:rPr>
+        <w:t xml:space="preserve"> (</w:t>
+      </w:r>
+      <w:r>
+        <w:rPr>
+          <w:szCs w:val="28"/>
+          <w:lang w:val="en-US"/>
+        </w:rPr>
+        <w:t>C</w:t>
+      </w:r>
+      <w:r>
+        <w:rPr>
+          <w:szCs w:val="28"/>
+        </w:rPr>
+        <w:t>) (0-1)</w:t>
+      </w:r>
+      <w:r>
+        <w:rPr>
+          <w:szCs w:val="28"/>
+        </w:rPr>
+        <w:t>.</w:t>
+      </w:r>
+    </w:p>
+    <w:p>
+      <w:pPr>
+        <w:rPr>
+          <w:szCs w:val="28"/>
+        </w:rPr>
+      </w:pPr>
+      <w:r>
+        <w:rPr>
+          <w:szCs w:val="28"/>
+        </w:rPr>
+        <w:t xml:space="preserve">Выход: </w:t>
+      </w:r>
+      <m:oMath>
+        <m:sSub>
+          <m:sSubPr>
+            <m:ctrlPr>
+              <w:rPr>
+                <w:rFonts w:ascii="Cambria Math" w:hAnsi="Cambria Math"/>
+                <w:i/>
+                <w:color w:val="000000" w:themeColor="text1"/>
+                <w:szCs w:val="28"/>
+                <w:lang w:val="en-US"/>
+              </w:rPr>
+            </m:ctrlPr>
+          </m:sSubPr>
+          <m:e>
+            <m:r>
+              <w:rPr>
+                <w:rFonts w:ascii="Cambria Math" w:hAnsi="Cambria Math"/>
+                <w:color w:val="000000" w:themeColor="text1"/>
+                <w:szCs w:val="28"/>
+                <w:lang w:val="en-US"/>
+              </w:rPr>
+              <m:t>X</m:t>
+            </m:r>
+          </m:e>
+          <m:sub>
+            <m:r>
+              <w:rPr>
+                <w:rFonts w:ascii="Cambria Math" w:hAnsi="Cambria Math"/>
+                <w:color w:val="000000" w:themeColor="text1"/>
+                <w:szCs w:val="28"/>
+              </w:rPr>
+              <m:t>4</m:t>
+            </m:r>
+          </m:sub>
+        </m:sSub>
+        <m:r>
+          <w:rPr>
+            <w:rFonts w:ascii="Cambria Math" w:hAnsi="Cambria Math"/>
+            <w:color w:val="000000" w:themeColor="text1"/>
+            <w:szCs w:val="28"/>
+          </w:rPr>
+          <m:t>=</m:t>
+        </m:r>
+        <m:r>
+          <w:rPr>
+            <w:rFonts w:ascii="Cambria Math" w:hAnsi="Cambria Math"/>
+            <w:color w:val="000000" w:themeColor="text1"/>
+            <w:szCs w:val="28"/>
+          </w:rPr>
+          <m:t>C</m:t>
+        </m:r>
+      </m:oMath>
+      <w:r>
+        <w:rPr>
+          <w:szCs w:val="28"/>
+        </w:rPr>
+        <w:t>.</w:t>
       </w:r>
     </w:p>
     <w:p>
@@ -2181,20 +2720,159 @@
         <w:rPr>
           <w:szCs w:val="28"/>
         </w:rPr>
-        <w:t>Вход: планы на карьеру, понимание значимости учёбы, уровень мотивации.</w:t>
-      </w:r>
-    </w:p>
-    <w:p>
-      <w:pPr>
-        <w:rPr>
-          <w:szCs w:val="28"/>
-        </w:rPr>
-      </w:pPr>
-      <w:r>
-        <w:rPr>
-          <w:szCs w:val="28"/>
-        </w:rPr>
-        <w:t>Выход: стремление добиваться успеха, чёткое направление действий.</w:t>
+        <w:t>Вход: планы на карьеру</w:t>
+      </w:r>
+      <w:r>
+        <w:rPr>
+          <w:szCs w:val="28"/>
+        </w:rPr>
+        <w:t xml:space="preserve"> (</w:t>
+      </w:r>
+      <w:r>
+        <w:rPr>
+          <w:szCs w:val="28"/>
+          <w:lang w:val="en-US"/>
+        </w:rPr>
+        <w:t>J</w:t>
+      </w:r>
+      <w:r>
+        <w:rPr>
+          <w:szCs w:val="28"/>
+        </w:rPr>
+        <w:t>) (</w:t>
+      </w:r>
+      <w:r>
+        <w:rPr>
+          <w:szCs w:val="28"/>
+        </w:rPr>
+        <w:t>0-1</w:t>
+      </w:r>
+      <w:r>
+        <w:rPr>
+          <w:szCs w:val="28"/>
+        </w:rPr>
+        <w:t>)</w:t>
+      </w:r>
+      <w:r>
+        <w:rPr>
+          <w:szCs w:val="28"/>
+        </w:rPr>
+        <w:t>, уровень мотивации</w:t>
+      </w:r>
+      <w:r>
+        <w:rPr>
+          <w:szCs w:val="28"/>
+        </w:rPr>
+        <w:t xml:space="preserve"> (</w:t>
+      </w:r>
+      <w:r>
+        <w:rPr>
+          <w:szCs w:val="28"/>
+          <w:lang w:val="en-US"/>
+        </w:rPr>
+        <w:t>M</w:t>
+      </w:r>
+      <w:r>
+        <w:rPr>
+          <w:szCs w:val="28"/>
+        </w:rPr>
+        <w:t>) (0-5)</w:t>
+      </w:r>
+      <w:r>
+        <w:rPr>
+          <w:szCs w:val="28"/>
+        </w:rPr>
+        <w:t>.</w:t>
+      </w:r>
+    </w:p>
+    <w:p>
+      <w:pPr>
+        <w:rPr>
+          <w:szCs w:val="28"/>
+        </w:rPr>
+      </w:pPr>
+      <w:r>
+        <w:rPr>
+          <w:szCs w:val="28"/>
+        </w:rPr>
+        <w:t>Выход:</w:t>
+      </w:r>
+      <w:r>
+        <w:rPr>
+          <w:rFonts w:ascii="Cambria Math" w:hAnsi="Cambria Math"/>
+          <w:i/>
+          <w:color w:val="000000" w:themeColor="text1"/>
+          <w:szCs w:val="28"/>
+          <w:lang w:val="en-US"/>
+        </w:rPr>
+        <w:t xml:space="preserve"> </w:t>
+      </w:r>
+      <m:oMath>
+        <m:sSub>
+          <m:sSubPr>
+            <m:ctrlPr>
+              <w:rPr>
+                <w:rFonts w:ascii="Cambria Math" w:hAnsi="Cambria Math"/>
+                <w:i/>
+                <w:color w:val="000000" w:themeColor="text1"/>
+                <w:szCs w:val="28"/>
+                <w:lang w:val="en-US"/>
+              </w:rPr>
+            </m:ctrlPr>
+          </m:sSubPr>
+          <m:e>
+            <m:r>
+              <w:rPr>
+                <w:rFonts w:ascii="Cambria Math" w:hAnsi="Cambria Math"/>
+                <w:color w:val="000000" w:themeColor="text1"/>
+                <w:szCs w:val="28"/>
+                <w:lang w:val="en-US"/>
+              </w:rPr>
+              <m:t>X</m:t>
+            </m:r>
+          </m:e>
+          <m:sub>
+            <m:r>
+              <w:rPr>
+                <w:rFonts w:ascii="Cambria Math" w:hAnsi="Cambria Math"/>
+                <w:color w:val="000000" w:themeColor="text1"/>
+                <w:szCs w:val="28"/>
+              </w:rPr>
+              <m:t>5</m:t>
+            </m:r>
+          </m:sub>
+        </m:sSub>
+        <m:r>
+          <w:rPr>
+            <w:rFonts w:ascii="Cambria Math" w:hAnsi="Cambria Math"/>
+            <w:color w:val="000000" w:themeColor="text1"/>
+            <w:szCs w:val="28"/>
+          </w:rPr>
+          <m:t>=</m:t>
+        </m:r>
+        <m:r>
+          <w:rPr>
+            <w:rFonts w:ascii="Cambria Math" w:hAnsi="Cambria Math"/>
+            <w:color w:val="000000" w:themeColor="text1"/>
+            <w:szCs w:val="28"/>
+          </w:rPr>
+          <m:t>-</m:t>
+        </m:r>
+        <m:r>
+          <w:rPr>
+            <w:rFonts w:ascii="Cambria Math" w:hAnsi="Cambria Math"/>
+            <w:color w:val="000000" w:themeColor="text1"/>
+            <w:szCs w:val="28"/>
+            <w:lang w:val="en-US"/>
+          </w:rPr>
+          <m:t>M*J</m:t>
+        </m:r>
+      </m:oMath>
+      <w:r>
+        <w:rPr>
+          <w:szCs w:val="28"/>
+        </w:rPr>
+        <w:t>.</w:t>
       </w:r>
     </w:p>
     <w:p>
@@ -2228,19 +2906,7 @@
         <w:rPr>
           <w:szCs w:val="28"/>
         </w:rPr>
-        <w:t>образованность родителей может влиять на степень поддержки подростка в учёбе, или</w:t>
-      </w:r>
-      <w:r>
-        <w:rPr>
-          <w:szCs w:val="28"/>
-        </w:rPr>
-        <w:t xml:space="preserve"> участие в общественной</w:t>
-      </w:r>
-      <w:r>
-        <w:rPr>
-          <w:szCs w:val="28"/>
-        </w:rPr>
-        <w:t xml:space="preserve"> снижающее уровень стресса, путём возможного отвлечения от него и позволяющее строить планы на будущее</w:t>
+        <w:t>образованность родителей может влиять на степень поддержки подростка в учёбе</w:t>
       </w:r>
       <w:r>
         <w:rPr>
@@ -2254,7 +2920,6 @@
         <w:jc w:val="center"/>
         <w:rPr>
           <w:szCs w:val="28"/>
-          <w:lang w:val="en-US"/>
         </w:rPr>
       </w:pPr>
       <w:r>
@@ -2266,8 +2931,8 @@
         <w:lastRenderedPageBreak/>
         <w:drawing>
           <wp:inline distT="0" distB="0" distL="0" distR="0" wp14:anchorId="263EA83E" wp14:editId="4CC91848">
-            <wp:extent cx="4214825" cy="4295775"/>
-            <wp:effectExtent l="0" t="0" r="1905" b="0"/>
+            <wp:extent cx="4033952" cy="4913630"/>
+            <wp:effectExtent l="0" t="0" r="5080" b="1270"/>
             <wp:docPr id="1" name="Рисунок 1"/>
             <wp:cNvGraphicFramePr>
               <a:graphicFrameLocks xmlns:a="http://schemas.openxmlformats.org/drawingml/2006/main" noChangeAspect="1"/>
@@ -2296,7 +2961,7 @@
                   <pic:spPr bwMode="auto">
                     <a:xfrm>
                       <a:off x="0" y="0"/>
-                      <a:ext cx="4244659" cy="4326182"/>
+                      <a:ext cx="4063754" cy="4949931"/>
                     </a:xfrm>
                     <a:prstGeom prst="rect">
                       <a:avLst/>
@@ -2453,6 +3118,7 @@
         <w:rPr>
           <w:szCs w:val="28"/>
         </w:rPr>
+        <w:lastRenderedPageBreak/>
         <w:t>Выходные данные:</w:t>
       </w:r>
     </w:p>
@@ -2472,7 +3138,6 @@
         <w:rPr>
           <w:szCs w:val="28"/>
         </w:rPr>
-        <w:lastRenderedPageBreak/>
         <w:t>Уровень психологического давления на подростка</w:t>
       </w:r>
       <w:r>
@@ -5343,13 +6008,38 @@
         <w:rPr>
           <w:szCs w:val="28"/>
         </w:rPr>
-        <w:t>Вход: Количество инфицированных, коэффициент заражаемости (</w:t>
+        <w:t>Вход: Количество инфицированных</w:t>
+      </w:r>
+      <w:r>
+        <w:rPr>
+          <w:szCs w:val="28"/>
+        </w:rPr>
+        <w:t xml:space="preserve"> (</w:t>
       </w:r>
       <w:r>
         <w:rPr>
           <w:szCs w:val="28"/>
           <w:lang w:val="en-US"/>
         </w:rPr>
+        <w:t>N</w:t>
+      </w:r>
+      <w:r>
+        <w:rPr>
+          <w:szCs w:val="28"/>
+        </w:rPr>
+        <w:t>)</w:t>
+      </w:r>
+      <w:r>
+        <w:rPr>
+          <w:szCs w:val="28"/>
+        </w:rPr>
+        <w:t>, коэффициент заражаемости (</w:t>
+      </w:r>
+      <w:r>
+        <w:rPr>
+          <w:szCs w:val="28"/>
+          <w:lang w:val="en-US"/>
+        </w:rPr>
         <w:t>R</w:t>
       </w:r>
       <w:r>
@@ -5375,21 +6065,103 @@
         <w:rPr>
           <w:szCs w:val="28"/>
         </w:rPr>
-        <w:t>режим карантина.</w:t>
-      </w:r>
-    </w:p>
-    <w:p>
-      <w:pPr>
-        <w:rPr>
-          <w:szCs w:val="28"/>
-        </w:rPr>
-      </w:pPr>
-      <w:r>
-        <w:rPr>
-          <w:szCs w:val="28"/>
-        </w:rPr>
-        <w:t>Выход: Уровень заболеваемости, пик эпидемии, прогноз численности заболевших.</w:t>
-      </w:r>
+        <w:t>режим карантина</w:t>
+      </w:r>
+      <w:r>
+        <w:rPr>
+          <w:szCs w:val="28"/>
+        </w:rPr>
+        <w:t xml:space="preserve"> (</w:t>
+      </w:r>
+      <w:r>
+        <w:rPr>
+          <w:szCs w:val="28"/>
+          <w:lang w:val="en-US"/>
+        </w:rPr>
+        <w:t>Q</w:t>
+      </w:r>
+      <w:r>
+        <w:rPr>
+          <w:szCs w:val="28"/>
+        </w:rPr>
+        <w:t>)</w:t>
+      </w:r>
+      <w:r>
+        <w:rPr>
+          <w:szCs w:val="28"/>
+        </w:rPr>
+        <w:t>.</w:t>
+      </w:r>
+    </w:p>
+    <w:p>
+      <w:pPr>
+        <w:rPr>
+          <w:szCs w:val="28"/>
+        </w:rPr>
+      </w:pPr>
+      <w:r>
+        <w:rPr>
+          <w:szCs w:val="28"/>
+        </w:rPr>
+        <w:t xml:space="preserve">Выход: </w:t>
+      </w:r>
+      <m:oMath>
+        <m:r>
+          <w:rPr>
+            <w:rFonts w:ascii="Cambria Math" w:hAnsi="Cambria Math"/>
+            <w:szCs w:val="28"/>
+          </w:rPr>
+          <m:t>I</m:t>
+        </m:r>
+        <m:r>
+          <w:rPr>
+            <w:rFonts w:ascii="Cambria Math" w:hAnsi="Cambria Math"/>
+            <w:szCs w:val="28"/>
+            <w:lang w:val="en-US"/>
+          </w:rPr>
+          <m:t>=N*(</m:t>
+        </m:r>
+        <m:sSub>
+          <m:sSubPr>
+            <m:ctrlPr>
+              <w:rPr>
+                <w:rFonts w:ascii="Cambria Math" w:hAnsi="Cambria Math"/>
+                <w:i/>
+                <w:szCs w:val="28"/>
+                <w:lang w:val="en-US"/>
+              </w:rPr>
+            </m:ctrlPr>
+          </m:sSubPr>
+          <m:e>
+            <m:r>
+              <w:rPr>
+                <w:rFonts w:ascii="Cambria Math" w:hAnsi="Cambria Math"/>
+                <w:szCs w:val="28"/>
+                <w:lang w:val="en-US"/>
+              </w:rPr>
+              <m:t>R</m:t>
+            </m:r>
+          </m:e>
+          <m:sub>
+            <m:r>
+              <w:rPr>
+                <w:rFonts w:ascii="Cambria Math" w:hAnsi="Cambria Math"/>
+                <w:szCs w:val="28"/>
+                <w:lang w:val="en-US"/>
+              </w:rPr>
+              <m:t>0</m:t>
+            </m:r>
+          </m:sub>
+        </m:sSub>
+        <m:r>
+          <w:rPr>
+            <w:rFonts w:ascii="Cambria Math" w:hAnsi="Cambria Math"/>
+            <w:szCs w:val="28"/>
+            <w:lang w:val="en-US"/>
+          </w:rPr>
+          <m:t>-Q)</m:t>
+        </m:r>
+      </m:oMath>
     </w:p>
     <w:p>
       <w:pPr>
@@ -5434,20 +6206,251 @@
         <w:rPr>
           <w:szCs w:val="28"/>
         </w:rPr>
-        <w:t>Вход: Количество медицинских учреждений, количество койко-мест, оборудование (ИВЛ), медицинский персонал.</w:t>
-      </w:r>
-    </w:p>
-    <w:p>
-      <w:pPr>
-        <w:rPr>
-          <w:szCs w:val="28"/>
-        </w:rPr>
-      </w:pPr>
-      <w:r>
-        <w:rPr>
-          <w:szCs w:val="28"/>
-        </w:rPr>
-        <w:t>Выход: Нагрузка на систему здравоохранения, количество госпитализаций, обеспеченность больниц.</w:t>
+        <w:t>Вход: Количество медицинских учреждений</w:t>
+      </w:r>
+      <w:r>
+        <w:rPr>
+          <w:szCs w:val="28"/>
+        </w:rPr>
+        <w:t xml:space="preserve"> (</w:t>
+      </w:r>
+      <w:r>
+        <w:rPr>
+          <w:szCs w:val="28"/>
+          <w:lang w:val="en-US"/>
+        </w:rPr>
+        <w:t>F</w:t>
+      </w:r>
+      <w:r>
+        <w:rPr>
+          <w:szCs w:val="28"/>
+        </w:rPr>
+        <w:t>)</w:t>
+      </w:r>
+      <w:r>
+        <w:rPr>
+          <w:szCs w:val="28"/>
+        </w:rPr>
+        <w:t>, количество койко-мест</w:t>
+      </w:r>
+      <w:r>
+        <w:rPr>
+          <w:szCs w:val="28"/>
+        </w:rPr>
+        <w:t xml:space="preserve"> (</w:t>
+      </w:r>
+      <w:r>
+        <w:rPr>
+          <w:szCs w:val="28"/>
+          <w:lang w:val="en-US"/>
+        </w:rPr>
+        <w:t>M</w:t>
+      </w:r>
+      <w:r>
+        <w:rPr>
+          <w:szCs w:val="28"/>
+        </w:rPr>
+        <w:t>)</w:t>
+      </w:r>
+      <w:r>
+        <w:rPr>
+          <w:szCs w:val="28"/>
+        </w:rPr>
+        <w:t>, оборудование (ИВЛ)</w:t>
+      </w:r>
+      <w:r>
+        <w:rPr>
+          <w:szCs w:val="28"/>
+        </w:rPr>
+        <w:t xml:space="preserve"> (</w:t>
+      </w:r>
+      <w:r>
+        <w:rPr>
+          <w:szCs w:val="28"/>
+          <w:lang w:val="en-US"/>
+        </w:rPr>
+        <w:t>L</w:t>
+      </w:r>
+      <w:r>
+        <w:rPr>
+          <w:szCs w:val="28"/>
+        </w:rPr>
+        <w:t>)</w:t>
+      </w:r>
+      <w:r>
+        <w:rPr>
+          <w:szCs w:val="28"/>
+        </w:rPr>
+        <w:t>, медицинский персонал</w:t>
+      </w:r>
+      <w:r>
+        <w:rPr>
+          <w:szCs w:val="28"/>
+        </w:rPr>
+        <w:t xml:space="preserve"> (</w:t>
+      </w:r>
+      <w:r>
+        <w:rPr>
+          <w:szCs w:val="28"/>
+          <w:lang w:val="en-US"/>
+        </w:rPr>
+        <w:t>P</w:t>
+      </w:r>
+      <w:r>
+        <w:rPr>
+          <w:szCs w:val="28"/>
+        </w:rPr>
+        <w:t>)</w:t>
+      </w:r>
+      <w:r>
+        <w:rPr>
+          <w:szCs w:val="28"/>
+        </w:rPr>
+        <w:t>.</w:t>
+      </w:r>
+    </w:p>
+    <w:p>
+      <w:pPr>
+        <w:rPr>
+          <w:szCs w:val="28"/>
+        </w:rPr>
+      </w:pPr>
+      <w:r>
+        <w:rPr>
+          <w:szCs w:val="28"/>
+        </w:rPr>
+        <w:t>Выход:</w:t>
+      </w:r>
+      <w:r>
+        <w:rPr>
+          <w:szCs w:val="28"/>
+        </w:rPr>
+        <w:t xml:space="preserve"> </w:t>
+      </w:r>
+      <m:oMath>
+        <m:r>
+          <w:rPr>
+            <w:rFonts w:ascii="Cambria Math" w:hAnsi="Cambria Math"/>
+            <w:szCs w:val="28"/>
+          </w:rPr>
+          <m:t>R</m:t>
+        </m:r>
+        <m:r>
+          <w:rPr>
+            <w:rFonts w:ascii="Cambria Math" w:hAnsi="Cambria Math"/>
+            <w:szCs w:val="28"/>
+          </w:rPr>
+          <m:t>=</m:t>
+        </m:r>
+        <m:r>
+          <w:rPr>
+            <w:rFonts w:ascii="Cambria Math" w:hAnsi="Cambria Math"/>
+            <w:szCs w:val="28"/>
+            <w:lang w:val="en-US"/>
+          </w:rPr>
+          <m:t>F</m:t>
+        </m:r>
+        <m:r>
+          <w:rPr>
+            <w:rFonts w:ascii="Cambria Math" w:hAnsi="Cambria Math"/>
+            <w:szCs w:val="28"/>
+          </w:rPr>
+          <m:t>*(</m:t>
+        </m:r>
+        <m:r>
+          <w:rPr>
+            <w:rFonts w:ascii="Cambria Math" w:hAnsi="Cambria Math"/>
+            <w:szCs w:val="28"/>
+            <w:lang w:val="en-US"/>
+          </w:rPr>
+          <m:t>M</m:t>
+        </m:r>
+        <m:r>
+          <w:rPr>
+            <w:rFonts w:ascii="Cambria Math" w:hAnsi="Cambria Math"/>
+            <w:szCs w:val="28"/>
+          </w:rPr>
+          <m:t>-</m:t>
+        </m:r>
+        <m:d>
+          <m:dPr>
+            <m:ctrlPr>
+              <w:rPr>
+                <w:rFonts w:ascii="Cambria Math" w:hAnsi="Cambria Math"/>
+                <w:i/>
+                <w:szCs w:val="28"/>
+                <w:lang w:val="en-US"/>
+              </w:rPr>
+            </m:ctrlPr>
+          </m:dPr>
+          <m:e>
+            <m:r>
+              <w:rPr>
+                <w:rFonts w:ascii="Cambria Math" w:hAnsi="Cambria Math"/>
+                <w:szCs w:val="28"/>
+                <w:lang w:val="en-US"/>
+              </w:rPr>
+              <m:t>M</m:t>
+            </m:r>
+            <m:r>
+              <w:rPr>
+                <w:rFonts w:ascii="Cambria Math" w:hAnsi="Cambria Math"/>
+                <w:szCs w:val="28"/>
+              </w:rPr>
+              <m:t>-</m:t>
+            </m:r>
+            <m:r>
+              <w:rPr>
+                <w:rFonts w:ascii="Cambria Math" w:hAnsi="Cambria Math"/>
+                <w:szCs w:val="28"/>
+                <w:lang w:val="en-US"/>
+              </w:rPr>
+              <m:t>L</m:t>
+            </m:r>
+          </m:e>
+        </m:d>
+        <m:r>
+          <w:rPr>
+            <w:rFonts w:ascii="Cambria Math" w:hAnsi="Cambria Math"/>
+            <w:szCs w:val="28"/>
+          </w:rPr>
+          <m:t>-</m:t>
+        </m:r>
+        <m:r>
+          <w:rPr>
+            <w:rFonts w:ascii="Cambria Math" w:hAnsi="Cambria Math"/>
+            <w:szCs w:val="28"/>
+          </w:rPr>
+          <m:t>(M</m:t>
+        </m:r>
+        <m:r>
+          <w:rPr>
+            <w:rFonts w:ascii="Cambria Math" w:hAnsi="Cambria Math"/>
+            <w:szCs w:val="28"/>
+          </w:rPr>
+          <m:t>-</m:t>
+        </m:r>
+        <m:r>
+          <w:rPr>
+            <w:rFonts w:ascii="Cambria Math" w:hAnsi="Cambria Math"/>
+            <w:szCs w:val="28"/>
+            <w:lang w:val="en-US"/>
+          </w:rPr>
+          <m:t>P</m:t>
+        </m:r>
+        <m:r>
+          <w:rPr>
+            <w:rFonts w:ascii="Cambria Math" w:hAnsi="Cambria Math"/>
+            <w:szCs w:val="28"/>
+          </w:rPr>
+          <m:t>))</m:t>
+        </m:r>
+      </m:oMath>
+      <w:r>
+        <w:rPr>
+          <w:szCs w:val="28"/>
+        </w:rPr>
+        <w:t>.</w:t>
       </w:r>
     </w:p>
     <w:p>
@@ -5492,20 +6495,239 @@
         <w:rPr>
           <w:szCs w:val="28"/>
         </w:rPr>
-        <w:t>Вход: Введение карантинных мер, использование средств индивидуальной защиты, вакцинация, социальное дистанцирование.</w:t>
-      </w:r>
-    </w:p>
-    <w:p>
-      <w:pPr>
-        <w:rPr>
-          <w:szCs w:val="28"/>
-        </w:rPr>
-      </w:pPr>
-      <w:r>
-        <w:rPr>
-          <w:szCs w:val="28"/>
-        </w:rPr>
-        <w:t>Выход: Снижение коэффициента заражаемости, уменьшение скорости распространения эпидемии.</w:t>
+        <w:t>Вход: Введение карантинных мер</w:t>
+      </w:r>
+      <w:r>
+        <w:rPr>
+          <w:szCs w:val="28"/>
+        </w:rPr>
+        <w:t xml:space="preserve"> (</w:t>
+      </w:r>
+      <w:r>
+        <w:rPr>
+          <w:szCs w:val="28"/>
+          <w:lang w:val="en-US"/>
+        </w:rPr>
+        <w:t>Q</w:t>
+      </w:r>
+      <w:r>
+        <w:rPr>
+          <w:szCs w:val="28"/>
+        </w:rPr>
+        <w:t>) (0-1)</w:t>
+      </w:r>
+      <w:r>
+        <w:rPr>
+          <w:szCs w:val="28"/>
+        </w:rPr>
+        <w:t>, использование средств индивидуальной защиты</w:t>
+      </w:r>
+      <w:r>
+        <w:rPr>
+          <w:szCs w:val="28"/>
+        </w:rPr>
+        <w:t xml:space="preserve"> (</w:t>
+      </w:r>
+      <w:r>
+        <w:rPr>
+          <w:szCs w:val="28"/>
+          <w:lang w:val="en-US"/>
+        </w:rPr>
+        <w:t>IP</w:t>
+      </w:r>
+      <w:r>
+        <w:rPr>
+          <w:szCs w:val="28"/>
+        </w:rPr>
+        <w:t>) (0-1)</w:t>
+      </w:r>
+      <w:r>
+        <w:rPr>
+          <w:szCs w:val="28"/>
+        </w:rPr>
+        <w:t>, вакцинация</w:t>
+      </w:r>
+      <w:r>
+        <w:rPr>
+          <w:szCs w:val="28"/>
+        </w:rPr>
+        <w:t xml:space="preserve"> (</w:t>
+      </w:r>
+      <w:r>
+        <w:rPr>
+          <w:szCs w:val="28"/>
+          <w:lang w:val="en-US"/>
+        </w:rPr>
+        <w:t>V</w:t>
+      </w:r>
+      <w:r>
+        <w:rPr>
+          <w:szCs w:val="28"/>
+        </w:rPr>
+        <w:t>)</w:t>
+      </w:r>
+      <w:r>
+        <w:rPr>
+          <w:szCs w:val="28"/>
+        </w:rPr>
+        <w:t>, социальное дистанцирование</w:t>
+      </w:r>
+      <w:r>
+        <w:rPr>
+          <w:szCs w:val="28"/>
+        </w:rPr>
+        <w:t xml:space="preserve"> (</w:t>
+      </w:r>
+      <w:r>
+        <w:rPr>
+          <w:szCs w:val="28"/>
+          <w:lang w:val="en-US"/>
+        </w:rPr>
+        <w:t>SD</w:t>
+      </w:r>
+      <w:r>
+        <w:rPr>
+          <w:szCs w:val="28"/>
+        </w:rPr>
+        <w:t>) (0-1)</w:t>
+      </w:r>
+      <w:r>
+        <w:rPr>
+          <w:szCs w:val="28"/>
+        </w:rPr>
+        <w:t>.</w:t>
+      </w:r>
+    </w:p>
+    <w:p>
+      <w:pPr>
+        <w:rPr>
+          <w:szCs w:val="28"/>
+        </w:rPr>
+      </w:pPr>
+      <w:r>
+        <w:rPr>
+          <w:szCs w:val="28"/>
+        </w:rPr>
+        <w:t>Выход:</w:t>
+      </w:r>
+      <w:r>
+        <w:rPr>
+          <w:szCs w:val="28"/>
+        </w:rPr>
+        <w:t xml:space="preserve"> </w:t>
+      </w:r>
+      <m:oMath>
+        <m:r>
+          <w:rPr>
+            <w:rFonts w:ascii="Cambria Math" w:hAnsi="Cambria Math"/>
+            <w:szCs w:val="28"/>
+          </w:rPr>
+          <m:t>R</m:t>
+        </m:r>
+        <m:r>
+          <w:rPr>
+            <w:rFonts w:ascii="Cambria Math" w:hAnsi="Cambria Math"/>
+            <w:szCs w:val="28"/>
+          </w:rPr>
+          <m:t>=</m:t>
+        </m:r>
+        <m:f>
+          <m:fPr>
+            <m:ctrlPr>
+              <w:rPr>
+                <w:rFonts w:ascii="Cambria Math" w:hAnsi="Cambria Math"/>
+                <w:i/>
+                <w:szCs w:val="28"/>
+                <w:lang w:val="en-US"/>
+              </w:rPr>
+            </m:ctrlPr>
+          </m:fPr>
+          <m:num>
+            <m:r>
+              <w:rPr>
+                <w:rFonts w:ascii="Cambria Math" w:hAnsi="Cambria Math"/>
+                <w:szCs w:val="28"/>
+                <w:lang w:val="en-US"/>
+              </w:rPr>
+              <m:t>I</m:t>
+            </m:r>
+          </m:num>
+          <m:den>
+            <m:r>
+              <w:rPr>
+                <w:rFonts w:ascii="Cambria Math" w:hAnsi="Cambria Math"/>
+                <w:szCs w:val="28"/>
+              </w:rPr>
+              <m:t>(</m:t>
+            </m:r>
+            <m:r>
+              <w:rPr>
+                <w:rFonts w:ascii="Cambria Math" w:hAnsi="Cambria Math"/>
+                <w:szCs w:val="28"/>
+                <w:lang w:val="en-US"/>
+              </w:rPr>
+              <m:t>Q</m:t>
+            </m:r>
+            <m:r>
+              <w:rPr>
+                <w:rFonts w:ascii="Cambria Math" w:hAnsi="Cambria Math"/>
+                <w:szCs w:val="28"/>
+              </w:rPr>
+              <m:t>+</m:t>
+            </m:r>
+            <m:r>
+              <w:rPr>
+                <w:rFonts w:ascii="Cambria Math" w:hAnsi="Cambria Math"/>
+                <w:szCs w:val="28"/>
+                <w:lang w:val="en-US"/>
+              </w:rPr>
+              <m:t>IP</m:t>
+            </m:r>
+            <m:r>
+              <w:rPr>
+                <w:rFonts w:ascii="Cambria Math" w:hAnsi="Cambria Math"/>
+                <w:szCs w:val="28"/>
+              </w:rPr>
+              <m:t>+</m:t>
+            </m:r>
+            <m:r>
+              <w:rPr>
+                <w:rFonts w:ascii="Cambria Math" w:hAnsi="Cambria Math"/>
+                <w:szCs w:val="28"/>
+                <w:lang w:val="en-US"/>
+              </w:rPr>
+              <m:t>V</m:t>
+            </m:r>
+            <m:r>
+              <w:rPr>
+                <w:rFonts w:ascii="Cambria Math" w:hAnsi="Cambria Math"/>
+                <w:szCs w:val="28"/>
+              </w:rPr>
+              <m:t>+</m:t>
+            </m:r>
+            <m:r>
+              <w:rPr>
+                <w:rFonts w:ascii="Cambria Math" w:hAnsi="Cambria Math"/>
+                <w:szCs w:val="28"/>
+                <w:lang w:val="en-US"/>
+              </w:rPr>
+              <m:t>SD</m:t>
+            </m:r>
+            <m:r>
+              <w:rPr>
+                <w:rFonts w:ascii="Cambria Math" w:hAnsi="Cambria Math"/>
+                <w:szCs w:val="28"/>
+              </w:rPr>
+              <m:t>)</m:t>
+            </m:r>
+          </m:den>
+        </m:f>
+      </m:oMath>
+      <w:r>
+        <w:rPr>
+          <w:szCs w:val="28"/>
+        </w:rPr>
+        <w:t>.</w:t>
       </w:r>
     </w:p>
     <w:p>
@@ -5550,20 +6772,258 @@
         <w:rPr>
           <w:szCs w:val="28"/>
         </w:rPr>
-        <w:t>Вход: Соблюдение карантинных мер, ношение масок, участие в массовых мероприятиях, уровень осведомленности.</w:t>
-      </w:r>
-    </w:p>
-    <w:p>
-      <w:pPr>
-        <w:rPr>
-          <w:szCs w:val="28"/>
-        </w:rPr>
-      </w:pPr>
-      <w:r>
-        <w:rPr>
-          <w:szCs w:val="28"/>
-        </w:rPr>
-        <w:t>Выход: Уровень соблюдения мер, степень психологической усталости, возможное игнорирование рекомендаций.</w:t>
+        <w:t xml:space="preserve">Вход: </w:t>
+      </w:r>
+      <w:r>
+        <w:rPr>
+          <w:szCs w:val="28"/>
+        </w:rPr>
+        <w:t>Уровень населённости (</w:t>
+      </w:r>
+      <w:r>
+        <w:rPr>
+          <w:szCs w:val="28"/>
+          <w:lang w:val="en-US"/>
+        </w:rPr>
+        <w:t>PO</w:t>
+      </w:r>
+      <w:r>
+        <w:rPr>
+          <w:szCs w:val="28"/>
+        </w:rPr>
+        <w:t>), с</w:t>
+      </w:r>
+      <w:r>
+        <w:rPr>
+          <w:szCs w:val="28"/>
+        </w:rPr>
+        <w:t>облюдение карантинных мер</w:t>
+      </w:r>
+      <w:r>
+        <w:rPr>
+          <w:szCs w:val="28"/>
+        </w:rPr>
+        <w:t xml:space="preserve"> (0-1)</w:t>
+      </w:r>
+      <w:r>
+        <w:rPr>
+          <w:szCs w:val="28"/>
+        </w:rPr>
+        <w:t>, ношение масок</w:t>
+      </w:r>
+      <w:r>
+        <w:rPr>
+          <w:szCs w:val="28"/>
+        </w:rPr>
+        <w:t xml:space="preserve"> (</w:t>
+      </w:r>
+      <w:r>
+        <w:rPr>
+          <w:szCs w:val="28"/>
+          <w:lang w:val="en-US"/>
+        </w:rPr>
+        <w:t>MP</w:t>
+      </w:r>
+      <w:r>
+        <w:rPr>
+          <w:szCs w:val="28"/>
+        </w:rPr>
+        <w:t>) (0-1)</w:t>
+      </w:r>
+      <w:r>
+        <w:rPr>
+          <w:szCs w:val="28"/>
+        </w:rPr>
+        <w:t>, участие в массовых мероприятиях</w:t>
+      </w:r>
+      <w:r>
+        <w:rPr>
+          <w:szCs w:val="28"/>
+        </w:rPr>
+        <w:t xml:space="preserve"> (</w:t>
+      </w:r>
+      <w:r>
+        <w:rPr>
+          <w:szCs w:val="28"/>
+          <w:lang w:val="en-US"/>
+        </w:rPr>
+        <w:t>E</w:t>
+      </w:r>
+      <w:r>
+        <w:rPr>
+          <w:szCs w:val="28"/>
+        </w:rPr>
+        <w:t>) (0-1)</w:t>
+      </w:r>
+      <w:r>
+        <w:rPr>
+          <w:szCs w:val="28"/>
+        </w:rPr>
+        <w:t>, уровень осведомленности</w:t>
+      </w:r>
+      <w:r>
+        <w:rPr>
+          <w:szCs w:val="28"/>
+        </w:rPr>
+        <w:t xml:space="preserve"> (</w:t>
+      </w:r>
+      <w:r>
+        <w:rPr>
+          <w:szCs w:val="28"/>
+          <w:lang w:val="en-US"/>
+        </w:rPr>
+        <w:t>W</w:t>
+      </w:r>
+      <w:r>
+        <w:rPr>
+          <w:szCs w:val="28"/>
+        </w:rPr>
+        <w:t>) (0-5)</w:t>
+      </w:r>
+      <w:r>
+        <w:rPr>
+          <w:szCs w:val="28"/>
+        </w:rPr>
+        <w:t>.</w:t>
+      </w:r>
+    </w:p>
+    <w:p>
+      <w:pPr>
+        <w:rPr>
+          <w:szCs w:val="28"/>
+        </w:rPr>
+      </w:pPr>
+      <w:r>
+        <w:rPr>
+          <w:szCs w:val="28"/>
+        </w:rPr>
+        <w:t>Выход:</w:t>
+      </w:r>
+      <w:r>
+        <w:rPr>
+          <w:szCs w:val="28"/>
+        </w:rPr>
+        <w:t xml:space="preserve"> </w:t>
+      </w:r>
+      <m:oMath>
+        <m:r>
+          <w:rPr>
+            <w:rFonts w:ascii="Cambria Math" w:hAnsi="Cambria Math"/>
+            <w:szCs w:val="28"/>
+            <w:lang w:val="en-US"/>
+          </w:rPr>
+          <m:t>S</m:t>
+        </m:r>
+        <m:r>
+          <w:rPr>
+            <w:rFonts w:ascii="Cambria Math" w:hAnsi="Cambria Math"/>
+            <w:szCs w:val="28"/>
+          </w:rPr>
+          <m:t>=</m:t>
+        </m:r>
+        <m:f>
+          <m:fPr>
+            <m:ctrlPr>
+              <w:rPr>
+                <w:rFonts w:ascii="Cambria Math" w:hAnsi="Cambria Math"/>
+                <w:i/>
+                <w:szCs w:val="28"/>
+                <w:lang w:val="en-US"/>
+              </w:rPr>
+            </m:ctrlPr>
+          </m:fPr>
+          <m:num>
+            <m:r>
+              <w:rPr>
+                <w:rFonts w:ascii="Cambria Math" w:hAnsi="Cambria Math"/>
+                <w:szCs w:val="28"/>
+                <w:lang w:val="en-US"/>
+              </w:rPr>
+              <m:t>PO</m:t>
+            </m:r>
+          </m:num>
+          <m:den>
+            <m:d>
+              <m:dPr>
+                <m:ctrlPr>
+                  <w:rPr>
+                    <w:rFonts w:ascii="Cambria Math" w:hAnsi="Cambria Math"/>
+                    <w:i/>
+                    <w:szCs w:val="28"/>
+                    <w:lang w:val="en-US"/>
+                  </w:rPr>
+                </m:ctrlPr>
+              </m:dPr>
+              <m:e>
+                <m:r>
+                  <w:rPr>
+                    <w:rFonts w:ascii="Cambria Math" w:hAnsi="Cambria Math"/>
+                    <w:szCs w:val="28"/>
+                    <w:lang w:val="en-US"/>
+                  </w:rPr>
+                  <m:t>PO</m:t>
+                </m:r>
+                <m:r>
+                  <w:rPr>
+                    <w:rFonts w:ascii="Cambria Math" w:hAnsi="Cambria Math"/>
+                    <w:szCs w:val="28"/>
+                  </w:rPr>
+                  <m:t>+</m:t>
+                </m:r>
+                <m:r>
+                  <w:rPr>
+                    <w:rFonts w:ascii="Cambria Math" w:hAnsi="Cambria Math"/>
+                    <w:szCs w:val="28"/>
+                    <w:lang w:val="en-US"/>
+                  </w:rPr>
+                  <m:t>MP</m:t>
+                </m:r>
+                <m:r>
+                  <w:rPr>
+                    <w:rFonts w:ascii="Cambria Math" w:hAnsi="Cambria Math"/>
+                    <w:szCs w:val="28"/>
+                  </w:rPr>
+                  <m:t>-</m:t>
+                </m:r>
+                <m:r>
+                  <w:rPr>
+                    <w:rFonts w:ascii="Cambria Math" w:hAnsi="Cambria Math"/>
+                    <w:szCs w:val="28"/>
+                  </w:rPr>
+                  <m:t>E</m:t>
+                </m:r>
+                <m:ctrlPr>
+                  <w:rPr>
+                    <w:rFonts w:ascii="Cambria Math" w:hAnsi="Cambria Math"/>
+                    <w:i/>
+                    <w:szCs w:val="28"/>
+                  </w:rPr>
+                </m:ctrlPr>
+              </m:e>
+            </m:d>
+            <m:r>
+              <w:rPr>
+                <w:rFonts w:ascii="Cambria Math" w:hAnsi="Cambria Math"/>
+                <w:szCs w:val="28"/>
+              </w:rPr>
+              <m:t>*</m:t>
+            </m:r>
+            <m:r>
+              <w:rPr>
+                <w:rFonts w:ascii="Cambria Math" w:hAnsi="Cambria Math"/>
+                <w:szCs w:val="28"/>
+                <w:lang w:val="en-US"/>
+              </w:rPr>
+              <m:t>W</m:t>
+            </m:r>
+          </m:den>
+        </m:f>
+      </m:oMath>
+      <w:r>
+        <w:rPr>
+          <w:szCs w:val="28"/>
+        </w:rPr>
+        <w:t>.</w:t>
       </w:r>
     </w:p>
     <w:p>
@@ -5608,29 +7068,227 @@
         <w:rPr>
           <w:szCs w:val="28"/>
         </w:rPr>
-        <w:t>Вход: Доля вакцинированных, доступность вакцин, готовность населения к вакцинации.</w:t>
-      </w:r>
-    </w:p>
-    <w:p>
-      <w:pPr>
-        <w:rPr>
-          <w:szCs w:val="28"/>
-        </w:rPr>
-      </w:pPr>
-      <w:r>
-        <w:rPr>
-          <w:szCs w:val="28"/>
-        </w:rPr>
-        <w:lastRenderedPageBreak/>
-        <w:t>Выход: Снижение числа восприимчивых, уменьшение числа заболеваний, ускорение коллективного иммунитета.</w:t>
-      </w:r>
-    </w:p>
-    <w:p>
-      <w:pPr>
-        <w:rPr>
-          <w:szCs w:val="28"/>
-        </w:rPr>
-      </w:pPr>
+        <w:t xml:space="preserve">Вход: </w:t>
+      </w:r>
+      <w:r>
+        <w:rPr>
+          <w:szCs w:val="28"/>
+        </w:rPr>
+        <w:t>Уровень населённости (</w:t>
+      </w:r>
+      <w:r>
+        <w:rPr>
+          <w:szCs w:val="28"/>
+          <w:lang w:val="en-US"/>
+        </w:rPr>
+        <w:t>PO</w:t>
+      </w:r>
+      <w:r>
+        <w:rPr>
+          <w:szCs w:val="28"/>
+        </w:rPr>
+        <w:t xml:space="preserve">), </w:t>
+      </w:r>
+      <w:r>
+        <w:rPr>
+          <w:szCs w:val="28"/>
+        </w:rPr>
+        <w:t>д</w:t>
+      </w:r>
+      <w:r>
+        <w:rPr>
+          <w:szCs w:val="28"/>
+        </w:rPr>
+        <w:t>оля вакцинированных</w:t>
+      </w:r>
+      <w:r>
+        <w:rPr>
+          <w:szCs w:val="28"/>
+        </w:rPr>
+        <w:t xml:space="preserve"> (</w:t>
+      </w:r>
+      <w:r>
+        <w:rPr>
+          <w:szCs w:val="28"/>
+          <w:lang w:val="en-US"/>
+        </w:rPr>
+        <w:t>VP</w:t>
+      </w:r>
+      <w:r>
+        <w:rPr>
+          <w:szCs w:val="28"/>
+        </w:rPr>
+        <w:t>)</w:t>
+      </w:r>
+      <w:r>
+        <w:rPr>
+          <w:szCs w:val="28"/>
+        </w:rPr>
+        <w:t>, доступность вакцин</w:t>
+      </w:r>
+      <w:r>
+        <w:rPr>
+          <w:szCs w:val="28"/>
+        </w:rPr>
+        <w:t xml:space="preserve"> </w:t>
+      </w:r>
+      <w:r>
+        <w:rPr>
+          <w:szCs w:val="28"/>
+        </w:rPr>
+        <w:t xml:space="preserve">(0-5) </w:t>
+      </w:r>
+      <w:r>
+        <w:rPr>
+          <w:szCs w:val="28"/>
+        </w:rPr>
+        <w:t>(</w:t>
+      </w:r>
+      <w:r>
+        <w:rPr>
+          <w:szCs w:val="28"/>
+          <w:lang w:val="en-US"/>
+        </w:rPr>
+        <w:t>VA</w:t>
+      </w:r>
+      <w:r>
+        <w:rPr>
+          <w:szCs w:val="28"/>
+        </w:rPr>
+        <w:t>)</w:t>
+      </w:r>
+      <w:r>
+        <w:rPr>
+          <w:szCs w:val="28"/>
+        </w:rPr>
+        <w:t>, готовность населения к вакцинации</w:t>
+      </w:r>
+      <w:r>
+        <w:rPr>
+          <w:szCs w:val="28"/>
+        </w:rPr>
+        <w:t xml:space="preserve"> </w:t>
+      </w:r>
+      <w:r>
+        <w:rPr>
+          <w:szCs w:val="28"/>
+        </w:rPr>
+        <w:t xml:space="preserve">(0-5) </w:t>
+      </w:r>
+      <w:r>
+        <w:rPr>
+          <w:szCs w:val="28"/>
+        </w:rPr>
+        <w:t>(</w:t>
+      </w:r>
+      <w:r>
+        <w:rPr>
+          <w:szCs w:val="28"/>
+          <w:lang w:val="en-US"/>
+        </w:rPr>
+        <w:t>VR</w:t>
+      </w:r>
+      <w:r>
+        <w:rPr>
+          <w:szCs w:val="28"/>
+        </w:rPr>
+        <w:t>)</w:t>
+      </w:r>
+      <w:r>
+        <w:rPr>
+          <w:szCs w:val="28"/>
+        </w:rPr>
+        <w:t>.</w:t>
+      </w:r>
+    </w:p>
+    <w:p>
+      <w:pPr>
+        <w:rPr>
+          <w:rFonts w:eastAsiaTheme="minorEastAsia"/>
+          <w:szCs w:val="28"/>
+        </w:rPr>
+      </w:pPr>
+      <w:r>
+        <w:rPr>
+          <w:szCs w:val="28"/>
+        </w:rPr>
+        <w:t>Выход:</w:t>
+      </w:r>
+      <m:oMath>
+        <m:r>
+          <w:rPr>
+            <w:rFonts w:ascii="Cambria Math" w:hAnsi="Cambria Math"/>
+            <w:szCs w:val="28"/>
+          </w:rPr>
+          <m:t xml:space="preserve"> </m:t>
+        </m:r>
+        <m:r>
+          <w:rPr>
+            <w:rFonts w:ascii="Cambria Math" w:hAnsi="Cambria Math"/>
+            <w:szCs w:val="28"/>
+          </w:rPr>
+          <m:t>V</m:t>
+        </m:r>
+        <m:r>
+          <w:rPr>
+            <w:rFonts w:ascii="Cambria Math" w:hAnsi="Cambria Math"/>
+            <w:szCs w:val="28"/>
+          </w:rPr>
+          <m:t>=</m:t>
+        </m:r>
+        <m:r>
+          <w:rPr>
+            <w:rFonts w:ascii="Cambria Math" w:hAnsi="Cambria Math"/>
+            <w:szCs w:val="28"/>
+            <w:lang w:val="en-US"/>
+          </w:rPr>
+          <m:t>VP</m:t>
+        </m:r>
+        <m:r>
+          <w:rPr>
+            <w:rFonts w:ascii="Cambria Math" w:hAnsi="Cambria Math"/>
+            <w:szCs w:val="28"/>
+          </w:rPr>
+          <m:t>*</m:t>
+        </m:r>
+        <m:r>
+          <w:rPr>
+            <w:rFonts w:ascii="Cambria Math" w:hAnsi="Cambria Math"/>
+            <w:szCs w:val="28"/>
+            <w:lang w:val="en-US"/>
+          </w:rPr>
+          <m:t>V</m:t>
+        </m:r>
+        <m:r>
+          <w:rPr>
+            <w:rFonts w:ascii="Cambria Math" w:hAnsi="Cambria Math"/>
+            <w:szCs w:val="28"/>
+            <w:lang w:val="en-US"/>
+          </w:rPr>
+          <m:t>A</m:t>
+        </m:r>
+        <m:r>
+          <w:rPr>
+            <w:rFonts w:ascii="Cambria Math" w:hAnsi="Cambria Math"/>
+            <w:szCs w:val="28"/>
+          </w:rPr>
+          <m:t>*</m:t>
+        </m:r>
+        <m:r>
+          <w:rPr>
+            <w:rFonts w:ascii="Cambria Math" w:hAnsi="Cambria Math"/>
+            <w:szCs w:val="28"/>
+            <w:lang w:val="en-US"/>
+          </w:rPr>
+          <m:t>VR</m:t>
+        </m:r>
+      </m:oMath>
+      <w:r>
+        <w:rPr>
+          <w:szCs w:val="28"/>
+        </w:rPr>
+        <w:t>.</w:t>
+      </w:r>
     </w:p>
     <w:p>
       <w:pPr>
@@ -5648,6 +7306,7 @@
         <w:rPr>
           <w:szCs w:val="28"/>
         </w:rPr>
+        <w:lastRenderedPageBreak/>
         <w:t>Экономическое состояние</w:t>
       </w:r>
     </w:p>
@@ -5674,20 +7333,145 @@
         <w:rPr>
           <w:szCs w:val="28"/>
         </w:rPr>
-        <w:t>Вход: Уровень экономической активности, поддержка бизнеса и населения, воздействие карантинных мер на экономику.</w:t>
-      </w:r>
-    </w:p>
-    <w:p>
-      <w:pPr>
-        <w:rPr>
-          <w:szCs w:val="28"/>
-        </w:rPr>
-      </w:pPr>
-      <w:r>
-        <w:rPr>
-          <w:szCs w:val="28"/>
-        </w:rPr>
-        <w:t>Выход: Экономический спад, социальные выплаты, помощь предпринимателям, влияние на уровень бедности.</w:t>
+        <w:t>Вход: Уровень экономической активности</w:t>
+      </w:r>
+      <w:r>
+        <w:rPr>
+          <w:szCs w:val="28"/>
+        </w:rPr>
+        <w:t xml:space="preserve"> (</w:t>
+      </w:r>
+      <w:r>
+        <w:rPr>
+          <w:szCs w:val="28"/>
+          <w:lang w:val="en-US"/>
+        </w:rPr>
+        <w:t>EA</w:t>
+      </w:r>
+      <w:r>
+        <w:rPr>
+          <w:szCs w:val="28"/>
+        </w:rPr>
+        <w:t>)</w:t>
+      </w:r>
+      <w:r>
+        <w:rPr>
+          <w:szCs w:val="28"/>
+        </w:rPr>
+        <w:t xml:space="preserve"> (1-5)</w:t>
+      </w:r>
+      <w:r>
+        <w:rPr>
+          <w:szCs w:val="28"/>
+        </w:rPr>
+        <w:t>, поддержка бизнеса и населения</w:t>
+      </w:r>
+      <w:r>
+        <w:rPr>
+          <w:szCs w:val="28"/>
+        </w:rPr>
+        <w:t xml:space="preserve"> (</w:t>
+      </w:r>
+      <w:r>
+        <w:rPr>
+          <w:szCs w:val="28"/>
+          <w:lang w:val="en-US"/>
+        </w:rPr>
+        <w:t>B</w:t>
+      </w:r>
+      <w:r>
+        <w:rPr>
+          <w:szCs w:val="28"/>
+        </w:rPr>
+        <w:t>)</w:t>
+      </w:r>
+      <w:r>
+        <w:rPr>
+          <w:szCs w:val="28"/>
+        </w:rPr>
+        <w:t xml:space="preserve"> (0-1)</w:t>
+      </w:r>
+      <w:r>
+        <w:rPr>
+          <w:szCs w:val="28"/>
+        </w:rPr>
+        <w:t>.</w:t>
+      </w:r>
+    </w:p>
+    <w:p>
+      <w:pPr>
+        <w:rPr>
+          <w:rFonts w:eastAsiaTheme="minorEastAsia"/>
+          <w:szCs w:val="28"/>
+        </w:rPr>
+      </w:pPr>
+      <w:r>
+        <w:rPr>
+          <w:szCs w:val="28"/>
+        </w:rPr>
+        <w:t>Выход:</w:t>
+      </w:r>
+      <w:r>
+        <w:rPr>
+          <w:szCs w:val="28"/>
+        </w:rPr>
+        <w:t xml:space="preserve"> </w:t>
+      </w:r>
+      <m:oMath>
+        <m:r>
+          <w:rPr>
+            <w:rFonts w:ascii="Cambria Math" w:hAnsi="Cambria Math"/>
+            <w:szCs w:val="28"/>
+          </w:rPr>
+          <m:t>b</m:t>
+        </m:r>
+        <m:r>
+          <w:rPr>
+            <w:rFonts w:ascii="Cambria Math" w:hAnsi="Cambria Math"/>
+            <w:szCs w:val="28"/>
+            <w:lang w:val="en-US"/>
+          </w:rPr>
+          <m:t>=</m:t>
+        </m:r>
+        <m:f>
+          <m:fPr>
+            <m:ctrlPr>
+              <w:rPr>
+                <w:rFonts w:ascii="Cambria Math" w:eastAsiaTheme="minorEastAsia" w:hAnsi="Cambria Math"/>
+                <w:i/>
+                <w:szCs w:val="28"/>
+                <w:lang w:val="en-US"/>
+              </w:rPr>
+            </m:ctrlPr>
+          </m:fPr>
+          <m:num>
+            <m:r>
+              <w:rPr>
+                <w:rFonts w:ascii="Cambria Math" w:eastAsiaTheme="minorEastAsia" w:hAnsi="Cambria Math"/>
+                <w:szCs w:val="28"/>
+                <w:lang w:val="en-US"/>
+              </w:rPr>
+              <m:t>2-B</m:t>
+            </m:r>
+          </m:num>
+          <m:den>
+            <m:r>
+              <w:rPr>
+                <w:rFonts w:ascii="Cambria Math" w:eastAsiaTheme="minorEastAsia" w:hAnsi="Cambria Math"/>
+                <w:szCs w:val="28"/>
+                <w:lang w:val="en-US"/>
+              </w:rPr>
+              <m:t>EA</m:t>
+            </m:r>
+          </m:den>
+        </m:f>
+      </m:oMath>
+      <w:r>
+        <w:rPr>
+          <w:rFonts w:eastAsiaTheme="minorEastAsia"/>
+          <w:szCs w:val="28"/>
+        </w:rPr>
+        <w:t xml:space="preserve"> </w:t>
       </w:r>
     </w:p>
     <w:p>
@@ -5724,8 +7508,8 @@
         </w:rPr>
         <w:drawing>
           <wp:inline distT="0" distB="0" distL="0" distR="0" wp14:anchorId="59B5601D" wp14:editId="1E353033">
-            <wp:extent cx="5006836" cy="3535680"/>
-            <wp:effectExtent l="0" t="0" r="0" b="0"/>
+            <wp:extent cx="5824564" cy="5885823"/>
+            <wp:effectExtent l="0" t="0" r="5080" b="0"/>
             <wp:docPr id="2" name="Рисунок 2"/>
             <wp:cNvGraphicFramePr>
               <a:graphicFrameLocks xmlns:a="http://schemas.openxmlformats.org/drawingml/2006/main" noChangeAspect="1"/>
@@ -5754,7 +7538,7 @@
                   <pic:spPr bwMode="auto">
                     <a:xfrm>
                       <a:off x="0" y="0"/>
-                      <a:ext cx="5006836" cy="3535680"/>
+                      <a:ext cx="5824564" cy="5885823"/>
                     </a:xfrm>
                     <a:prstGeom prst="rect">
                       <a:avLst/>
@@ -5781,6 +7565,7 @@
         <w:rPr>
           <w:szCs w:val="28"/>
         </w:rPr>
+        <w:lastRenderedPageBreak/>
         <w:t xml:space="preserve">Сложность: </w:t>
       </w:r>
       <w:r>
@@ -5811,14 +7596,7 @@
         <w:rPr>
           <w:szCs w:val="28"/>
         </w:rPr>
-        <w:t xml:space="preserve"> </w:t>
-      </w:r>
-      <w:r>
-        <w:rPr>
-          <w:szCs w:val="28"/>
-        </w:rPr>
-        <w:lastRenderedPageBreak/>
-        <w:t>требует комплексного подхода для предсказания динамики эпидемии. Моделирование предполагает учёт временных изменений, различных сценариев распространения заболевания и внешних факторов.</w:t>
+        <w:t xml:space="preserve"> требует комплексного подхода для предсказания динамики эпидемии. Моделирование предполагает учёт временных изменений, различных сценариев распространения заболевания и внешних факторов.</w:t>
       </w:r>
     </w:p>
     <w:p>
@@ -6048,6 +7826,7 @@
         <w:rPr>
           <w:szCs w:val="28"/>
         </w:rPr>
+        <w:lastRenderedPageBreak/>
         <w:t>Подбор математического аппарата</w:t>
       </w:r>
     </w:p>
@@ -6057,11 +7836,7 @@
         <w:ind w:left="0"/>
       </w:pPr>
       <w:r>
-        <w:t xml:space="preserve">Для моделирования распространения эпидемии можно использовать метод дифференциальных уравнений для описания изменений в каждом из трех </w:t>
-      </w:r>
-      <w:r>
-        <w:lastRenderedPageBreak/>
-        <w:t xml:space="preserve">состояний </w:t>
+        <w:t xml:space="preserve">Для моделирования распространения эпидемии можно использовать метод дифференциальных уравнений для описания изменений в каждом из трех состояний </w:t>
       </w:r>
       <w:r>
         <w:t>(</w:t>
@@ -6648,14 +8423,12 @@
         <w:rPr>
           <w:sz w:val="28"/>
           <w:szCs w:val="28"/>
-          <w:lang w:val="ru-RU"/>
         </w:rPr>
       </w:pPr>
       <w:r>
         <w:rPr>
           <w:sz w:val="28"/>
           <w:szCs w:val="28"/>
-          <w:lang w:val="ru-RU"/>
         </w:rPr>
         <w:lastRenderedPageBreak/>
         <w:t xml:space="preserve">Модель — это объект-заместитель объекта-оригинала, обеспечивающий изучение некоторых свойств оригинала.  </w:t>
@@ -6670,14 +8443,12 @@
         <w:rPr>
           <w:sz w:val="28"/>
           <w:szCs w:val="28"/>
-          <w:lang w:val="ru-RU"/>
         </w:rPr>
       </w:pPr>
       <w:r>
         <w:rPr>
           <w:sz w:val="28"/>
           <w:szCs w:val="28"/>
-          <w:lang w:val="ru-RU"/>
         </w:rPr>
         <w:t xml:space="preserve">Процесс построения модели называется моделированием.  </w:t>
       </w:r>
@@ -6691,14 +8462,12 @@
         <w:rPr>
           <w:sz w:val="28"/>
           <w:szCs w:val="28"/>
-          <w:lang w:val="ru-RU"/>
         </w:rPr>
       </w:pPr>
       <w:r>
         <w:rPr>
           <w:sz w:val="28"/>
           <w:szCs w:val="28"/>
-          <w:lang w:val="ru-RU"/>
         </w:rPr>
         <w:t xml:space="preserve">Моделированием называется замещение одного объекта другим с целью получения информации о важнейших свойствах объекта-оригинала с помощью объекта-модели.  </w:t>
       </w:r>
@@ -6734,14 +8503,12 @@
         <w:rPr>
           <w:sz w:val="28"/>
           <w:szCs w:val="28"/>
-          <w:lang w:val="ru-RU"/>
         </w:rPr>
       </w:pPr>
       <w:r>
         <w:rPr>
           <w:sz w:val="28"/>
           <w:szCs w:val="28"/>
-          <w:lang w:val="ru-RU"/>
         </w:rPr>
         <w:t>Да, мифы можно понимать как упрощённые модели реальных природных явлений, которые использовали люди ранее для объяснения тех или иных вещей.</w:t>
       </w:r>
@@ -6783,7 +8550,6 @@
         <w:rPr>
           <w:sz w:val="28"/>
           <w:szCs w:val="28"/>
-          <w:lang w:val="ru-RU"/>
         </w:rPr>
         <w:t xml:space="preserve">Механика – дифференциальные уравнения, термодинамика – статистические модели, экология – </w:t>
       </w:r>
@@ -6792,7 +8558,6 @@
         <w:rPr>
           <w:sz w:val="28"/>
           <w:szCs w:val="28"/>
-          <w:lang w:val="ru-RU"/>
         </w:rPr>
         <w:t>стохаические</w:t>
       </w:r>
@@ -6801,7 +8566,6 @@
         <w:rPr>
           <w:sz w:val="28"/>
           <w:szCs w:val="28"/>
-          <w:lang w:val="ru-RU"/>
         </w:rPr>
         <w:t xml:space="preserve"> и динамические, </w:t>
       </w:r>
@@ -6809,7 +8573,6 @@
         <w:rPr>
           <w:sz w:val="28"/>
           <w:szCs w:val="28"/>
-          <w:lang w:val="ru-RU"/>
         </w:rPr>
         <w:t>микроэкономика – оптимизационные, социология – дискретные модели, логистика – оптимизационные модели.</w:t>
       </w:r>
@@ -6845,7 +8608,6 @@
         <w:rPr>
           <w:sz w:val="28"/>
           <w:szCs w:val="28"/>
-          <w:lang w:val="ru-RU"/>
         </w:rPr>
       </w:pPr>
       <w:r>
@@ -6859,7 +8621,6 @@
         <w:rPr>
           <w:sz w:val="28"/>
           <w:szCs w:val="28"/>
-          <w:lang w:val="ru-RU"/>
         </w:rPr>
         <w:t>, н</w:t>
       </w:r>
@@ -6867,7 +8628,6 @@
         <w:rPr>
           <w:sz w:val="28"/>
           <w:szCs w:val="28"/>
-          <w:lang w:val="ru-RU"/>
         </w:rPr>
         <w:t>аучное моделирование</w:t>
       </w:r>
@@ -6875,7 +8635,6 @@
         <w:rPr>
           <w:sz w:val="28"/>
           <w:szCs w:val="28"/>
-          <w:lang w:val="ru-RU"/>
         </w:rPr>
         <w:t>, з</w:t>
       </w:r>
@@ -6883,7 +8642,6 @@
         <w:rPr>
           <w:sz w:val="28"/>
           <w:szCs w:val="28"/>
-          <w:lang w:val="ru-RU"/>
         </w:rPr>
         <w:t>наковое моделирование</w:t>
       </w:r>
@@ -6891,7 +8649,6 @@
         <w:rPr>
           <w:sz w:val="28"/>
           <w:szCs w:val="28"/>
-          <w:lang w:val="ru-RU"/>
         </w:rPr>
         <w:t>, н</w:t>
       </w:r>
@@ -6899,7 +8656,6 @@
         <w:rPr>
           <w:sz w:val="28"/>
           <w:szCs w:val="28"/>
-          <w:lang w:val="ru-RU"/>
         </w:rPr>
         <w:t>атурное моделирование</w:t>
       </w:r>
@@ -6907,7 +8663,6 @@
         <w:rPr>
           <w:sz w:val="28"/>
           <w:szCs w:val="28"/>
-          <w:lang w:val="ru-RU"/>
         </w:rPr>
         <w:t>, а</w:t>
       </w:r>
@@ -6915,7 +8670,6 @@
         <w:rPr>
           <w:sz w:val="28"/>
           <w:szCs w:val="28"/>
-          <w:lang w:val="ru-RU"/>
         </w:rPr>
         <w:t>налоговое моделирование</w:t>
       </w:r>
@@ -6923,7 +8677,6 @@
         <w:rPr>
           <w:sz w:val="28"/>
           <w:szCs w:val="28"/>
-          <w:lang w:val="ru-RU"/>
         </w:rPr>
         <w:t>, к</w:t>
       </w:r>
@@ -6931,7 +8684,6 @@
         <w:rPr>
           <w:sz w:val="28"/>
           <w:szCs w:val="28"/>
-          <w:lang w:val="ru-RU"/>
         </w:rPr>
         <w:t>огнитивная модель</w:t>
       </w:r>
@@ -6939,7 +8691,6 @@
         <w:rPr>
           <w:sz w:val="28"/>
           <w:szCs w:val="28"/>
-          <w:lang w:val="ru-RU"/>
         </w:rPr>
         <w:t>, с</w:t>
       </w:r>
@@ -6947,7 +8698,6 @@
         <w:rPr>
           <w:sz w:val="28"/>
           <w:szCs w:val="28"/>
-          <w:lang w:val="ru-RU"/>
         </w:rPr>
         <w:t>одержательная модель</w:t>
       </w:r>
@@ -6955,7 +8705,6 @@
         <w:rPr>
           <w:sz w:val="28"/>
           <w:szCs w:val="28"/>
-          <w:lang w:val="ru-RU"/>
         </w:rPr>
         <w:t>, к</w:t>
       </w:r>
@@ -6963,7 +8712,6 @@
         <w:rPr>
           <w:sz w:val="28"/>
           <w:szCs w:val="28"/>
-          <w:lang w:val="ru-RU"/>
         </w:rPr>
         <w:t>онцептуальная модель</w:t>
       </w:r>
@@ -6971,7 +8719,6 @@
         <w:rPr>
           <w:sz w:val="28"/>
           <w:szCs w:val="28"/>
-          <w:lang w:val="ru-RU"/>
         </w:rPr>
         <w:t>, ф</w:t>
       </w:r>
@@ -6979,7 +8726,6 @@
         <w:rPr>
           <w:sz w:val="28"/>
           <w:szCs w:val="28"/>
-          <w:lang w:val="ru-RU"/>
         </w:rPr>
         <w:t>ормальная модель</w:t>
       </w:r>
@@ -6987,7 +8733,6 @@
         <w:rPr>
           <w:sz w:val="28"/>
           <w:szCs w:val="28"/>
-          <w:lang w:val="ru-RU"/>
         </w:rPr>
         <w:t>, м</w:t>
       </w:r>
@@ -6995,7 +8740,6 @@
         <w:rPr>
           <w:sz w:val="28"/>
           <w:szCs w:val="28"/>
-          <w:lang w:val="ru-RU"/>
         </w:rPr>
         <w:t>атематическое моделирование</w:t>
       </w:r>
@@ -7003,7 +8747,6 @@
         <w:rPr>
           <w:sz w:val="28"/>
           <w:szCs w:val="28"/>
-          <w:lang w:val="ru-RU"/>
         </w:rPr>
         <w:t>.</w:t>
       </w:r>
@@ -7039,14 +8782,12 @@
         <w:rPr>
           <w:sz w:val="28"/>
           <w:szCs w:val="28"/>
-          <w:lang w:val="ru-RU"/>
         </w:rPr>
       </w:pPr>
       <w:r>
         <w:rPr>
           <w:sz w:val="28"/>
           <w:szCs w:val="28"/>
-          <w:lang w:val="ru-RU"/>
         </w:rPr>
         <w:t>Натурное моделирование предполагает наличие материального аналога моделируемого объекта, когда как мысленное проектирование предполагает представление объекта только описательно.</w:t>
       </w:r>
@@ -7082,14 +8823,12 @@
         <w:rPr>
           <w:sz w:val="28"/>
           <w:szCs w:val="28"/>
-          <w:lang w:val="ru-RU"/>
         </w:rPr>
       </w:pPr>
       <w:r>
         <w:rPr>
           <w:sz w:val="28"/>
           <w:szCs w:val="28"/>
-          <w:lang w:val="ru-RU"/>
         </w:rPr>
         <w:t>Это представление модели на естественном языке – описание, причины нахождения модели в текущем состоянии, описание поведения модели в будущем.</w:t>
       </w:r>
@@ -7125,14 +8864,12 @@
         <w:rPr>
           <w:sz w:val="28"/>
           <w:szCs w:val="28"/>
-          <w:lang w:val="ru-RU"/>
         </w:rPr>
       </w:pPr>
       <w:r>
         <w:rPr>
           <w:sz w:val="28"/>
           <w:szCs w:val="28"/>
-          <w:lang w:val="ru-RU"/>
         </w:rPr>
         <w:t>Имитационная модель, структурная модель</w:t>
       </w:r>
@@ -7175,7 +8912,6 @@
         <w:rPr>
           <w:sz w:val="28"/>
           <w:szCs w:val="28"/>
-          <w:lang w:val="ru-RU"/>
         </w:rPr>
         <w:t xml:space="preserve">Поведение сложной модели зависит от большого количества факторов, как объективных, так и внешних. </w:t>
       </w:r>
@@ -7183,9 +8919,6 @@
     <w:p>
       <w:pPr>
         <w:ind w:firstLine="0"/>
-        <w:rPr>
-          <w:lang/>
-        </w:rPr>
       </w:pPr>
     </w:p>
     <w:sectPr>
@@ -7202,7 +8935,7 @@
 </file>
 
 <file path=word/endnotes.xml><?xml version="1.0" encoding="utf-8"?>
-<w:endnotes xmlns:wpc="http://schemas.microsoft.com/office/word/2010/wordprocessingCanvas" xmlns:cx="http://schemas.microsoft.com/office/drawing/2014/chartex" xmlns:mc="http://schemas.openxmlformats.org/markup-compatibility/2006" xmlns:o="urn:schemas-microsoft-com:office:office" xmlns:r="http://schemas.openxmlformats.org/officeDocument/2006/relationships" xmlns:m="http://schemas.openxmlformats.org/officeDocument/2006/math" xmlns:v="urn:schemas-microsoft-com:vml" xmlns:wp14="http://schemas.microsoft.com/office/word/2010/wordprocessingDrawing" xmlns:wp="http://schemas.openxmlformats.org/drawingml/2006/wordprocessingDrawing" xmlns:w10="urn:schemas-microsoft-com:office:word" xmlns:w="http://schemas.openxmlformats.org/wordprocessingml/2006/main" xmlns:w14="http://schemas.microsoft.com/office/word/2010/wordml" xmlns:w15="http://schemas.microsoft.com/office/word/2012/wordml" xmlns:w16se="http://schemas.microsoft.com/office/word/2015/wordml/symex" xmlns:wpg="http://schemas.microsoft.com/office/word/2010/wordprocessingGroup" xmlns:wpi="http://schemas.microsoft.com/office/word/2010/wordprocessingInk" xmlns:wne="http://schemas.microsoft.com/office/word/2006/wordml" xmlns:wps="http://schemas.microsoft.com/office/word/2010/wordprocessingShape" mc:Ignorable="w14 w15 w16se wp14">
+<w:endnotes xmlns:wpc="http://schemas.microsoft.com/office/word/2010/wordprocessingCanvas" xmlns:cx="http://schemas.microsoft.com/office/drawing/2014/chartex" xmlns:cx1="http://schemas.microsoft.com/office/drawing/2015/9/8/chartex" xmlns:cx2="http://schemas.microsoft.com/office/drawing/2015/10/21/chartex" xmlns:cx3="http://schemas.microsoft.com/office/drawing/2016/5/9/chartex" xmlns:cx4="http://schemas.microsoft.com/office/drawing/2016/5/10/chartex" xmlns:cx5="http://schemas.microsoft.com/office/drawing/2016/5/11/chartex" xmlns:cx6="http://schemas.microsoft.com/office/drawing/2016/5/12/chartex" xmlns:cx7="http://schemas.microsoft.com/office/drawing/2016/5/13/chartex" xmlns:cx8="http://schemas.microsoft.com/office/drawing/2016/5/14/chartex" xmlns:mc="http://schemas.openxmlformats.org/markup-compatibility/2006" xmlns:aink="http://schemas.microsoft.com/office/drawing/2016/ink" xmlns:am3d="http://schemas.microsoft.com/office/drawing/2017/model3d" xmlns:o="urn:schemas-microsoft-com:office:office" xmlns:oel="http://schemas.microsoft.com/office/2019/extlst" xmlns:r="http://schemas.openxmlformats.org/officeDocument/2006/relationships" xmlns:m="http://schemas.openxmlformats.org/officeDocument/2006/math" xmlns:v="urn:schemas-microsoft-com:vml" xmlns:wp14="http://schemas.microsoft.com/office/word/2010/wordprocessingDrawing" xmlns:wp="http://schemas.openxmlformats.org/drawingml/2006/wordprocessingDrawing" xmlns:w10="urn:schemas-microsoft-com:office:word" xmlns:w="http://schemas.openxmlformats.org/wordprocessingml/2006/main" xmlns:w14="http://schemas.microsoft.com/office/word/2010/wordml" xmlns:w15="http://schemas.microsoft.com/office/word/2012/wordml" xmlns:w16cex="http://schemas.microsoft.com/office/word/2018/wordml/cex" xmlns:w16cid="http://schemas.microsoft.com/office/word/2016/wordml/cid" xmlns:w16="http://schemas.microsoft.com/office/word/2018/wordml" xmlns:w16du="http://schemas.microsoft.com/office/word/2023/wordml/word16du" xmlns:w16sdtdh="http://schemas.microsoft.com/office/word/2020/wordml/sdtdatahash" xmlns:w16sdtfl="http://schemas.microsoft.com/office/word/2024/wordml/sdtformatlock" xmlns:w16se="http://schemas.microsoft.com/office/word/2015/wordml/symex" xmlns:wpg="http://schemas.microsoft.com/office/word/2010/wordprocessingGroup" xmlns:wpi="http://schemas.microsoft.com/office/word/2010/wordprocessingInk" xmlns:wne="http://schemas.microsoft.com/office/word/2006/wordml" xmlns:wps="http://schemas.microsoft.com/office/word/2010/wordprocessingShape" mc:Ignorable="w14 w15 w16se w16cid w16 w16cex w16sdtdh w16sdtfl w16du wp14">
   <w:endnote w:type="separator" w:id="-1">
     <w:p>
       <w:pPr>
@@ -7227,7 +8960,7 @@
 </file>
 
 <file path=word/footnotes.xml><?xml version="1.0" encoding="utf-8"?>
-<w:footnotes xmlns:wpc="http://schemas.microsoft.com/office/word/2010/wordprocessingCanvas" xmlns:cx="http://schemas.microsoft.com/office/drawing/2014/chartex" xmlns:mc="http://schemas.openxmlformats.org/markup-compatibility/2006" xmlns:o="urn:schemas-microsoft-com:office:office" xmlns:r="http://schemas.openxmlformats.org/officeDocument/2006/relationships" xmlns:m="http://schemas.openxmlformats.org/officeDocument/2006/math" xmlns:v="urn:schemas-microsoft-com:vml" xmlns:wp14="http://schemas.microsoft.com/office/word/2010/wordprocessingDrawing" xmlns:wp="http://schemas.openxmlformats.org/drawingml/2006/wordprocessingDrawing" xmlns:w10="urn:schemas-microsoft-com:office:word" xmlns:w="http://schemas.openxmlformats.org/wordprocessingml/2006/main" xmlns:w14="http://schemas.microsoft.com/office/word/2010/wordml" xmlns:w15="http://schemas.microsoft.com/office/word/2012/wordml" xmlns:w16se="http://schemas.microsoft.com/office/word/2015/wordml/symex" xmlns:wpg="http://schemas.microsoft.com/office/word/2010/wordprocessingGroup" xmlns:wpi="http://schemas.microsoft.com/office/word/2010/wordprocessingInk" xmlns:wne="http://schemas.microsoft.com/office/word/2006/wordml" xmlns:wps="http://schemas.microsoft.com/office/word/2010/wordprocessingShape" mc:Ignorable="w14 w15 w16se wp14">
+<w:footnotes xmlns:wpc="http://schemas.microsoft.com/office/word/2010/wordprocessingCanvas" xmlns:cx="http://schemas.microsoft.com/office/drawing/2014/chartex" xmlns:cx1="http://schemas.microsoft.com/office/drawing/2015/9/8/chartex" xmlns:cx2="http://schemas.microsoft.com/office/drawing/2015/10/21/chartex" xmlns:cx3="http://schemas.microsoft.com/office/drawing/2016/5/9/chartex" xmlns:cx4="http://schemas.microsoft.com/office/drawing/2016/5/10/chartex" xmlns:cx5="http://schemas.microsoft.com/office/drawing/2016/5/11/chartex" xmlns:cx6="http://schemas.microsoft.com/office/drawing/2016/5/12/chartex" xmlns:cx7="http://schemas.microsoft.com/office/drawing/2016/5/13/chartex" xmlns:cx8="http://schemas.microsoft.com/office/drawing/2016/5/14/chartex" xmlns:mc="http://schemas.openxmlformats.org/markup-compatibility/2006" xmlns:aink="http://schemas.microsoft.com/office/drawing/2016/ink" xmlns:am3d="http://schemas.microsoft.com/office/drawing/2017/model3d" xmlns:o="urn:schemas-microsoft-com:office:office" xmlns:oel="http://schemas.microsoft.com/office/2019/extlst" xmlns:r="http://schemas.openxmlformats.org/officeDocument/2006/relationships" xmlns:m="http://schemas.openxmlformats.org/officeDocument/2006/math" xmlns:v="urn:schemas-microsoft-com:vml" xmlns:wp14="http://schemas.microsoft.com/office/word/2010/wordprocessingDrawing" xmlns:wp="http://schemas.openxmlformats.org/drawingml/2006/wordprocessingDrawing" xmlns:w10="urn:schemas-microsoft-com:office:word" xmlns:w="http://schemas.openxmlformats.org/wordprocessingml/2006/main" xmlns:w14="http://schemas.microsoft.com/office/word/2010/wordml" xmlns:w15="http://schemas.microsoft.com/office/word/2012/wordml" xmlns:w16cex="http://schemas.microsoft.com/office/word/2018/wordml/cex" xmlns:w16cid="http://schemas.microsoft.com/office/word/2016/wordml/cid" xmlns:w16="http://schemas.microsoft.com/office/word/2018/wordml" xmlns:w16du="http://schemas.microsoft.com/office/word/2023/wordml/word16du" xmlns:w16sdtdh="http://schemas.microsoft.com/office/word/2020/wordml/sdtdatahash" xmlns:w16sdtfl="http://schemas.microsoft.com/office/word/2024/wordml/sdtformatlock" xmlns:w16se="http://schemas.microsoft.com/office/word/2015/wordml/symex" xmlns:wpg="http://schemas.microsoft.com/office/word/2010/wordprocessingGroup" xmlns:wpi="http://schemas.microsoft.com/office/word/2010/wordprocessingInk" xmlns:wne="http://schemas.microsoft.com/office/word/2006/wordml" xmlns:wps="http://schemas.microsoft.com/office/word/2010/wordprocessingShape" mc:Ignorable="w14 w15 w16se w16cid w16 w16cex w16sdtdh w16sdtfl w16du wp14">
   <w:footnote w:type="separator" w:id="-1">
     <w:p>
       <w:pPr>
@@ -7252,7 +8985,7 @@
 </file>
 
 <file path=word/header1.xml><?xml version="1.0" encoding="utf-8"?>
-<w:hdr xmlns:wpc="http://schemas.microsoft.com/office/word/2010/wordprocessingCanvas" xmlns:cx="http://schemas.microsoft.com/office/drawing/2014/chartex" xmlns:mc="http://schemas.openxmlformats.org/markup-compatibility/2006" xmlns:o="urn:schemas-microsoft-com:office:office" xmlns:r="http://schemas.openxmlformats.org/officeDocument/2006/relationships" xmlns:m="http://schemas.openxmlformats.org/officeDocument/2006/math" xmlns:v="urn:schemas-microsoft-com:vml" xmlns:wp14="http://schemas.microsoft.com/office/word/2010/wordprocessingDrawing" xmlns:wp="http://schemas.openxmlformats.org/drawingml/2006/wordprocessingDrawing" xmlns:w10="urn:schemas-microsoft-com:office:word" xmlns:w="http://schemas.openxmlformats.org/wordprocessingml/2006/main" xmlns:w14="http://schemas.microsoft.com/office/word/2010/wordml" xmlns:w15="http://schemas.microsoft.com/office/word/2012/wordml" xmlns:w16se="http://schemas.microsoft.com/office/word/2015/wordml/symex" xmlns:wpg="http://schemas.microsoft.com/office/word/2010/wordprocessingGroup" xmlns:wpi="http://schemas.microsoft.com/office/word/2010/wordprocessingInk" xmlns:wne="http://schemas.microsoft.com/office/word/2006/wordml" xmlns:wps="http://schemas.microsoft.com/office/word/2010/wordprocessingShape" mc:Ignorable="w14 w15 w16se wp14">
+<w:hdr xmlns:wpc="http://schemas.microsoft.com/office/word/2010/wordprocessingCanvas" xmlns:cx="http://schemas.microsoft.com/office/drawing/2014/chartex" xmlns:cx1="http://schemas.microsoft.com/office/drawing/2015/9/8/chartex" xmlns:cx2="http://schemas.microsoft.com/office/drawing/2015/10/21/chartex" xmlns:cx3="http://schemas.microsoft.com/office/drawing/2016/5/9/chartex" xmlns:cx4="http://schemas.microsoft.com/office/drawing/2016/5/10/chartex" xmlns:cx5="http://schemas.microsoft.com/office/drawing/2016/5/11/chartex" xmlns:cx6="http://schemas.microsoft.com/office/drawing/2016/5/12/chartex" xmlns:cx7="http://schemas.microsoft.com/office/drawing/2016/5/13/chartex" xmlns:cx8="http://schemas.microsoft.com/office/drawing/2016/5/14/chartex" xmlns:mc="http://schemas.openxmlformats.org/markup-compatibility/2006" xmlns:aink="http://schemas.microsoft.com/office/drawing/2016/ink" xmlns:am3d="http://schemas.microsoft.com/office/drawing/2017/model3d" xmlns:o="urn:schemas-microsoft-com:office:office" xmlns:oel="http://schemas.microsoft.com/office/2019/extlst" xmlns:r="http://schemas.openxmlformats.org/officeDocument/2006/relationships" xmlns:m="http://schemas.openxmlformats.org/officeDocument/2006/math" xmlns:v="urn:schemas-microsoft-com:vml" xmlns:wp14="http://schemas.microsoft.com/office/word/2010/wordprocessingDrawing" xmlns:wp="http://schemas.openxmlformats.org/drawingml/2006/wordprocessingDrawing" xmlns:w10="urn:schemas-microsoft-com:office:word" xmlns:w="http://schemas.openxmlformats.org/wordprocessingml/2006/main" xmlns:w14="http://schemas.microsoft.com/office/word/2010/wordml" xmlns:w15="http://schemas.microsoft.com/office/word/2012/wordml" xmlns:w16cex="http://schemas.microsoft.com/office/word/2018/wordml/cex" xmlns:w16cid="http://schemas.microsoft.com/office/word/2016/wordml/cid" xmlns:w16="http://schemas.microsoft.com/office/word/2018/wordml" xmlns:w16du="http://schemas.microsoft.com/office/word/2023/wordml/word16du" xmlns:w16sdtdh="http://schemas.microsoft.com/office/word/2020/wordml/sdtdatahash" xmlns:w16sdtfl="http://schemas.microsoft.com/office/word/2024/wordml/sdtformatlock" xmlns:w16se="http://schemas.microsoft.com/office/word/2015/wordml/symex" xmlns:wpg="http://schemas.microsoft.com/office/word/2010/wordprocessingGroup" xmlns:wpi="http://schemas.microsoft.com/office/word/2010/wordprocessingInk" xmlns:wne="http://schemas.microsoft.com/office/word/2006/wordml" xmlns:wps="http://schemas.microsoft.com/office/word/2010/wordprocessingShape" mc:Ignorable="w14 w15 w16se w16cid w16 w16cex w16sdtdh w16sdtfl w16du wp14">
   <w:sdt>
     <w:sdtPr>
       <w:rPr>
@@ -7264,11 +8997,6 @@
         <w:docPartUnique/>
       </w:docPartObj>
     </w:sdtPr>
-    <w:sdtEndPr>
-      <w:rPr>
-        <w:rStyle w:val="a8"/>
-      </w:rPr>
-    </w:sdtEndPr>
     <w:sdtContent>
       <w:p>
         <w:pPr>
@@ -7308,7 +9036,7 @@
 </file>
 
 <file path=word/header2.xml><?xml version="1.0" encoding="utf-8"?>
-<w:hdr xmlns:wpc="http://schemas.microsoft.com/office/word/2010/wordprocessingCanvas" xmlns:cx="http://schemas.microsoft.com/office/drawing/2014/chartex" xmlns:mc="http://schemas.openxmlformats.org/markup-compatibility/2006" xmlns:o="urn:schemas-microsoft-com:office:office" xmlns:r="http://schemas.openxmlformats.org/officeDocument/2006/relationships" xmlns:m="http://schemas.openxmlformats.org/officeDocument/2006/math" xmlns:v="urn:schemas-microsoft-com:vml" xmlns:wp14="http://schemas.microsoft.com/office/word/2010/wordprocessingDrawing" xmlns:wp="http://schemas.openxmlformats.org/drawingml/2006/wordprocessingDrawing" xmlns:w10="urn:schemas-microsoft-com:office:word" xmlns:w="http://schemas.openxmlformats.org/wordprocessingml/2006/main" xmlns:w14="http://schemas.microsoft.com/office/word/2010/wordml" xmlns:w15="http://schemas.microsoft.com/office/word/2012/wordml" xmlns:w16se="http://schemas.microsoft.com/office/word/2015/wordml/symex" xmlns:wpg="http://schemas.microsoft.com/office/word/2010/wordprocessingGroup" xmlns:wpi="http://schemas.microsoft.com/office/word/2010/wordprocessingInk" xmlns:wne="http://schemas.microsoft.com/office/word/2006/wordml" xmlns:wps="http://schemas.microsoft.com/office/word/2010/wordprocessingShape" mc:Ignorable="w14 w15 w16se wp14">
+<w:hdr xmlns:wpc="http://schemas.microsoft.com/office/word/2010/wordprocessingCanvas" xmlns:cx="http://schemas.microsoft.com/office/drawing/2014/chartex" xmlns:cx1="http://schemas.microsoft.com/office/drawing/2015/9/8/chartex" xmlns:cx2="http://schemas.microsoft.com/office/drawing/2015/10/21/chartex" xmlns:cx3="http://schemas.microsoft.com/office/drawing/2016/5/9/chartex" xmlns:cx4="http://schemas.microsoft.com/office/drawing/2016/5/10/chartex" xmlns:cx5="http://schemas.microsoft.com/office/drawing/2016/5/11/chartex" xmlns:cx6="http://schemas.microsoft.com/office/drawing/2016/5/12/chartex" xmlns:cx7="http://schemas.microsoft.com/office/drawing/2016/5/13/chartex" xmlns:cx8="http://schemas.microsoft.com/office/drawing/2016/5/14/chartex" xmlns:mc="http://schemas.openxmlformats.org/markup-compatibility/2006" xmlns:aink="http://schemas.microsoft.com/office/drawing/2016/ink" xmlns:am3d="http://schemas.microsoft.com/office/drawing/2017/model3d" xmlns:o="urn:schemas-microsoft-com:office:office" xmlns:oel="http://schemas.microsoft.com/office/2019/extlst" xmlns:r="http://schemas.openxmlformats.org/officeDocument/2006/relationships" xmlns:m="http://schemas.openxmlformats.org/officeDocument/2006/math" xmlns:v="urn:schemas-microsoft-com:vml" xmlns:wp14="http://schemas.microsoft.com/office/word/2010/wordprocessingDrawing" xmlns:wp="http://schemas.openxmlformats.org/drawingml/2006/wordprocessingDrawing" xmlns:w10="urn:schemas-microsoft-com:office:word" xmlns:w="http://schemas.openxmlformats.org/wordprocessingml/2006/main" xmlns:w14="http://schemas.microsoft.com/office/word/2010/wordml" xmlns:w15="http://schemas.microsoft.com/office/word/2012/wordml" xmlns:w16cex="http://schemas.microsoft.com/office/word/2018/wordml/cex" xmlns:w16cid="http://schemas.microsoft.com/office/word/2016/wordml/cid" xmlns:w16="http://schemas.microsoft.com/office/word/2018/wordml" xmlns:w16du="http://schemas.microsoft.com/office/word/2023/wordml/word16du" xmlns:w16sdtdh="http://schemas.microsoft.com/office/word/2020/wordml/sdtdatahash" xmlns:w16sdtfl="http://schemas.microsoft.com/office/word/2024/wordml/sdtformatlock" xmlns:w16se="http://schemas.microsoft.com/office/word/2015/wordml/symex" xmlns:wpg="http://schemas.microsoft.com/office/word/2010/wordprocessingGroup" xmlns:wpi="http://schemas.microsoft.com/office/word/2010/wordprocessingInk" xmlns:wne="http://schemas.microsoft.com/office/word/2006/wordml" xmlns:wps="http://schemas.microsoft.com/office/word/2010/wordprocessingShape" mc:Ignorable="w14 w15 w16se w16cid w16 w16cex w16sdtdh w16sdtfl w16du wp14">
   <w:sdt>
     <w:sdtPr>
       <w:rPr>
@@ -7320,11 +9048,6 @@
         <w:docPartUnique/>
       </w:docPartObj>
     </w:sdtPr>
-    <w:sdtEndPr>
-      <w:rPr>
-        <w:rStyle w:val="a8"/>
-      </w:rPr>
-    </w:sdtEndPr>
     <w:sdtContent>
       <w:p>
         <w:pPr>
@@ -7377,7 +9100,7 @@
 </file>
 
 <file path=word/numbering.xml><?xml version="1.0" encoding="utf-8"?>
-<w:numbering xmlns:wpc="http://schemas.microsoft.com/office/word/2010/wordprocessingCanvas" xmlns:cx="http://schemas.microsoft.com/office/drawing/2014/chartex" xmlns:mc="http://schemas.openxmlformats.org/markup-compatibility/2006" xmlns:o="urn:schemas-microsoft-com:office:office" xmlns:r="http://schemas.openxmlformats.org/officeDocument/2006/relationships" xmlns:m="http://schemas.openxmlformats.org/officeDocument/2006/math" xmlns:v="urn:schemas-microsoft-com:vml" xmlns:wp14="http://schemas.microsoft.com/office/word/2010/wordprocessingDrawing" xmlns:wp="http://schemas.openxmlformats.org/drawingml/2006/wordprocessingDrawing" xmlns:w10="urn:schemas-microsoft-com:office:word" xmlns:w="http://schemas.openxmlformats.org/wordprocessingml/2006/main" xmlns:w14="http://schemas.microsoft.com/office/word/2010/wordml" xmlns:w15="http://schemas.microsoft.com/office/word/2012/wordml" xmlns:w16se="http://schemas.microsoft.com/office/word/2015/wordml/symex" xmlns:wpg="http://schemas.microsoft.com/office/word/2010/wordprocessingGroup" xmlns:wpi="http://schemas.microsoft.com/office/word/2010/wordprocessingInk" xmlns:wne="http://schemas.microsoft.com/office/word/2006/wordml" xmlns:wps="http://schemas.microsoft.com/office/word/2010/wordprocessingShape" mc:Ignorable="w14 w15 w16se wp14">
+<w:numbering xmlns:wpc="http://schemas.microsoft.com/office/word/2010/wordprocessingCanvas" xmlns:cx="http://schemas.microsoft.com/office/drawing/2014/chartex" xmlns:cx1="http://schemas.microsoft.com/office/drawing/2015/9/8/chartex" xmlns:cx2="http://schemas.microsoft.com/office/drawing/2015/10/21/chartex" xmlns:cx3="http://schemas.microsoft.com/office/drawing/2016/5/9/chartex" xmlns:cx4="http://schemas.microsoft.com/office/drawing/2016/5/10/chartex" xmlns:cx5="http://schemas.microsoft.com/office/drawing/2016/5/11/chartex" xmlns:cx6="http://schemas.microsoft.com/office/drawing/2016/5/12/chartex" xmlns:cx7="http://schemas.microsoft.com/office/drawing/2016/5/13/chartex" xmlns:cx8="http://schemas.microsoft.com/office/drawing/2016/5/14/chartex" xmlns:mc="http://schemas.openxmlformats.org/markup-compatibility/2006" xmlns:aink="http://schemas.microsoft.com/office/drawing/2016/ink" xmlns:am3d="http://schemas.microsoft.com/office/drawing/2017/model3d" xmlns:o="urn:schemas-microsoft-com:office:office" xmlns:oel="http://schemas.microsoft.com/office/2019/extlst" xmlns:r="http://schemas.openxmlformats.org/officeDocument/2006/relationships" xmlns:m="http://schemas.openxmlformats.org/officeDocument/2006/math" xmlns:v="urn:schemas-microsoft-com:vml" xmlns:wp14="http://schemas.microsoft.com/office/word/2010/wordprocessingDrawing" xmlns:wp="http://schemas.openxmlformats.org/drawingml/2006/wordprocessingDrawing" xmlns:w10="urn:schemas-microsoft-com:office:word" xmlns:w="http://schemas.openxmlformats.org/wordprocessingml/2006/main" xmlns:w14="http://schemas.microsoft.com/office/word/2010/wordml" xmlns:w15="http://schemas.microsoft.com/office/word/2012/wordml" xmlns:w16cex="http://schemas.microsoft.com/office/word/2018/wordml/cex" xmlns:w16cid="http://schemas.microsoft.com/office/word/2016/wordml/cid" xmlns:w16="http://schemas.microsoft.com/office/word/2018/wordml" xmlns:w16du="http://schemas.microsoft.com/office/word/2023/wordml/word16du" xmlns:w16sdtdh="http://schemas.microsoft.com/office/word/2020/wordml/sdtdatahash" xmlns:w16sdtfl="http://schemas.microsoft.com/office/word/2024/wordml/sdtformatlock" xmlns:w16se="http://schemas.microsoft.com/office/word/2015/wordml/symex" xmlns:wpg="http://schemas.microsoft.com/office/word/2010/wordprocessingGroup" xmlns:wpi="http://schemas.microsoft.com/office/word/2010/wordprocessingInk" xmlns:wne="http://schemas.microsoft.com/office/word/2006/wordml" xmlns:wps="http://schemas.microsoft.com/office/word/2010/wordprocessingShape" mc:Ignorable="w14 w15 w16se w16cid w16 w16cex w16sdtdh w16sdtfl w16du wp14">
   <w:abstractNum w:abstractNumId="0" w15:restartNumberingAfterBreak="0">
     <w:nsid w:val="03DB1D60"/>
     <w:multiLevelType w:val="hybridMultilevel"/>
@@ -12674,161 +14397,161 @@
       </w:pPr>
     </w:lvl>
   </w:abstractNum>
-  <w:num w:numId="1">
+  <w:num w:numId="1" w16cid:durableId="345983612">
     <w:abstractNumId w:val="2"/>
   </w:num>
-  <w:num w:numId="2">
+  <w:num w:numId="2" w16cid:durableId="2111705277">
     <w:abstractNumId w:val="39"/>
   </w:num>
-  <w:num w:numId="3">
+  <w:num w:numId="3" w16cid:durableId="574626502">
     <w:abstractNumId w:val="10"/>
   </w:num>
-  <w:num w:numId="4">
+  <w:num w:numId="4" w16cid:durableId="1933466677">
     <w:abstractNumId w:val="44"/>
   </w:num>
-  <w:num w:numId="5">
+  <w:num w:numId="5" w16cid:durableId="1793088094">
     <w:abstractNumId w:val="27"/>
   </w:num>
-  <w:num w:numId="6">
+  <w:num w:numId="6" w16cid:durableId="689142775">
     <w:abstractNumId w:val="34"/>
   </w:num>
-  <w:num w:numId="7">
+  <w:num w:numId="7" w16cid:durableId="384107438">
     <w:abstractNumId w:val="18"/>
   </w:num>
-  <w:num w:numId="8">
+  <w:num w:numId="8" w16cid:durableId="287050316">
     <w:abstractNumId w:val="33"/>
   </w:num>
-  <w:num w:numId="9">
+  <w:num w:numId="9" w16cid:durableId="1548908695">
     <w:abstractNumId w:val="20"/>
   </w:num>
-  <w:num w:numId="10">
+  <w:num w:numId="10" w16cid:durableId="2099521014">
     <w:abstractNumId w:val="32"/>
   </w:num>
-  <w:num w:numId="11">
+  <w:num w:numId="11" w16cid:durableId="2144733066">
     <w:abstractNumId w:val="3"/>
   </w:num>
-  <w:num w:numId="12">
+  <w:num w:numId="12" w16cid:durableId="193812774">
     <w:abstractNumId w:val="46"/>
   </w:num>
-  <w:num w:numId="13">
+  <w:num w:numId="13" w16cid:durableId="1578830118">
     <w:abstractNumId w:val="0"/>
   </w:num>
-  <w:num w:numId="14">
+  <w:num w:numId="14" w16cid:durableId="1905676518">
     <w:abstractNumId w:val="14"/>
   </w:num>
-  <w:num w:numId="15">
+  <w:num w:numId="15" w16cid:durableId="2011135004">
     <w:abstractNumId w:val="7"/>
   </w:num>
-  <w:num w:numId="16">
+  <w:num w:numId="16" w16cid:durableId="1627078796">
     <w:abstractNumId w:val="25"/>
   </w:num>
-  <w:num w:numId="17">
+  <w:num w:numId="17" w16cid:durableId="152449676">
     <w:abstractNumId w:val="1"/>
   </w:num>
-  <w:num w:numId="18">
+  <w:num w:numId="18" w16cid:durableId="841552318">
     <w:abstractNumId w:val="43"/>
   </w:num>
-  <w:num w:numId="19">
+  <w:num w:numId="19" w16cid:durableId="1273897441">
     <w:abstractNumId w:val="30"/>
   </w:num>
-  <w:num w:numId="20">
+  <w:num w:numId="20" w16cid:durableId="949627594">
     <w:abstractNumId w:val="37"/>
   </w:num>
-  <w:num w:numId="21">
+  <w:num w:numId="21" w16cid:durableId="1748453187">
     <w:abstractNumId w:val="35"/>
   </w:num>
-  <w:num w:numId="22">
+  <w:num w:numId="22" w16cid:durableId="1314989966">
     <w:abstractNumId w:val="29"/>
   </w:num>
-  <w:num w:numId="23">
+  <w:num w:numId="23" w16cid:durableId="1011685842">
     <w:abstractNumId w:val="23"/>
   </w:num>
-  <w:num w:numId="24">
+  <w:num w:numId="24" w16cid:durableId="1810589852">
     <w:abstractNumId w:val="4"/>
   </w:num>
-  <w:num w:numId="25">
+  <w:num w:numId="25" w16cid:durableId="647788089">
     <w:abstractNumId w:val="15"/>
   </w:num>
-  <w:num w:numId="26">
+  <w:num w:numId="26" w16cid:durableId="317391528">
     <w:abstractNumId w:val="26"/>
   </w:num>
-  <w:num w:numId="27">
+  <w:num w:numId="27" w16cid:durableId="89356157">
     <w:abstractNumId w:val="22"/>
   </w:num>
-  <w:num w:numId="28">
+  <w:num w:numId="28" w16cid:durableId="1677804645">
     <w:abstractNumId w:val="6"/>
   </w:num>
-  <w:num w:numId="29">
+  <w:num w:numId="29" w16cid:durableId="1006858032">
     <w:abstractNumId w:val="47"/>
   </w:num>
-  <w:num w:numId="30">
+  <w:num w:numId="30" w16cid:durableId="1922445366">
     <w:abstractNumId w:val="48"/>
   </w:num>
-  <w:num w:numId="31">
+  <w:num w:numId="31" w16cid:durableId="541016653">
     <w:abstractNumId w:val="17"/>
   </w:num>
-  <w:num w:numId="32">
+  <w:num w:numId="32" w16cid:durableId="1215460520">
     <w:abstractNumId w:val="31"/>
   </w:num>
-  <w:num w:numId="33">
+  <w:num w:numId="33" w16cid:durableId="1483352509">
     <w:abstractNumId w:val="49"/>
   </w:num>
-  <w:num w:numId="34">
+  <w:num w:numId="34" w16cid:durableId="2071805054">
     <w:abstractNumId w:val="5"/>
   </w:num>
-  <w:num w:numId="35">
+  <w:num w:numId="35" w16cid:durableId="308903483">
     <w:abstractNumId w:val="36"/>
   </w:num>
-  <w:num w:numId="36">
+  <w:num w:numId="36" w16cid:durableId="1732772752">
     <w:abstractNumId w:val="12"/>
   </w:num>
-  <w:num w:numId="37">
+  <w:num w:numId="37" w16cid:durableId="2085178166">
     <w:abstractNumId w:val="19"/>
   </w:num>
-  <w:num w:numId="38">
+  <w:num w:numId="38" w16cid:durableId="1020736204">
     <w:abstractNumId w:val="40"/>
   </w:num>
-  <w:num w:numId="39">
+  <w:num w:numId="39" w16cid:durableId="1794514854">
     <w:abstractNumId w:val="45"/>
   </w:num>
-  <w:num w:numId="40">
+  <w:num w:numId="40" w16cid:durableId="1304192471">
     <w:abstractNumId w:val="41"/>
   </w:num>
-  <w:num w:numId="41">
+  <w:num w:numId="41" w16cid:durableId="1867132450">
     <w:abstractNumId w:val="13"/>
   </w:num>
-  <w:num w:numId="42">
+  <w:num w:numId="42" w16cid:durableId="604457481">
     <w:abstractNumId w:val="38"/>
   </w:num>
-  <w:num w:numId="43">
+  <w:num w:numId="43" w16cid:durableId="1837451350">
     <w:abstractNumId w:val="21"/>
   </w:num>
-  <w:num w:numId="44">
+  <w:num w:numId="44" w16cid:durableId="1690139915">
     <w:abstractNumId w:val="24"/>
   </w:num>
-  <w:num w:numId="45">
+  <w:num w:numId="45" w16cid:durableId="1033074920">
     <w:abstractNumId w:val="11"/>
   </w:num>
-  <w:num w:numId="46">
+  <w:num w:numId="46" w16cid:durableId="1937904830">
     <w:abstractNumId w:val="42"/>
   </w:num>
-  <w:num w:numId="47">
+  <w:num w:numId="47" w16cid:durableId="1432892748">
     <w:abstractNumId w:val="16"/>
   </w:num>
-  <w:num w:numId="48">
+  <w:num w:numId="48" w16cid:durableId="471363404">
     <w:abstractNumId w:val="28"/>
   </w:num>
-  <w:num w:numId="49">
+  <w:num w:numId="49" w16cid:durableId="658464416">
     <w:abstractNumId w:val="8"/>
   </w:num>
-  <w:num w:numId="50">
+  <w:num w:numId="50" w16cid:durableId="1145702531">
     <w:abstractNumId w:val="9"/>
   </w:num>
 </w:numbering>
 </file>
 
 <file path=word/styles.xml><?xml version="1.0" encoding="utf-8"?>
-<w:styles xmlns:mc="http://schemas.openxmlformats.org/markup-compatibility/2006" xmlns:r="http://schemas.openxmlformats.org/officeDocument/2006/relationships" xmlns:w="http://schemas.openxmlformats.org/wordprocessingml/2006/main" xmlns:w14="http://schemas.microsoft.com/office/word/2010/wordml" xmlns:w15="http://schemas.microsoft.com/office/word/2012/wordml" xmlns:w16se="http://schemas.microsoft.com/office/word/2015/wordml/symex" mc:Ignorable="w14 w15 w16se">
+<w:styles xmlns:mc="http://schemas.openxmlformats.org/markup-compatibility/2006" xmlns:r="http://schemas.openxmlformats.org/officeDocument/2006/relationships" xmlns:w="http://schemas.openxmlformats.org/wordprocessingml/2006/main" xmlns:w14="http://schemas.microsoft.com/office/word/2010/wordml" xmlns:w15="http://schemas.microsoft.com/office/word/2012/wordml" xmlns:w16cex="http://schemas.microsoft.com/office/word/2018/wordml/cex" xmlns:w16cid="http://schemas.microsoft.com/office/word/2016/wordml/cid" xmlns:w16="http://schemas.microsoft.com/office/word/2018/wordml" xmlns:w16du="http://schemas.microsoft.com/office/word/2023/wordml/word16du" xmlns:w16sdtdh="http://schemas.microsoft.com/office/word/2020/wordml/sdtdatahash" xmlns:w16sdtfl="http://schemas.microsoft.com/office/word/2024/wordml/sdtformatlock" xmlns:w16se="http://schemas.microsoft.com/office/word/2015/wordml/symex" mc:Ignorable="w14 w15 w16se w16cid w16 w16cex w16sdtdh w16sdtfl w16du">
   <w:docDefaults>
     <w:rPrDefault>
       <w:rPr>
@@ -12844,7 +14567,7 @@
       </w:pPr>
     </w:pPrDefault>
   </w:docDefaults>
-  <w:latentStyles w:defLockedState="0" w:defUIPriority="99" w:defSemiHidden="0" w:defUnhideWhenUsed="0" w:defQFormat="0" w:count="371">
+  <w:latentStyles w:defLockedState="0" w:defUIPriority="99" w:defSemiHidden="0" w:defUnhideWhenUsed="0" w:defQFormat="0" w:count="376">
     <w:lsdException w:name="Normal" w:uiPriority="0" w:qFormat="1"/>
     <w:lsdException w:name="heading 1" w:uiPriority="9" w:qFormat="1"/>
     <w:lsdException w:name="heading 2" w:semiHidden="1" w:uiPriority="9" w:unhideWhenUsed="1" w:qFormat="1"/>
@@ -13216,6 +14939,11 @@
     <w:lsdException w:name="List Table 5 Dark Accent 6" w:uiPriority="50"/>
     <w:lsdException w:name="List Table 6 Colorful Accent 6" w:uiPriority="51"/>
     <w:lsdException w:name="List Table 7 Colorful Accent 6" w:uiPriority="52"/>
+    <w:lsdException w:name="Mention" w:semiHidden="1" w:unhideWhenUsed="1"/>
+    <w:lsdException w:name="Smart Hyperlink" w:semiHidden="1" w:unhideWhenUsed="1"/>
+    <w:lsdException w:name="Hashtag" w:semiHidden="1" w:unhideWhenUsed="1"/>
+    <w:lsdException w:name="Unresolved Mention" w:semiHidden="1" w:unhideWhenUsed="1"/>
+    <w:lsdException w:name="Smart Link" w:semiHidden="1" w:unhideWhenUsed="1"/>
   </w:latentStyles>
   <w:style w:type="paragraph" w:default="1" w:styleId="a">
     <w:name w:val="Normal"/>

</xml_diff>